<commit_message>
docs: narrative chapter now includes all 18 screenshots from today's run
Co-Authored-By: Claude Fable 5 <noreply@anthropic.com>
Claude-Session: https://claude.ai/code/session_01QHSSv245Aernyaebt7V5kS
</commit_message>
<xml_diff>
--- a/docs/HALAH_Implementation_v1.2_Narrative.docx
+++ b/docs/HALAH_Implementation_v1.2_Narrative.docx
@@ -298,7 +298,7 @@
       <w:r>
         <w:t xml:space="preserve">As shown in the figure above, the deployed contract is publicly listed at </w:t>
       </w:r>
-      <w:hyperlink w:history="1" r:id="rIddlujrkg6-pqmieicb0ksd">
+      <w:hyperlink w:history="1" r:id="rIdkumd2k9oniehtgokxgh1r">
         <w:r>
           <w:rPr>
             <w:rStyle w:val="Hyperlink"/>
@@ -316,59 +316,7 @@
         <w:jc w:val="both"/>
       </w:pPr>
       <w:r>
-        <w:t xml:space="preserve">The subsystem therefore serves as the entry point for demonstrating the complete authorisation process rather than functioning merely as a conventional patient-record application.</w:t>
-      </w:r>
-    </w:p>
-    <w:p>
-      <w:pPr>
-        <w:pStyle w:val="Heading1"/>
-        <w:spacing w:after="160" w:before="320"/>
-      </w:pPr>
-      <w:r>
-        <w:t xml:space="preserve">2. Create Smart Consent Contract: Patient Subsystem</w:t>
-      </w:r>
-    </w:p>
-    <w:p>
-      <w:pPr>
-        <w:spacing w:after="160" w:line="300"/>
-        <w:jc w:val="both"/>
-      </w:pPr>
-      <w:r>
-        <w:t xml:space="preserve">The first functional subsystem is the Create Smart Consent Contract module. This module represents the patient-side initiation of a consent transaction and corresponds directly to the construction of the proposed consent object.</w:t>
-      </w:r>
-    </w:p>
-    <w:p>
-      <w:pPr>
-        <w:spacing w:after="160" w:line="300"/>
-        <w:jc w:val="both"/>
-      </w:pPr>
-      <w:r>
-        <w:t xml:space="preserve">The subsystem requires the patient to specify the Patient DID, Authorised Doctor DID, Data Access Scope, Designated Guardian DIDs, the Jurisdiction, and the temporal validity of the consent. These fields collectively operationalise the proposed consent representation:</w:t>
-      </w:r>
-    </w:p>
-    <w:p>
-      <w:pPr>
-        <w:spacing w:after="160" w:before="60"/>
-        <w:jc w:val="center"/>
-      </w:pPr>
-      <w:r>
-        <w:rPr>
-          <w:rFonts w:ascii="Cambria Math" w:cs="Cambria Math" w:eastAsia="Cambria Math" w:hAnsi="Cambria Math"/>
-          <w:i/>
-          <w:iCs/>
-          <w:sz w:val="22"/>
-          <w:szCs w:val="22"/>
-        </w:rPr>
-        <w:t xml:space="preserve">C = (I, A, P, T, L, E)</w:t>
-      </w:r>
-    </w:p>
-    <w:p>
-      <w:pPr>
-        <w:spacing w:after="160" w:line="300"/>
-        <w:jc w:val="both"/>
-      </w:pPr>
-      <w:r>
-        <w:t xml:space="preserve">where the identity of the patient is represented through a DID, the authorised actor is explicitly specified, the permitted data scope is constrained to selected EMR modules, the temporal fields define when the authorisation becomes valid and when it expires, the jurisdiction field constrains where the consent may be exercised, and the enforcement state records whether the consent is active or revoked.</w:t>
+        <w:t xml:space="preserve">The application itself was run in GitHub Codespaces, a browser-based execution environment. Before the demonstration, a readiness check was executed which confirms the network (Sepolia, chainId 11155111), the signer balance, the presence of contract code at the configured address, and that the signer is the contract owner.</w:t>
       </w:r>
     </w:p>
     <w:p>
@@ -380,9 +328,9 @@
       <w:r>
         <w:drawing>
           <wp:inline distT="0" distB="0" distL="0" distR="0">
-            <wp:extent cx="5334000" cy="3943350"/>
+            <wp:extent cx="4381500" cy="1057275"/>
             <wp:effectExtent t="0" r="0" b="0" l="0"/>
-            <wp:docPr id="1" name="M1" descr="The patient subsystem after consent creation: four EMR modules, two designated guardians, jurisdiction AU, and the state PENDING_SIGNATURE." title="Figure 3"/>
+            <wp:docPr id="1" name="g_ready" descr="The Sepolia readiness check executed in GitHub Codespaces before the demonstration: the system reports READY." title="Figure 3"/>
             <wp:cNvGraphicFramePr>
               <a:graphicFrameLocks xmlns:a="http://schemas.openxmlformats.org/drawingml/2006/main" noChangeAspect="1"/>
             </wp:cNvGraphicFramePr>
@@ -405,7 +353,7 @@
                   <pic:spPr bwMode="auto">
                     <a:xfrm>
                       <a:off x="0" y="0"/>
-                      <a:ext cx="5334000" cy="3943350"/>
+                      <a:ext cx="4381500" cy="1057275"/>
                     </a:xfrm>
                     <a:prstGeom prst="rect">
                       <a:avLst/>
@@ -441,91 +389,16 @@
           <w:sz w:val="19"/>
           <w:szCs w:val="19"/>
         </w:rPr>
-        <w:t xml:space="preserve">The patient subsystem after consent creation: four EMR modules, two designated guardians, jurisdiction AU, and the state PENDING_SIGNATURE.</w:t>
-      </w:r>
-    </w:p>
-    <w:p>
-      <w:pPr>
-        <w:spacing w:after="160" w:line="300"/>
-        <w:jc w:val="both"/>
-      </w:pPr>
-      <w:r>
-        <w:t xml:space="preserve">As shown in the figure above, the Patient DID provides the identity pointer for the data subject, while the Authorised Doctor DID limits the intended healthcare recipient. This is important because the implementation does not represent consent as a general permission to access a patient's medical information. Instead, the authorisation is bound to a specific identity and therefore supports subject-specific and actor-specific access control.</w:t>
-      </w:r>
-    </w:p>
-    <w:p>
-      <w:pPr>
-        <w:spacing w:after="160" w:line="300"/>
-        <w:jc w:val="both"/>
-      </w:pPr>
-      <w:r>
-        <w:t xml:space="preserve">The Data Access Scope is particularly important to the proposed framework. Instead of granting access to the complete EMR, the patient selects particular modules; in the demonstrated transaction all four modules (Observation, Medication, Condition and Procedure) were selected. This implements the principle of purpose- and scope-limited consent and corresponds to the P component of the consent object. Version 1.2 additionally validates the input before the consent is stored: a consent with an empty data scope is rejected, and every guardian entry must be a well-formed DID.</w:t>
-      </w:r>
-    </w:p>
-    <w:p>
-      <w:pPr>
-        <w:spacing w:after="160" w:line="300"/>
-        <w:jc w:val="both"/>
-      </w:pPr>
-      <w:r>
-        <w:t xml:space="preserve">The Designated Guardian DIDs establish the additional parties required to participate in the authorisation process. Their presence in the consent-creation subsystem demonstrates that multi-party consent is incorporated at the point at which the consent contract is constructed rather than being added after authorisation.</w:t>
-      </w:r>
-    </w:p>
-    <w:p>
-      <w:pPr>
-        <w:spacing w:after="160" w:line="300"/>
-        <w:jc w:val="both"/>
-      </w:pPr>
-      <w:r>
-        <w:t xml:space="preserve">Finally, the Start Time and Expiry Time implement temporal constraints on the consent, and the Jurisdiction field records the legal territory (AU in the demonstrated transaction). Consequently, authorisation is not represented as a permanent or universal permission. Instead, the consent has a defined lifecycle and territory and can subsequently be evaluated by the Consent Engine according to both. At this point the consent exists only in the application ledger, in the state PENDING_SIGNATURE; nothing is written to the blockchain until the guardians have approved.</w:t>
-      </w:r>
-    </w:p>
-    <w:p>
-      <w:pPr>
-        <w:spacing w:after="160" w:line="300"/>
-        <w:jc w:val="both"/>
-      </w:pPr>
-      <w:r>
-        <w:t xml:space="preserve">Two consent lifecycles appear in the demonstration and should be distinguished. The evaluated consent, f050c29a, was carried through the complete lifecycle — activation as </w:t>
-      </w:r>
-      <w:r>
-        <w:rPr>
-          <w:b/>
-          <w:bCs/>
-        </w:rPr>
-        <w:t xml:space="preserve">token #1</w:t>
-      </w:r>
-      <w:r>
-        <w:t xml:space="preserve">, granted access, refused access and final revocation — and all transaction evidence in this chapter follows it. Because a revoked consent cannot be photographed in its earlier states, the screenshots of consent creation, guardian approval and granted access were captured from a second, identical lifecycle (consent 04da25f5, anchored as </w:t>
-      </w:r>
-      <w:r>
-        <w:rPr>
-          <w:b/>
-          <w:bCs/>
-        </w:rPr>
-        <w:t xml:space="preserve">token #2</w:t>
-      </w:r>
-      <w:r>
-        <w:t xml:space="preserve"> in block 11,771,581). The two lifecycles were executed with the same code and the same contract.</w:t>
-      </w:r>
-    </w:p>
-    <w:p>
-      <w:pPr>
-        <w:spacing w:after="160" w:line="300"/>
-        <w:jc w:val="both"/>
-      </w:pPr>
-      <w:r>
-        <w:t xml:space="preserve">From a system perspective, this module therefore corresponds primarily to </w:t>
-      </w:r>
-      <w:r>
-        <w:rPr>
-          <w:b/>
-          <w:bCs/>
-        </w:rPr>
-        <w:t xml:space="preserve">Consent Object Construction and Patient Initiation</w:t>
-      </w:r>
-      <w:r>
-        <w:t xml:space="preserve">.</w:t>
+        <w:t xml:space="preserve">The Sepolia readiness check executed in GitHub Codespaces before the demonstration: the system reports READY.</w:t>
+      </w:r>
+    </w:p>
+    <w:p>
+      <w:pPr>
+        <w:spacing w:after="160" w:line="300"/>
+        <w:jc w:val="both"/>
+      </w:pPr>
+      <w:r>
+        <w:t xml:space="preserve">As shown in the figure above, the check reports READY, so every subsequent step of the demonstration operates against the live contract. The subsystem therefore serves as the entry point for demonstrating the complete authorisation process rather than functioning merely as a conventional patient-record application.</w:t>
       </w:r>
     </w:p>
     <w:p>
@@ -534,16 +407,50 @@
         <w:spacing w:after="160" w:before="320"/>
       </w:pPr>
       <w:r>
-        <w:t xml:space="preserve">3. Guardian Cryptographic Approval</w:t>
-      </w:r>
-    </w:p>
-    <w:p>
-      <w:pPr>
-        <w:spacing w:after="160" w:line="300"/>
-        <w:jc w:val="both"/>
-      </w:pPr>
-      <w:r>
-        <w:t xml:space="preserve">The second part is the Guardian Cryptographic Approval. As shown in the figure below, it operationalises the multi-party authorisation component of the proposed framework.</w:t>
+        <w:t xml:space="preserve">2. Create Smart Consent Contract: Patient Subsystem</w:t>
+      </w:r>
+    </w:p>
+    <w:p>
+      <w:pPr>
+        <w:spacing w:after="160" w:line="300"/>
+        <w:jc w:val="both"/>
+      </w:pPr>
+      <w:r>
+        <w:t xml:space="preserve">The first functional subsystem is the Create Smart Consent Contract module. This module represents the patient-side initiation of a consent transaction and corresponds directly to the construction of the proposed consent object.</w:t>
+      </w:r>
+    </w:p>
+    <w:p>
+      <w:pPr>
+        <w:spacing w:after="160" w:line="300"/>
+        <w:jc w:val="both"/>
+      </w:pPr>
+      <w:r>
+        <w:t xml:space="preserve">The subsystem requires the patient to specify the Patient DID, Authorised Doctor DID, Data Access Scope, Designated Guardian DIDs, the Jurisdiction, and the temporal validity of the consent. These fields collectively operationalise the proposed consent representation:</w:t>
+      </w:r>
+    </w:p>
+    <w:p>
+      <w:pPr>
+        <w:spacing w:after="160" w:before="60"/>
+        <w:jc w:val="center"/>
+      </w:pPr>
+      <w:r>
+        <w:rPr>
+          <w:rFonts w:ascii="Cambria Math" w:cs="Cambria Math" w:eastAsia="Cambria Math" w:hAnsi="Cambria Math"/>
+          <w:i/>
+          <w:iCs/>
+          <w:sz w:val="22"/>
+          <w:szCs w:val="22"/>
+        </w:rPr>
+        <w:t xml:space="preserve">C = (I, A, P, T, L, E)</w:t>
+      </w:r>
+    </w:p>
+    <w:p>
+      <w:pPr>
+        <w:spacing w:after="160" w:line="300"/>
+        <w:jc w:val="both"/>
+      </w:pPr>
+      <w:r>
+        <w:t xml:space="preserve">where the identity of the patient is represented through a DID, the authorised actor is explicitly specified, the permitted data scope is constrained to selected EMR modules, the temporal fields define when the authorisation becomes valid and when it expires, the jurisdiction field constrains where the consent may be exercised, and the enforcement state records whether the consent is active or revoked.</w:t>
       </w:r>
     </w:p>
     <w:p>
@@ -555,9 +462,9 @@
       <w:r>
         <w:drawing>
           <wp:inline distT="0" distB="0" distL="0" distR="0">
-            <wp:extent cx="5334000" cy="3133725"/>
+            <wp:extent cx="5334000" cy="3943350"/>
             <wp:effectExtent t="0" r="0" b="0" l="0"/>
-            <wp:docPr id="1" name="M2" descr="The guardian subsystem at the moment of the second approval: the EIP-712 signature is verified, the 2/2 threshold is reached, the SBT is minted in the local ledger and the Sepolia anchoring starts in the background." title="Figure 4"/>
+            <wp:docPr id="1" name="M1" descr="The patient subsystem after consent creation: four EMR modules, two designated guardians, jurisdiction AU, and the state PENDING_SIGNATURE." title="Figure 4"/>
             <wp:cNvGraphicFramePr>
               <a:graphicFrameLocks xmlns:a="http://schemas.openxmlformats.org/drawingml/2006/main" noChangeAspect="1"/>
             </wp:cNvGraphicFramePr>
@@ -580,7 +487,7 @@
                   <pic:spPr bwMode="auto">
                     <a:xfrm>
                       <a:off x="0" y="0"/>
-                      <a:ext cx="5334000" cy="3133725"/>
+                      <a:ext cx="5334000" cy="3943350"/>
                     </a:xfrm>
                     <a:prstGeom prst="rect">
                       <a:avLst/>
@@ -616,93 +523,109 @@
           <w:sz w:val="19"/>
           <w:szCs w:val="19"/>
         </w:rPr>
-        <w:t xml:space="preserve">The guardian subsystem at the moment of the second approval: the EIP-712 signature is verified, the 2/2 threshold is reached, the SBT is minted in the local ledger and the Sepolia anchoring starts in the background.</w:t>
-      </w:r>
-    </w:p>
-    <w:p>
-      <w:pPr>
-        <w:spacing w:after="160" w:line="300"/>
-        <w:jc w:val="both"/>
-      </w:pPr>
-      <w:r>
-        <w:t xml:space="preserve">As shown in the figure above, the guardian first enters the target Consent ID, after which the system retrieves the corresponding active transaction and displays the associated patient DID. The guardian then selects their own guardian DID identity and approves the consent with an EIP-712 typed-data signature, which binds the approval to this specific consent, this guardian and this network (chainId 11155111). The system verifies each signature by recovering the signer address and comparing it with the address associated with that guardian DID. A signature produced for another consent, another guardian or another chain is rejected, and the interface refuses a second signature from the same guardian.</w:t>
-      </w:r>
-    </w:p>
-    <w:p>
-      <w:pPr>
-        <w:spacing w:after="160" w:line="300"/>
-        <w:jc w:val="both"/>
-      </w:pPr>
-      <w:r>
-        <w:t xml:space="preserve">The subsystem subsequently reports:</w:t>
-      </w:r>
-    </w:p>
-    <w:p>
-      <w:pPr>
-        <w:spacing w:after="160" w:line="300"/>
-        <w:jc w:val="center"/>
-      </w:pPr>
-      <w:r>
-        <w:t xml:space="preserve">EIP-712 signature verified (signer 0x39B12b87…). Multi-sig: 2/2</w:t>
-      </w:r>
-    </w:p>
-    <w:p>
-      <w:pPr>
-        <w:spacing w:after="160" w:line="300"/>
-        <w:jc w:val="both"/>
-      </w:pPr>
-      <w:r>
-        <w:t xml:space="preserve">This is an important implementation-level demonstration because the consent is not activated merely because the patient created it. Instead, the system requires the predefined guardian approval condition to be satisfied. The implementation therefore enforces the logical authorisation rule:</w:t>
-      </w:r>
-    </w:p>
-    <w:p>
-      <w:pPr>
-        <w:spacing w:after="160" w:before="60"/>
-        <w:jc w:val="center"/>
-      </w:pPr>
-      <w:r>
-        <w:rPr>
-          <w:rFonts w:ascii="Cambria Math" w:cs="Cambria Math" w:eastAsia="Cambria Math" w:hAnsi="Cambria Math"/>
-          <w:i/>
-          <w:iCs/>
-          <w:sz w:val="22"/>
-          <w:szCs w:val="22"/>
-        </w:rPr>
-        <w:t xml:space="preserve">ALLOW = VI ∧ VA ∧ VP ∧ VT ∧ VL</w:t>
-      </w:r>
-    </w:p>
-    <w:p>
-      <w:pPr>
-        <w:spacing w:after="160" w:line="300"/>
-        <w:jc w:val="both"/>
-      </w:pPr>
-      <w:r>
-        <w:t xml:space="preserve">where identity verification, authorisation verification, purpose verification, temporal verification and jurisdictional verification must all be satisfied before access can be granted. For the demonstrated two-guardian configuration, the approval process can also be represented as:</w:t>
-      </w:r>
-    </w:p>
-    <w:p>
-      <w:pPr>
-        <w:spacing w:after="160" w:before="60"/>
-        <w:jc w:val="center"/>
-      </w:pPr>
-      <w:r>
-        <w:rPr>
-          <w:rFonts w:ascii="Cambria Math" w:cs="Cambria Math" w:eastAsia="Cambria Math" w:hAnsi="Cambria Math"/>
-          <w:i/>
-          <w:iCs/>
-          <w:sz w:val="22"/>
-          <w:szCs w:val="22"/>
-        </w:rPr>
-        <w:t xml:space="preserve">Σ g∈G  Sign(g, C)  ≥  |G| = 2</w:t>
-      </w:r>
-    </w:p>
-    <w:p>
-      <w:pPr>
-        <w:spacing w:after="160" w:line="300"/>
-        <w:jc w:val="both"/>
-      </w:pPr>
-      <w:r>
-        <w:t xml:space="preserve">where G represents the designated guardians and every listed guardian must provide a valid signature for activation. Once the required signatures have been obtained, the subsystem displays SBT MINTED together with the Soulbound Token identifier, and a background job submits the mint transaction to Sepolia. When the guardian later re-enters the Consent ID, the subsystem reports Already anchored on Sepolia together with the on-chain token number (token #2 for the photographed lifecycle, token #1 for the evaluated consent). This provides a visible representation of the transition from a pending consent transaction to an activated, publicly recorded consent state. The SBT therefore functions in the implementation as a persistent cryptographic representation of the completed consent authorisation rather than as a transferable asset.</w:t>
+        <w:t xml:space="preserve">The patient subsystem after consent creation: four EMR modules, two designated guardians, jurisdiction AU, and the state PENDING_SIGNATURE.</w:t>
+      </w:r>
+    </w:p>
+    <w:p>
+      <w:pPr>
+        <w:spacing w:after="160" w:line="300"/>
+        <w:jc w:val="both"/>
+      </w:pPr>
+      <w:r>
+        <w:t xml:space="preserve">As shown in the figure above, the Patient DID provides the identity pointer for the data subject, while the Authorised Doctor DID limits the intended healthcare recipient. This is important because the implementation does not represent consent as a general permission to access a patient's medical information. Instead, the authorisation is bound to a specific identity and therefore supports subject-specific and actor-specific access control.</w:t>
+      </w:r>
+    </w:p>
+    <w:p>
+      <w:pPr>
+        <w:spacing w:after="160" w:line="300"/>
+        <w:jc w:val="both"/>
+      </w:pPr>
+      <w:r>
+        <w:t xml:space="preserve">The Data Access Scope is particularly important to the proposed framework. Instead of granting access to the complete EMR, the patient selects particular modules; in the demonstrated transaction all four modules (Observation, Medication, Condition and Procedure) were selected. This implements the principle of purpose- and scope-limited consent and corresponds to the P component of the consent object. Version 1.2 additionally validates the input before the consent is stored: a consent with an empty data scope is rejected, and every guardian entry must be a well-formed DID.</w:t>
+      </w:r>
+    </w:p>
+    <w:p>
+      <w:pPr>
+        <w:spacing w:after="160" w:line="300"/>
+        <w:jc w:val="both"/>
+      </w:pPr>
+      <w:r>
+        <w:t xml:space="preserve">The Designated Guardian DIDs establish the additional parties required to participate in the authorisation process. Their presence in the consent-creation subsystem demonstrates that multi-party consent is incorporated at the point at which the consent contract is constructed rather than being added after authorisation.</w:t>
+      </w:r>
+    </w:p>
+    <w:p>
+      <w:pPr>
+        <w:spacing w:after="160" w:line="300"/>
+        <w:jc w:val="both"/>
+      </w:pPr>
+      <w:r>
+        <w:t xml:space="preserve">Finally, the Start Time and Expiry Time implement temporal constraints on the consent, and the Jurisdiction field records the legal territory (AU in the demonstrated transaction). Consequently, authorisation is not represented as a permanent or universal permission. Instead, the consent has a defined lifecycle and territory and can subsequently be evaluated by the Consent Engine according to both. At this point the consent exists only in the application ledger, in the state PENDING_SIGNATURE; nothing is written to the blockchain until the guardians have approved.</w:t>
+      </w:r>
+    </w:p>
+    <w:p>
+      <w:pPr>
+        <w:spacing w:after="160" w:line="300"/>
+        <w:jc w:val="both"/>
+      </w:pPr>
+      <w:r>
+        <w:t xml:space="preserve">Two consent lifecycles appear in the demonstration and should be distinguished. The evaluated consent, f050c29a, was carried through the complete lifecycle — activation as </w:t>
+      </w:r>
+      <w:r>
+        <w:rPr>
+          <w:b/>
+          <w:bCs/>
+        </w:rPr>
+        <w:t xml:space="preserve">token #1</w:t>
+      </w:r>
+      <w:r>
+        <w:t xml:space="preserve">, granted access, refused access and final revocation — and all transaction evidence in this chapter follows it. Because a revoked consent cannot be photographed in its earlier states, the screenshots of consent creation, guardian approval and granted access were captured from a second, identical lifecycle (consent 04da25f5, anchored as </w:t>
+      </w:r>
+      <w:r>
+        <w:rPr>
+          <w:b/>
+          <w:bCs/>
+        </w:rPr>
+        <w:t xml:space="preserve">token #2</w:t>
+      </w:r>
+      <w:r>
+        <w:t xml:space="preserve"> in block 11,771,581). The two lifecycles were executed with the same code and the same contract.</w:t>
+      </w:r>
+    </w:p>
+    <w:p>
+      <w:pPr>
+        <w:spacing w:after="160" w:line="300"/>
+        <w:jc w:val="both"/>
+      </w:pPr>
+      <w:r>
+        <w:t xml:space="preserve">From a system perspective, this module therefore corresponds primarily to </w:t>
+      </w:r>
+      <w:r>
+        <w:rPr>
+          <w:b/>
+          <w:bCs/>
+        </w:rPr>
+        <w:t xml:space="preserve">Consent Object Construction and Patient Initiation</w:t>
+      </w:r>
+      <w:r>
+        <w:t xml:space="preserve">.</w:t>
+      </w:r>
+    </w:p>
+    <w:p>
+      <w:pPr>
+        <w:pStyle w:val="Heading1"/>
+        <w:spacing w:after="160" w:before="320"/>
+      </w:pPr>
+      <w:r>
+        <w:t xml:space="preserve">3. Guardian Cryptographic Approval</w:t>
+      </w:r>
+    </w:p>
+    <w:p>
+      <w:pPr>
+        <w:spacing w:after="160" w:line="300"/>
+        <w:jc w:val="both"/>
+      </w:pPr>
+      <w:r>
+        <w:t xml:space="preserve">The second part is the Guardian Cryptographic Approval. As shown in the figure below, it operationalises the multi-party authorisation component of the proposed framework.</w:t>
       </w:r>
     </w:p>
     <w:p>
@@ -714,9 +637,9 @@
       <w:r>
         <w:drawing>
           <wp:inline distT="0" distB="0" distL="0" distR="0">
-            <wp:extent cx="5905500" cy="4314825"/>
+            <wp:extent cx="5334000" cy="3133725"/>
             <wp:effectExtent t="0" r="0" b="0" l="0"/>
-            <wp:docPr id="1" name="M3" descr="The anchoring transaction of the evaluated consent on Sepolia Etherscan: status Success, block 11,771,243, 'Mint 1 of MedicalConsent' to the pseudonymous patient address (function selector 0x1e1e7c76, mintConsentV3)." title="Figure 5"/>
+            <wp:docPr id="1" name="M2" descr="The guardian subsystem at the moment of the second approval: the EIP-712 signature is verified, the 2/2 threshold is reached, the SBT is minted in the local ledger and the Sepolia anchoring starts in the background." title="Figure 5"/>
             <wp:cNvGraphicFramePr>
               <a:graphicFrameLocks xmlns:a="http://schemas.openxmlformats.org/drawingml/2006/main" noChangeAspect="1"/>
             </wp:cNvGraphicFramePr>
@@ -739,7 +662,7 @@
                   <pic:spPr bwMode="auto">
                     <a:xfrm>
                       <a:off x="0" y="0"/>
-                      <a:ext cx="5905500" cy="4314825"/>
+                      <a:ext cx="5334000" cy="3133725"/>
                     </a:xfrm>
                     <a:prstGeom prst="rect">
                       <a:avLst/>
@@ -775,73 +698,43 @@
           <w:sz w:val="19"/>
           <w:szCs w:val="19"/>
         </w:rPr>
-        <w:t xml:space="preserve">The anchoring transaction of the evaluated consent on Sepolia Etherscan: status Success, block 11,771,243, 'Mint 1 of MedicalConsent' to the pseudonymous patient address (function selector 0x1e1e7c76, mintConsentV3).</w:t>
-      </w:r>
-    </w:p>
-    <w:p>
-      <w:pPr>
-        <w:spacing w:after="160" w:line="300"/>
-        <w:jc w:val="left"/>
-      </w:pPr>
-      <w:r>
-        <w:t xml:space="preserve">As shown in the figure above, the anchoring of the evaluated consent (token #1) is an ordinary, publicly verifiable transaction: Etherscan reports the status Success, the block number 11,771,243, the transaction fee, and the transfer of one MedicalConsent token to the pseudonymous patient address derived from the patient DID. The transaction can be inspected at </w:t>
-      </w:r>
-      <w:hyperlink w:history="1" r:id="rIdfmjex6ypvm7imjmm2gsed">
-        <w:r>
-          <w:rPr>
-            <w:rStyle w:val="Hyperlink"/>
-          </w:rPr>
-          <w:t xml:space="preserve">Etherscan: mint transaction</w:t>
-        </w:r>
-      </w:hyperlink>
-      <w:r>
-        <w:t xml:space="preserve">. This provides an implementation-level demonstration that consent activation can be verified independently of the application.</w:t>
-      </w:r>
-    </w:p>
-    <w:p>
-      <w:pPr>
-        <w:spacing w:after="160" w:line="300"/>
-        <w:jc w:val="both"/>
-      </w:pPr>
-      <w:r>
-        <w:t xml:space="preserve">The guardian subsystem consequently corresponds to </w:t>
-      </w:r>
-      <w:r>
-        <w:rPr>
-          <w:b/>
-          <w:bCs/>
-        </w:rPr>
-        <w:t xml:space="preserve">Multi-Party Approval, Cryptographic Verification and Consent Activation</w:t>
-      </w:r>
-      <w:r>
-        <w:t xml:space="preserve"> in the proposed architecture.</w:t>
-      </w:r>
-    </w:p>
-    <w:p>
-      <w:pPr>
-        <w:pStyle w:val="Heading1"/>
-        <w:spacing w:after="160" w:before="320"/>
-      </w:pPr>
-      <w:r>
-        <w:t xml:space="preserve">4. Secure Patient Data Access for Doctor</w:t>
-      </w:r>
-    </w:p>
-    <w:p>
-      <w:pPr>
-        <w:spacing w:after="160" w:line="300"/>
-        <w:jc w:val="both"/>
-      </w:pPr>
-      <w:r>
-        <w:t xml:space="preserve">The third module is the Secure Patient Data Access module and represents the healthcare-provider side of the authorisation process.</w:t>
-      </w:r>
-    </w:p>
-    <w:p>
-      <w:pPr>
-        <w:spacing w:after="160" w:line="300"/>
-        <w:jc w:val="both"/>
-      </w:pPr>
-      <w:r>
-        <w:t xml:space="preserve">The doctor enters an authorised Consent ID, after which the system retrieves and displays the associated consent information. The subsystem shows the patient DID, Consent ID, purpose, and current consent state:</w:t>
+        <w:t xml:space="preserve">The guardian subsystem at the moment of the second approval: the EIP-712 signature is verified, the 2/2 threshold is reached, the SBT is minted in the local ledger and the Sepolia anchoring starts in the background.</w:t>
+      </w:r>
+    </w:p>
+    <w:p>
+      <w:pPr>
+        <w:spacing w:after="160" w:line="300"/>
+        <w:jc w:val="both"/>
+      </w:pPr>
+      <w:r>
+        <w:t xml:space="preserve">As shown in the figure above, the guardian first enters the target Consent ID, after which the system retrieves the corresponding active transaction and displays the associated patient DID. The guardian then selects their own guardian DID identity and approves the consent with an EIP-712 typed-data signature, which binds the approval to this specific consent, this guardian and this network (chainId 11155111). The system verifies each signature by recovering the signer address and comparing it with the address associated with that guardian DID. A signature produced for another consent, another guardian or another chain is rejected, and the interface refuses a second signature from the same guardian.</w:t>
+      </w:r>
+    </w:p>
+    <w:p>
+      <w:pPr>
+        <w:spacing w:after="160" w:line="300"/>
+        <w:jc w:val="both"/>
+      </w:pPr>
+      <w:r>
+        <w:t xml:space="preserve">The subsystem subsequently reports:</w:t>
+      </w:r>
+    </w:p>
+    <w:p>
+      <w:pPr>
+        <w:spacing w:after="160" w:line="300"/>
+        <w:jc w:val="center"/>
+      </w:pPr>
+      <w:r>
+        <w:t xml:space="preserve">EIP-712 signature verified (signer 0x39B12b87…). Multi-sig: 2/2</w:t>
+      </w:r>
+    </w:p>
+    <w:p>
+      <w:pPr>
+        <w:spacing w:after="160" w:line="300"/>
+        <w:jc w:val="both"/>
+      </w:pPr>
+      <w:r>
+        <w:t xml:space="preserve">This is an important implementation-level demonstration because the consent is not activated merely because the patient created it. Instead, the system requires the predefined guardian approval condition to be satisfied. The implementation therefore enforces the logical authorisation rule:</w:t>
       </w:r>
     </w:p>
     <w:p>
@@ -857,16 +750,41 @@
           <w:sz w:val="22"/>
           <w:szCs w:val="22"/>
         </w:rPr>
-        <w:t xml:space="preserve">State = ACTIVE</w:t>
-      </w:r>
-    </w:p>
-    <w:p>
-      <w:pPr>
-        <w:spacing w:after="160" w:line="300"/>
-        <w:jc w:val="both"/>
-      </w:pPr>
-      <w:r>
-        <w:t xml:space="preserve">This is important because the doctor does not directly access patient data based solely on possession of a Consent ID. The system first evaluates whether the underlying authorisation remains valid, and it does so for every component of the consent object. The decision matrix displayed to the doctor reports the outcome of each check individually.</w:t>
+        <w:t xml:space="preserve">ALLOW = VI ∧ VA ∧ VP ∧ VT ∧ VL</w:t>
+      </w:r>
+    </w:p>
+    <w:p>
+      <w:pPr>
+        <w:spacing w:after="160" w:line="300"/>
+        <w:jc w:val="both"/>
+      </w:pPr>
+      <w:r>
+        <w:t xml:space="preserve">where identity verification, authorisation verification, purpose verification, temporal verification and jurisdictional verification must all be satisfied before access can be granted. For the demonstrated two-guardian configuration, the approval process can also be represented as:</w:t>
+      </w:r>
+    </w:p>
+    <w:p>
+      <w:pPr>
+        <w:spacing w:after="160" w:before="60"/>
+        <w:jc w:val="center"/>
+      </w:pPr>
+      <w:r>
+        <w:rPr>
+          <w:rFonts w:ascii="Cambria Math" w:cs="Cambria Math" w:eastAsia="Cambria Math" w:hAnsi="Cambria Math"/>
+          <w:i/>
+          <w:iCs/>
+          <w:sz w:val="22"/>
+          <w:szCs w:val="22"/>
+        </w:rPr>
+        <w:t xml:space="preserve">Σ g∈G  Sign(g, C)  ≥  |G| = 2</w:t>
+      </w:r>
+    </w:p>
+    <w:p>
+      <w:pPr>
+        <w:spacing w:after="160" w:line="300"/>
+        <w:jc w:val="both"/>
+      </w:pPr>
+      <w:r>
+        <w:t xml:space="preserve">where G represents the designated guardians and every listed guardian must provide a valid signature for activation. Once the required signatures have been obtained, the subsystem displays SBT MINTED together with the Soulbound Token identifier, and a background job submits the mint transaction to Sepolia. When the guardian later re-enters the Consent ID, the subsystem reports Already anchored on Sepolia together with the on-chain token number (token #2 for the photographed lifecycle, token #1 for the evaluated consent).</w:t>
       </w:r>
     </w:p>
     <w:p>
@@ -878,9 +796,9 @@
       <w:r>
         <w:drawing>
           <wp:inline distT="0" distB="0" distL="0" distR="0">
-            <wp:extent cx="5334000" cy="4200525"/>
+            <wp:extent cx="5143500" cy="1828800"/>
             <wp:effectExtent t="0" r="0" b="0" l="0"/>
-            <wp:docPr id="1" name="g_doc_au" descr="The doctor subsystem with requester jurisdiction AU: all five checks report PASS, ALLOW = PASS, and the consent state is ACTIVE." title="Figure 6"/>
+            <wp:docPr id="1" name="M2b" descr="The guardian subsystem revisited after the background job has completed: 'Already anchored on Sepolia - token #2'." title="Figure 6"/>
             <wp:cNvGraphicFramePr>
               <a:graphicFrameLocks xmlns:a="http://schemas.openxmlformats.org/drawingml/2006/main" noChangeAspect="1"/>
             </wp:cNvGraphicFramePr>
@@ -903,7 +821,7 @@
                   <pic:spPr bwMode="auto">
                     <a:xfrm>
                       <a:off x="0" y="0"/>
-                      <a:ext cx="5334000" cy="4200525"/>
+                      <a:ext cx="5143500" cy="1828800"/>
                     </a:xfrm>
                     <a:prstGeom prst="rect">
                       <a:avLst/>
@@ -939,41 +857,16 @@
           <w:sz w:val="19"/>
           <w:szCs w:val="19"/>
         </w:rPr>
-        <w:t xml:space="preserve">The doctor subsystem with requester jurisdiction AU: all five checks report PASS, ALLOW = PASS, and the consent state is ACTIVE.</w:t>
-      </w:r>
-    </w:p>
-    <w:p>
-      <w:pPr>
-        <w:spacing w:after="160" w:line="300"/>
-        <w:jc w:val="both"/>
-      </w:pPr>
-      <w:r>
-        <w:t xml:space="preserve">As shown in the figure above, the five checks VI (identity), VA (authorisation), VP (purpose), VT (time) and VL (jurisdiction) all report PASS, and consequently ALLOW = PASS. The subsystem then presents the Authorised Data Scope, showing that only the EMR modules specified in the original consent are available. In the demonstrated transaction, the authorised modules are:</w:t>
-      </w:r>
-    </w:p>
-    <w:p>
-      <w:pPr>
-        <w:spacing w:after="160" w:before="60"/>
-        <w:jc w:val="center"/>
-      </w:pPr>
-      <w:r>
-        <w:rPr>
-          <w:rFonts w:ascii="Cambria Math" w:cs="Cambria Math" w:eastAsia="Cambria Math" w:hAnsi="Cambria Math"/>
-          <w:i/>
-          <w:iCs/>
-          <w:sz w:val="22"/>
-          <w:szCs w:val="22"/>
-        </w:rPr>
-        <w:t xml:space="preserve">Scope = { Observation, Medication, Condition, Procedure }</w:t>
-      </w:r>
-    </w:p>
-    <w:p>
-      <w:pPr>
-        <w:spacing w:after="160" w:line="300"/>
-        <w:jc w:val="both"/>
-      </w:pPr>
-      <w:r>
-        <w:t xml:space="preserve">The doctor must subsequently select the modules to request; the request must be a non-empty subset of the authorised scope. The system displays the requested modules and performs cryptographic verification before granting access. In this version, the verification also generates and verifies a Groth16 zero-knowledge proof, whose public inputs are a Poseidon commitment and the current time and whose private witnesses are a secret and the expiry time; the proof establishes that the commitment is satisfied and that the current time does not exceed the expiry. Because the prover and the verifier currently run on the same server, the proof demonstrates the integration of the zero-knowledge toolchain rather than an additional privacy guarantee (Section 11). The audit ledger records the proof mode (groth16) with every granted access, and the subsystem then shows the message Cryptographic Verification Successful — Access Granted.</w:t>
+        <w:t xml:space="preserve">The guardian subsystem revisited after the background job has completed: 'Already anchored on Sepolia - token #2'.</w:t>
+      </w:r>
+    </w:p>
+    <w:p>
+      <w:pPr>
+        <w:spacing w:after="160" w:line="300"/>
+        <w:jc w:val="both"/>
+      </w:pPr>
+      <w:r>
+        <w:t xml:space="preserve">As shown in the figure above, the anchored state persists across sessions and navigation, because it is read back from the ledger rather than from the page. This provides a visible representation of the transition from a pending consent transaction to an activated, publicly recorded consent state. The SBT therefore functions in the implementation as a persistent cryptographic representation of the completed consent authorisation rather than as a transferable asset.</w:t>
       </w:r>
     </w:p>
     <w:p>
@@ -985,9 +878,9 @@
       <w:r>
         <w:drawing>
           <wp:inline distT="0" distB="0" distL="0" distR="0">
-            <wp:extent cx="5334000" cy="6229350"/>
+            <wp:extent cx="5905500" cy="4314825"/>
             <wp:effectExtent t="0" r="0" b="0" l="0"/>
-            <wp:docPr id="1" name="M4" descr="The doctor subsystem after verification: access granted and the authorised medical records displayed per EMR module (the Observation and Medication modules are visible), each with a Download CSV control." title="Figure 7"/>
+            <wp:docPr id="1" name="M3" descr="The anchoring transaction of the evaluated consent on Sepolia Etherscan: status Success, block 11,771,243, 'Mint 1 of MedicalConsent' to the pseudonymous patient address (function selector 0x1e1e7c76, mintConsentV3)." title="Figure 7"/>
             <wp:cNvGraphicFramePr>
               <a:graphicFrameLocks xmlns:a="http://schemas.openxmlformats.org/drawingml/2006/main" noChangeAspect="1"/>
             </wp:cNvGraphicFramePr>
@@ -1010,7 +903,7 @@
                   <pic:spPr bwMode="auto">
                     <a:xfrm>
                       <a:off x="0" y="0"/>
-                      <a:ext cx="5334000" cy="6229350"/>
+                      <a:ext cx="5905500" cy="4314825"/>
                     </a:xfrm>
                     <a:prstGeom prst="rect">
                       <a:avLst/>
@@ -1046,16 +939,73 @@
           <w:sz w:val="19"/>
           <w:szCs w:val="19"/>
         </w:rPr>
-        <w:t xml:space="preserve">The doctor subsystem after verification: access granted and the authorised medical records displayed per EMR module (the Observation and Medication modules are visible), each with a Download CSV control.</w:t>
-      </w:r>
-    </w:p>
-    <w:p>
-      <w:pPr>
-        <w:spacing w:after="160" w:line="300"/>
-        <w:jc w:val="both"/>
-      </w:pPr>
-      <w:r>
-        <w:t xml:space="preserve">As shown in the figure above, this demonstrates the transition from consent verification to data-access authorisation; the checks are recorded in the audit ledger as STATE_CHECK events, one for every evaluated access request, so validity is re-established at each request rather than assumed. This distinction is central to the HALAH design. Consent and data access are not treated as identical events. Instead, the flow proceeds as follows:</w:t>
+        <w:t xml:space="preserve">The anchoring transaction of the evaluated consent on Sepolia Etherscan: status Success, block 11,771,243, 'Mint 1 of MedicalConsent' to the pseudonymous patient address (function selector 0x1e1e7c76, mintConsentV3).</w:t>
+      </w:r>
+    </w:p>
+    <w:p>
+      <w:pPr>
+        <w:spacing w:after="160" w:line="300"/>
+        <w:jc w:val="left"/>
+      </w:pPr>
+      <w:r>
+        <w:t xml:space="preserve">As shown in the figure above, the anchoring of the evaluated consent (token #1) is an ordinary, publicly verifiable transaction: Etherscan reports the status Success, the block number 11,771,243, the transaction fee, and the transfer of one MedicalConsent token to the pseudonymous patient address derived from the patient DID. The transaction can be inspected at </w:t>
+      </w:r>
+      <w:hyperlink w:history="1" r:id="rId45w1kvfjapxsmu-xfl9bc">
+        <w:r>
+          <w:rPr>
+            <w:rStyle w:val="Hyperlink"/>
+          </w:rPr>
+          <w:t xml:space="preserve">Etherscan: mint transaction</w:t>
+        </w:r>
+      </w:hyperlink>
+      <w:r>
+        <w:t xml:space="preserve">. This provides an implementation-level demonstration that consent activation can be verified independently of the application.</w:t>
+      </w:r>
+    </w:p>
+    <w:p>
+      <w:pPr>
+        <w:spacing w:after="160" w:line="300"/>
+        <w:jc w:val="both"/>
+      </w:pPr>
+      <w:r>
+        <w:t xml:space="preserve">The guardian subsystem consequently corresponds to </w:t>
+      </w:r>
+      <w:r>
+        <w:rPr>
+          <w:b/>
+          <w:bCs/>
+        </w:rPr>
+        <w:t xml:space="preserve">Multi-Party Approval, Cryptographic Verification and Consent Activation</w:t>
+      </w:r>
+      <w:r>
+        <w:t xml:space="preserve"> in the proposed architecture.</w:t>
+      </w:r>
+    </w:p>
+    <w:p>
+      <w:pPr>
+        <w:pStyle w:val="Heading1"/>
+        <w:spacing w:after="160" w:before="320"/>
+      </w:pPr>
+      <w:r>
+        <w:t xml:space="preserve">4. Secure Patient Data Access for Doctor</w:t>
+      </w:r>
+    </w:p>
+    <w:p>
+      <w:pPr>
+        <w:spacing w:after="160" w:line="300"/>
+        <w:jc w:val="both"/>
+      </w:pPr>
+      <w:r>
+        <w:t xml:space="preserve">The third module is the Secure Patient Data Access module and represents the healthcare-provider side of the authorisation process.</w:t>
+      </w:r>
+    </w:p>
+    <w:p>
+      <w:pPr>
+        <w:spacing w:after="160" w:line="300"/>
+        <w:jc w:val="both"/>
+      </w:pPr>
+      <w:r>
+        <w:t xml:space="preserve">The doctor enters an authorised Consent ID, after which the system retrieves and displays the associated consent information. The subsystem shows the patient DID, Consent ID, purpose, and current consent state:</w:t>
       </w:r>
     </w:p>
     <w:p>
@@ -1071,53 +1021,16 @@
           <w:sz w:val="22"/>
           <w:szCs w:val="22"/>
         </w:rPr>
-        <w:t xml:space="preserve">Consent → Verification → AccessDecision</w:t>
-      </w:r>
-    </w:p>
-    <w:p>
-      <w:pPr>
-        <w:spacing w:after="160" w:line="300"/>
-        <w:jc w:val="both"/>
-      </w:pPr>
-      <w:r>
-        <w:t xml:space="preserve">The doctor is therefore authorised only when the requested resources are consistent with the consent object and the consent remains active. The final Authorised Medical Records section presents the actual data modules available to the doctor. Because the subsystem separates the OBSERVATION, MEDICATION, CONDITION and PROCEDURE modules, it provides a direct visual demonstration of fine-grained EMR access control.</w:t>
-      </w:r>
-    </w:p>
-    <w:p>
-      <w:pPr>
-        <w:spacing w:after="160" w:line="300"/>
-        <w:jc w:val="both"/>
-      </w:pPr>
-      <w:r>
-        <w:t xml:space="preserve">Thus, the doctor subsystem corresponds to </w:t>
-      </w:r>
-      <w:r>
-        <w:rPr>
-          <w:b/>
-          <w:bCs/>
-        </w:rPr>
-        <w:t xml:space="preserve">Consent-State Validation, Scope Enforcement and Authorised Data Access</w:t>
-      </w:r>
-      <w:r>
-        <w:t xml:space="preserve">.</w:t>
-      </w:r>
-    </w:p>
-    <w:p>
-      <w:pPr>
-        <w:pStyle w:val="Heading1"/>
-        <w:spacing w:after="160" w:before="320"/>
-      </w:pPr>
-      <w:r>
-        <w:t xml:space="preserve">5. Negative Demonstration: Jurisdiction Violation</w:t>
-      </w:r>
-    </w:p>
-    <w:p>
-      <w:pPr>
-        <w:spacing w:after="160" w:line="300"/>
-        <w:jc w:val="both"/>
-      </w:pPr>
-      <w:r>
-        <w:t xml:space="preserve">The fourth part is the negative demonstration. This is important because a consent framework must be evaluated not only on whether it grants legitimate access, but also on whether it refuses illegitimate access. The same doctor therefore repeated the request for the evaluated consent while declaring the requester jurisdiction as SA, whereas the consent was issued for AU.</w:t>
+        <w:t xml:space="preserve">State = ACTIVE</w:t>
+      </w:r>
+    </w:p>
+    <w:p>
+      <w:pPr>
+        <w:spacing w:after="160" w:line="300"/>
+        <w:jc w:val="both"/>
+      </w:pPr>
+      <w:r>
+        <w:t xml:space="preserve">This is important because the doctor does not directly access patient data based solely on possession of a Consent ID. The system first evaluates whether the underlying authorisation remains valid, and it does so for every component of the consent object. The decision matrix displayed to the doctor reports the outcome of each check individually.</w:t>
       </w:r>
     </w:p>
     <w:p>
@@ -1131,7 +1044,7 @@
           <wp:inline distT="0" distB="0" distL="0" distR="0">
             <wp:extent cx="5334000" cy="4200525"/>
             <wp:effectExtent t="0" r="0" b="0" l="0"/>
-            <wp:docPr id="1" name="g_doc_sa" descr="The doctor subsystem with requester jurisdiction SA: VL reports FAIL and consequently ALLOW = FAIL, although the consent state remains ACTIVE." title="Figure 8"/>
+            <wp:docPr id="1" name="g_doc_au" descr="The doctor subsystem with requester jurisdiction AU: all five checks report PASS, ALLOW = PASS, and the consent state is ACTIVE." title="Figure 8"/>
             <wp:cNvGraphicFramePr>
               <a:graphicFrameLocks xmlns:a="http://schemas.openxmlformats.org/drawingml/2006/main" noChangeAspect="1"/>
             </wp:cNvGraphicFramePr>
@@ -1190,16 +1103,41 @@
           <w:sz w:val="19"/>
           <w:szCs w:val="19"/>
         </w:rPr>
-        <w:t xml:space="preserve">The doctor subsystem with requester jurisdiction SA: VL reports FAIL and consequently ALLOW = FAIL, although the consent state remains ACTIVE.</w:t>
-      </w:r>
-    </w:p>
-    <w:p>
-      <w:pPr>
-        <w:spacing w:after="160" w:line="300"/>
-        <w:jc w:val="both"/>
-      </w:pPr>
-      <w:r>
-        <w:t xml:space="preserve">As shown in the figure above, the decision matrix immediately reports VL = FAIL and consequently ALLOW = FAIL, even though the consent itself is still ACTIVE, the guardian signatures remain valid and all other checks pass. This is important because it demonstrates that the access decision is taken over the complete consent tuple rather than over the consent state alone.</w:t>
+        <w:t xml:space="preserve">The doctor subsystem with requester jurisdiction AU: all five checks report PASS, ALLOW = PASS, and the consent state is ACTIVE.</w:t>
+      </w:r>
+    </w:p>
+    <w:p>
+      <w:pPr>
+        <w:spacing w:after="160" w:line="300"/>
+        <w:jc w:val="both"/>
+      </w:pPr>
+      <w:r>
+        <w:t xml:space="preserve">As shown in the figure above, the five checks VI (identity), VA (authorisation), VP (purpose), VT (time) and VL (jurisdiction) all report PASS, and consequently ALLOW = PASS. The subsystem then presents the Authorised Data Scope, showing that only the EMR modules specified in the original consent are available. In the demonstrated transaction, the authorised modules are:</w:t>
+      </w:r>
+    </w:p>
+    <w:p>
+      <w:pPr>
+        <w:spacing w:after="160" w:before="60"/>
+        <w:jc w:val="center"/>
+      </w:pPr>
+      <w:r>
+        <w:rPr>
+          <w:rFonts w:ascii="Cambria Math" w:cs="Cambria Math" w:eastAsia="Cambria Math" w:hAnsi="Cambria Math"/>
+          <w:i/>
+          <w:iCs/>
+          <w:sz w:val="22"/>
+          <w:szCs w:val="22"/>
+        </w:rPr>
+        <w:t xml:space="preserve">Scope = { Observation, Medication, Condition, Procedure }</w:t>
+      </w:r>
+    </w:p>
+    <w:p>
+      <w:pPr>
+        <w:spacing w:after="160" w:line="300"/>
+        <w:jc w:val="both"/>
+      </w:pPr>
+      <w:r>
+        <w:t xml:space="preserve">The doctor must subsequently select the modules to request; the request must be a non-empty subset of the authorised scope. The system displays the requested modules and performs cryptographic verification before granting access. In this version, the verification also generates and verifies a Groth16 zero-knowledge proof, whose public inputs are a Poseidon commitment and the current time and whose private witnesses are a secret and the expiry time; the proof establishes that the commitment is satisfied and that the current time does not exceed the expiry. Because the prover and the verifier currently run on the same server, the proof demonstrates the integration of the zero-knowledge toolchain rather than an additional privacy guarantee (Section 11). The audit ledger records the proof mode (groth16) with every granted access, and the subsystem then shows the message Cryptographic Verification Successful — Access Granted.</w:t>
       </w:r>
     </w:p>
     <w:p>
@@ -1211,9 +1149,9 @@
       <w:r>
         <w:drawing>
           <wp:inline distT="0" distB="0" distL="0" distR="0">
-            <wp:extent cx="5334000" cy="2638425"/>
+            <wp:extent cx="5334000" cy="6229350"/>
             <wp:effectExtent t="0" r="0" b="0" l="0"/>
-            <wp:docPr id="1" name="g_denied" descr="The refused request: 'Security Exception: Access Denied by ZK-Policy. Failed checks: VL'." title="Figure 9"/>
+            <wp:docPr id="1" name="M4" descr="The doctor subsystem after verification: access granted and the authorised medical records displayed per EMR module (the Observation and Medication modules are visible), each with a Download CSV control." title="Figure 9"/>
             <wp:cNvGraphicFramePr>
               <a:graphicFrameLocks xmlns:a="http://schemas.openxmlformats.org/drawingml/2006/main" noChangeAspect="1"/>
             </wp:cNvGraphicFramePr>
@@ -1236,7 +1174,7 @@
                   <pic:spPr bwMode="auto">
                     <a:xfrm>
                       <a:off x="0" y="0"/>
-                      <a:ext cx="5334000" cy="2638425"/>
+                      <a:ext cx="5334000" cy="6229350"/>
                     </a:xfrm>
                     <a:prstGeom prst="rect">
                       <a:avLst/>
@@ -1272,53 +1210,7 @@
           <w:sz w:val="19"/>
           <w:szCs w:val="19"/>
         </w:rPr>
-        <w:t xml:space="preserve">The refused request: 'Security Exception: Access Denied by ZK-Policy. Failed checks: VL'.</w:t>
-      </w:r>
-    </w:p>
-    <w:p>
-      <w:pPr>
-        <w:spacing w:after="160" w:line="300"/>
-        <w:jc w:val="both"/>
-      </w:pPr>
-      <w:r>
-        <w:t xml:space="preserve">As shown in the figure above, when the doctor submits the request, access is refused and the failed check is named explicitly. The corresponding audit-ledger entry records the result DENIED together with the complete decision matrix, so that the refusal is itself auditable. This is important because the jurisdiction check is included in the access decision rather than merely displayed.</w:t>
-      </w:r>
-    </w:p>
-    <w:p>
-      <w:pPr>
-        <w:spacing w:after="160" w:line="300"/>
-        <w:jc w:val="both"/>
-      </w:pPr>
-      <w:r>
-        <w:t xml:space="preserve">This demonstration corresponds to </w:t>
-      </w:r>
-      <w:r>
-        <w:rPr>
-          <w:b/>
-          <w:bCs/>
-        </w:rPr>
-        <w:t xml:space="preserve">Jurisdictional Constraint Enforcement and Fail-Closed Access Control</w:t>
-      </w:r>
-      <w:r>
-        <w:t xml:space="preserve">.</w:t>
-      </w:r>
-    </w:p>
-    <w:p>
-      <w:pPr>
-        <w:pStyle w:val="Heading1"/>
-        <w:spacing w:after="160" w:before="320"/>
-      </w:pPr>
-      <w:r>
-        <w:t xml:space="preserve">6. Consent Revocation</w:t>
-      </w:r>
-    </w:p>
-    <w:p>
-      <w:pPr>
-        <w:spacing w:after="160" w:line="300"/>
-        <w:jc w:val="both"/>
-      </w:pPr>
-      <w:r>
-        <w:t xml:space="preserve">The next module is the Consent Revocation module. This module operationalises the enforcement component of the consent object, which requires that a patient can withdraw consent and that the withdrawal takes effect for every subsequent request. In the patient's My Consents view, each consent is listed with its state, signature count and token. The patient then selects Revoke, after which the system updates the application state and submits a revoke transaction to the contract on Sepolia.</w:t>
+        <w:t xml:space="preserve">The doctor subsystem after verification: access granted and the authorised medical records displayed per EMR module (the Observation and Medication modules are visible), each with a Download CSV control.</w:t>
       </w:r>
     </w:p>
     <w:p>
@@ -1330,9 +1222,9 @@
       <w:r>
         <w:drawing>
           <wp:inline distT="0" distB="0" distL="0" distR="0">
-            <wp:extent cx="5334000" cy="3533775"/>
+            <wp:extent cx="5143500" cy="4314825"/>
             <wp:effectExtent t="0" r="0" b="0" l="0"/>
-            <wp:docPr id="1" name="g_revoked" descr="The patient subsystem after revocation: the evaluated consent f050c29a is REVOKED with token #1 (displayed as SBT-1). The other rows are earlier trial consents." title="Figure 10"/>
+            <wp:docPr id="1" name="M4b" descr="The remaining authorised modules of the same request: the Condition and Procedure records, each with its own export control." title="Figure 10"/>
             <wp:cNvGraphicFramePr>
               <a:graphicFrameLocks xmlns:a="http://schemas.openxmlformats.org/drawingml/2006/main" noChangeAspect="1"/>
             </wp:cNvGraphicFramePr>
@@ -1355,7 +1247,7 @@
                   <pic:spPr bwMode="auto">
                     <a:xfrm>
                       <a:off x="0" y="0"/>
-                      <a:ext cx="5334000" cy="3533775"/>
+                      <a:ext cx="5143500" cy="4314825"/>
                     </a:xfrm>
                     <a:prstGeom prst="rect">
                       <a:avLst/>
@@ -1391,16 +1283,78 @@
           <w:sz w:val="19"/>
           <w:szCs w:val="19"/>
         </w:rPr>
-        <w:t xml:space="preserve">The patient subsystem after revocation: the evaluated consent f050c29a is REVOKED with token #1 (displayed as SBT-1). The other rows are earlier trial consents.</w:t>
-      </w:r>
-    </w:p>
-    <w:p>
-      <w:pPr>
-        <w:spacing w:after="160" w:line="300"/>
-        <w:jc w:val="both"/>
-      </w:pPr>
-      <w:r>
-        <w:t xml:space="preserve">As shown in the figure above, the revoked consent is displayed as REVOKED together with its on-chain token number. The revocation was confirmed on Sepolia in block 11,771,307, and from that point the contract itself reports the token as no longer valid, so any verifier that reads the chain observes the withdrawal.</w:t>
+        <w:t xml:space="preserve">The remaining authorised modules of the same request: the Condition and Procedure records, each with its own export control.</w:t>
+      </w:r>
+    </w:p>
+    <w:p>
+      <w:pPr>
+        <w:spacing w:after="160" w:line="300"/>
+        <w:jc w:val="both"/>
+      </w:pPr>
+      <w:r>
+        <w:t xml:space="preserve">As shown in the two figures above, this demonstrates the transition from consent verification to data-access authorisation; the checks are recorded in the audit ledger as STATE_CHECK events, one for every evaluated access request, so validity is re-established at each request rather than assumed. This distinction is central to the HALAH design. Consent and data access are not treated as identical events. Instead, the flow proceeds as follows:</w:t>
+      </w:r>
+    </w:p>
+    <w:p>
+      <w:pPr>
+        <w:spacing w:after="160" w:before="60"/>
+        <w:jc w:val="center"/>
+      </w:pPr>
+      <w:r>
+        <w:rPr>
+          <w:rFonts w:ascii="Cambria Math" w:cs="Cambria Math" w:eastAsia="Cambria Math" w:hAnsi="Cambria Math"/>
+          <w:i/>
+          <w:iCs/>
+          <w:sz w:val="22"/>
+          <w:szCs w:val="22"/>
+        </w:rPr>
+        <w:t xml:space="preserve">Consent → Verification → AccessDecision</w:t>
+      </w:r>
+    </w:p>
+    <w:p>
+      <w:pPr>
+        <w:spacing w:after="160" w:line="300"/>
+        <w:jc w:val="both"/>
+      </w:pPr>
+      <w:r>
+        <w:t xml:space="preserve">The doctor is therefore authorised only when the requested resources are consistent with the consent object and the consent remains active. The final Authorised Medical Records section presents the actual data modules available to the doctor. Because the subsystem separates the OBSERVATION, MEDICATION, CONDITION and PROCEDURE modules, it provides a direct visual demonstration of fine-grained EMR access control.</w:t>
+      </w:r>
+    </w:p>
+    <w:p>
+      <w:pPr>
+        <w:spacing w:after="160" w:line="300"/>
+        <w:jc w:val="both"/>
+      </w:pPr>
+      <w:r>
+        <w:t xml:space="preserve">Thus, the doctor subsystem corresponds to </w:t>
+      </w:r>
+      <w:r>
+        <w:rPr>
+          <w:b/>
+          <w:bCs/>
+        </w:rPr>
+        <w:t xml:space="preserve">Consent-State Validation, Scope Enforcement and Authorised Data Access</w:t>
+      </w:r>
+      <w:r>
+        <w:t xml:space="preserve">.</w:t>
+      </w:r>
+    </w:p>
+    <w:p>
+      <w:pPr>
+        <w:pStyle w:val="Heading1"/>
+        <w:spacing w:after="160" w:before="320"/>
+      </w:pPr>
+      <w:r>
+        <w:t xml:space="preserve">5. Negative Demonstration: Jurisdiction Violation</w:t>
+      </w:r>
+    </w:p>
+    <w:p>
+      <w:pPr>
+        <w:spacing w:after="160" w:line="300"/>
+        <w:jc w:val="both"/>
+      </w:pPr>
+      <w:r>
+        <w:t xml:space="preserve">The fourth part is the negative demonstration. This is important because a consent framework must be evaluated not only on whether it grants legitimate access, but also on whether it refuses illegitimate access. The same doctor therefore repeated the request for the evaluated consent while declaring the requester jurisdiction as SA, whereas the consent was issued for AU.</w:t>
       </w:r>
     </w:p>
     <w:p>
@@ -1412,9 +1366,9 @@
       <w:r>
         <w:drawing>
           <wp:inline distT="0" distB="0" distL="0" distR="0">
-            <wp:extent cx="5334000" cy="2952750"/>
+            <wp:extent cx="5334000" cy="4200525"/>
             <wp:effectExtent t="0" r="0" b="0" l="0"/>
-            <wp:docPr id="1" name="M5" descr="The doctor subsystem after revocation: VA reports FAIL and the consent is reported as 'not active. Current state: REVOKED'." title="Figure 11"/>
+            <wp:docPr id="1" name="g_doc_sa" descr="The doctor subsystem with requester jurisdiction SA: VL reports FAIL and consequently ALLOW = FAIL, although the consent state remains ACTIVE." title="Figure 11"/>
             <wp:cNvGraphicFramePr>
               <a:graphicFrameLocks xmlns:a="http://schemas.openxmlformats.org/drawingml/2006/main" noChangeAspect="1"/>
             </wp:cNvGraphicFramePr>
@@ -1437,7 +1391,7 @@
                   <pic:spPr bwMode="auto">
                     <a:xfrm>
                       <a:off x="0" y="0"/>
-                      <a:ext cx="5334000" cy="2952750"/>
+                      <a:ext cx="5334000" cy="4200525"/>
                     </a:xfrm>
                     <a:prstGeom prst="rect">
                       <a:avLst/>
@@ -1473,16 +1427,16 @@
           <w:sz w:val="19"/>
           <w:szCs w:val="19"/>
         </w:rPr>
-        <w:t xml:space="preserve">The doctor subsystem after revocation: VA reports FAIL and the consent is reported as 'not active. Current state: REVOKED'.</w:t>
-      </w:r>
-    </w:p>
-    <w:p>
-      <w:pPr>
-        <w:spacing w:after="160" w:line="300"/>
-        <w:jc w:val="both"/>
-      </w:pPr>
-      <w:r>
-        <w:t xml:space="preserve">As shown in the figure above, when the doctor subsequently enters the same Consent ID, the authorisation check VA fails and the subsystem reports that the consent is not active. Consequently, revocation is not merely a change of display: it removes the authorisation on which every later access decision depends.</w:t>
+        <w:t xml:space="preserve">The doctor subsystem with requester jurisdiction SA: VL reports FAIL and consequently ALLOW = FAIL, although the consent state remains ACTIVE.</w:t>
+      </w:r>
+    </w:p>
+    <w:p>
+      <w:pPr>
+        <w:spacing w:after="160" w:line="300"/>
+        <w:jc w:val="both"/>
+      </w:pPr>
+      <w:r>
+        <w:t xml:space="preserve">As shown in the figure above, the decision matrix immediately reports VL = FAIL and consequently ALLOW = FAIL, even though the consent itself is still ACTIVE, the guardian signatures remain valid and all other checks pass. This is important because it demonstrates that the access decision is taken over the complete consent tuple rather than over the consent state alone.</w:t>
       </w:r>
     </w:p>
     <w:p>
@@ -1494,9 +1448,9 @@
       <w:r>
         <w:drawing>
           <wp:inline distT="0" distB="0" distL="0" distR="0">
-            <wp:extent cx="5905500" cy="3886200"/>
+            <wp:extent cx="5334000" cy="2638425"/>
             <wp:effectExtent t="0" r="0" b="0" l="0"/>
-            <wp:docPr id="1" name="M6" descr="The revocation transaction on Sepolia Etherscan: status Success, block 11,771,307, decoded input 'Function: revoke(uint256 tokenId)' with tokenId = 1." title="Figure 12"/>
+            <wp:docPr id="1" name="g_denied" descr="The refused request: 'Security Exception: Access Denied by ZK-Policy. Failed checks: VL'." title="Figure 12"/>
             <wp:cNvGraphicFramePr>
               <a:graphicFrameLocks xmlns:a="http://schemas.openxmlformats.org/drawingml/2006/main" noChangeAspect="1"/>
             </wp:cNvGraphicFramePr>
@@ -1519,7 +1473,7 @@
                   <pic:spPr bwMode="auto">
                     <a:xfrm>
                       <a:off x="0" y="0"/>
-                      <a:ext cx="5905500" cy="3886200"/>
+                      <a:ext cx="5334000" cy="2638425"/>
                     </a:xfrm>
                     <a:prstGeom prst="rect">
                       <a:avLst/>
@@ -1555,34 +1509,32 @@
           <w:sz w:val="19"/>
           <w:szCs w:val="19"/>
         </w:rPr>
-        <w:t xml:space="preserve">The revocation transaction on Sepolia Etherscan: status Success, block 11,771,307, decoded input 'Function: revoke(uint256 tokenId)' with tokenId = 1.</w:t>
-      </w:r>
-    </w:p>
-    <w:p>
-      <w:pPr>
-        <w:spacing w:after="160" w:line="300"/>
-        <w:jc w:val="left"/>
-      </w:pPr>
-      <w:r>
-        <w:t xml:space="preserve">As shown in the figure above, the revocation is again a publicly verifiable transaction, whose decoded input names the contract function revoke and the token identifier. The transaction can be inspected at </w:t>
-      </w:r>
-      <w:hyperlink w:history="1" r:id="rId8akxp3dltwbxtknnobw2w">
-        <w:r>
-          <w:rPr>
-            <w:rStyle w:val="Hyperlink"/>
-          </w:rPr>
-          <w:t xml:space="preserve">Etherscan: revoke transaction</w:t>
-        </w:r>
-      </w:hyperlink>
-      <w:r>
-        <w:t xml:space="preserve">. The revocation subsystem therefore corresponds to </w:t>
+        <w:t xml:space="preserve">The refused request: 'Security Exception: Access Denied by ZK-Policy. Failed checks: VL'.</w:t>
+      </w:r>
+    </w:p>
+    <w:p>
+      <w:pPr>
+        <w:spacing w:after="160" w:line="300"/>
+        <w:jc w:val="both"/>
+      </w:pPr>
+      <w:r>
+        <w:t xml:space="preserve">As shown in the figure above, when the doctor submits the request, access is refused and the failed check is named explicitly. The corresponding audit-ledger entry records the result DENIED together with the complete decision matrix, so that the refusal is itself auditable. This is important because the jurisdiction check is included in the access decision rather than merely displayed.</w:t>
+      </w:r>
+    </w:p>
+    <w:p>
+      <w:pPr>
+        <w:spacing w:after="160" w:line="300"/>
+        <w:jc w:val="both"/>
+      </w:pPr>
+      <w:r>
+        <w:t xml:space="preserve">This demonstration corresponds to </w:t>
       </w:r>
       <w:r>
         <w:rPr>
           <w:b/>
           <w:bCs/>
         </w:rPr>
-        <w:t xml:space="preserve">Enforcement State Management and Consent Withdrawal</w:t>
+        <w:t xml:space="preserve">Jurisdictional Constraint Enforcement and Fail-Closed Access Control</w:t>
       </w:r>
       <w:r>
         <w:t xml:space="preserve">.</w:t>
@@ -1594,16 +1546,16 @@
         <w:spacing w:after="160" w:before="320"/>
       </w:pPr>
       <w:r>
-        <w:t xml:space="preserve">7. Blockchain Audit &amp; Consent Lifecycle for Auditor</w:t>
-      </w:r>
-    </w:p>
-    <w:p>
-      <w:pPr>
-        <w:spacing w:after="160" w:line="300"/>
-        <w:jc w:val="both"/>
-      </w:pPr>
-      <w:r>
-        <w:t xml:space="preserve">The fifth major module is the Blockchain Audit &amp; Consent Lifecycle module. This subsystem provides an independent view of the complete consent process and corresponds to the auditability and accountability component of the HALAH framework.</w:t>
+        <w:t xml:space="preserve">6. Consent Revocation</w:t>
+      </w:r>
+    </w:p>
+    <w:p>
+      <w:pPr>
+        <w:spacing w:after="160" w:line="300"/>
+        <w:jc w:val="both"/>
+      </w:pPr>
+      <w:r>
+        <w:t xml:space="preserve">The next module is the Consent Revocation module. This module operationalises the enforcement component of the consent object, which requires that a patient can withdraw consent and that the withdrawal takes effect for every subsequent request. In the patient's My Consents view, each consent is listed with its state, signature count and token. The patient then selects Revoke, after which the system updates the application state and submits a revoke transaction to the contract on Sepolia.</w:t>
       </w:r>
     </w:p>
     <w:p>
@@ -1615,9 +1567,9 @@
       <w:r>
         <w:drawing>
           <wp:inline distT="0" distB="0" distL="0" distR="0">
-            <wp:extent cx="5905500" cy="3457575"/>
+            <wp:extent cx="5143500" cy="3714750"/>
             <wp:effectExtent t="0" r="0" b="0" l="0"/>
-            <wp:docPr id="1" name="M7" descr="The auditor subsystem with the evaluated consent selected: aggregate indicators and the Detailed Audit Records, in which the on-chain events carry their transaction hashes and block numbers." title="Figure 13"/>
+            <wp:docPr id="1" name="g_revoking" descr="The patient subsystem during revocation: 'Revoking on Sepolia - waiting for block confirmation…'." title="Figure 13"/>
             <wp:cNvGraphicFramePr>
               <a:graphicFrameLocks xmlns:a="http://schemas.openxmlformats.org/drawingml/2006/main" noChangeAspect="1"/>
             </wp:cNvGraphicFramePr>
@@ -1640,7 +1592,7 @@
                   <pic:spPr bwMode="auto">
                     <a:xfrm>
                       <a:off x="0" y="0"/>
-                      <a:ext cx="5905500" cy="3457575"/>
+                      <a:ext cx="5143500" cy="3714750"/>
                     </a:xfrm>
                     <a:prstGeom prst="rect">
                       <a:avLst/>
@@ -1676,198 +1628,16 @@
           <w:sz w:val="19"/>
           <w:szCs w:val="19"/>
         </w:rPr>
-        <w:t xml:space="preserve">The auditor subsystem with the evaluated consent selected: aggregate indicators and the Detailed Audit Records, in which the on-chain events carry their transaction hashes and block numbers.</w:t>
-      </w:r>
-    </w:p>
-    <w:p>
-      <w:pPr>
-        <w:spacing w:after="160" w:line="300"/>
-        <w:jc w:val="both"/>
-      </w:pPr>
-      <w:r>
-        <w:t xml:space="preserve">As shown in the figure above, the system first provides aggregate indicators including:</w:t>
-      </w:r>
-    </w:p>
-    <w:p>
-      <w:pPr>
-        <w:spacing w:after="160" w:before="60"/>
-        <w:jc w:val="center"/>
-      </w:pPr>
-      <w:r>
-        <w:rPr>
-          <w:rFonts w:ascii="Cambria Math" w:cs="Cambria Math" w:eastAsia="Cambria Math" w:hAnsi="Cambria Math"/>
-          <w:i/>
-          <w:iCs/>
-          <w:sz w:val="22"/>
-          <w:szCs w:val="22"/>
-        </w:rPr>
-        <w:t xml:space="preserve">Total Events = 60    Consent Events = 8    Access Requests = 9    On-chain Anchors = 5</w:t>
-      </w:r>
-    </w:p>
-    <w:p>
-      <w:pPr>
-        <w:spacing w:after="160" w:line="300"/>
-        <w:jc w:val="both"/>
-      </w:pPr>
-      <w:r>
-        <w:t xml:space="preserve">These indicators give the auditor an immediate overview of the recorded system activity and of how many events are anchored on the public chain. The five anchors comprise the mint and revocation of the evaluated consent (token #1), the mint of the photographed lifecycle (token #2), and the mint and revocation of an earlier trial consent on the previous contract; the nine access requests include the granted, refused and reproduced requests of both lifecycles. More importantly, the Consent Lifecycle section reconstructs the sequence of events associated with a particular consent. The reconstructed records include CREATE_CONSENT performed by the patient, followed by SIGN_CONSENT performed by each guardian, followed by MINT_SBT and ONCHAIN_MINT performed by the smart contract; in the figure the detailed table is scrolled to the on-chain events, whose rows carry the transaction hashes. The subsequent system events STATE_CHECK demonstrate that the Consent Engine continuously evaluates the state of the authorisation. The doctor then generates DATA_ACCESS with the result GRANTED, later DATA_ACCESS with the result DENIED when the jurisdiction check fails, and finally the patient generates REVOKE_CONSENT followed by ONCHAIN_REVOKE performed by the smart contract.</w:t>
-      </w:r>
-    </w:p>
-    <w:p>
-      <w:pPr>
-        <w:spacing w:after="160" w:line="300"/>
-        <w:jc w:val="both"/>
-      </w:pPr>
-      <w:r>
-        <w:t xml:space="preserve">This produces an explicit chain of evidence as</w:t>
-      </w:r>
-    </w:p>
-    <w:p>
-      <w:pPr>
-        <w:spacing w:after="160" w:before="60"/>
-        <w:jc w:val="center"/>
-      </w:pPr>
-      <w:r>
-        <w:rPr>
-          <w:rFonts w:ascii="Cambria Math" w:cs="Cambria Math" w:eastAsia="Cambria Math" w:hAnsi="Cambria Math"/>
-          <w:i/>
-          <w:iCs/>
-          <w:sz w:val="22"/>
-          <w:szCs w:val="22"/>
-        </w:rPr>
-        <w:t xml:space="preserve">Patient → Guardian_A → Guardian_B → SmartContract(mint) → ConsentEngine → Doctor(GRANTED)</w:t>
-      </w:r>
-    </w:p>
-    <w:p>
-      <w:pPr>
-        <w:spacing w:after="160" w:before="60"/>
-        <w:jc w:val="center"/>
-      </w:pPr>
-      <w:r>
-        <w:rPr>
-          <w:rFonts w:ascii="Cambria Math" w:cs="Cambria Math" w:eastAsia="Cambria Math" w:hAnsi="Cambria Math"/>
-          <w:i/>
-          <w:iCs/>
-          <w:sz w:val="22"/>
-          <w:szCs w:val="22"/>
-        </w:rPr>
-        <w:t xml:space="preserve">→ Doctor(DENIED) → Patient(revoke) → SmartContract(revoke)</w:t>
-      </w:r>
-    </w:p>
-    <w:p>
-      <w:pPr>
-        <w:spacing w:after="160" w:line="300"/>
-        <w:jc w:val="both"/>
-      </w:pPr>
-      <w:r>
-        <w:t xml:space="preserve">The audit subsystem therefore allows an auditor to reconstruct not only who accessed the data, but also why that access was permitted or refused, because each access event can be associated with the preceding consent creation, guardian approvals, on-chain activation, state checks and the decision matrix that was in force at that moment.</w:t>
-      </w:r>
-    </w:p>
-    <w:p>
-      <w:pPr>
-        <w:spacing w:after="160" w:line="300"/>
-        <w:jc w:val="both"/>
-      </w:pPr>
-      <w:r>
-        <w:t xml:space="preserve">This corresponds to the proposed requirement for </w:t>
-      </w:r>
-      <w:r>
-        <w:rPr>
-          <w:b/>
-          <w:bCs/>
-        </w:rPr>
-        <w:t xml:space="preserve">traceability, accountability and non-repudiable consent evidence</w:t>
-      </w:r>
-      <w:r>
-        <w:t xml:space="preserve">.</w:t>
-      </w:r>
-    </w:p>
-    <w:p>
-      <w:pPr>
-        <w:pStyle w:val="Heading1"/>
-        <w:spacing w:after="160" w:before="320"/>
-      </w:pPr>
-      <w:r>
-        <w:t xml:space="preserve">8. Detailed Audit Records</w:t>
-      </w:r>
-    </w:p>
-    <w:p>
-      <w:pPr>
-        <w:spacing w:after="160" w:line="300"/>
-        <w:jc w:val="both"/>
-      </w:pPr>
-      <w:r>
-        <w:t xml:space="preserve">The Detailed Audit Records component provides a lower-level view of the events represented in the lifecycle subsystem.</w:t>
-      </w:r>
-    </w:p>
-    <w:p>
-      <w:pPr>
-        <w:spacing w:after="160" w:line="300"/>
-        <w:jc w:val="both"/>
-      </w:pPr>
-      <w:r>
-        <w:t xml:space="preserve">Where the lifecycle view is primarily designed to communicate the chronological sequence of the authorisation process, the detailed audit view provides the underlying event-level evidence. Each event can be associated with attributes such as actor, role, action, result, timestamp, consent context and, for on-chain events, the transaction hash and block number. As shown in the auditor figure above, the ONCHAIN_MINT and ONCHAIN_REVOKE rows carry the hashes of the two Sepolia transactions presented in Sections 3 and 6, so the ledger and the public chain describe the same events.</w:t>
-      </w:r>
-    </w:p>
-    <w:p>
-      <w:pPr>
-        <w:spacing w:after="160" w:line="300"/>
-        <w:jc w:val="both"/>
-      </w:pPr>
-      <w:r>
-        <w:t xml:space="preserve">This separation is useful because different stakeholders require different levels of information. A clinician may only need to know that a consent is active and valid, whereas an auditor may need to establish precisely when an approval occurred, which identity performed it, and what authorisation decision followed.</w:t>
-      </w:r>
-    </w:p>
-    <w:p>
-      <w:pPr>
-        <w:spacing w:after="160" w:line="300"/>
-        <w:jc w:val="both"/>
-      </w:pPr>
-      <w:r>
-        <w:t xml:space="preserve">The subsystem therefore implements the distinction between operational access information and forensic/audit information.</w:t>
-      </w:r>
-    </w:p>
-    <w:p>
-      <w:pPr>
-        <w:pStyle w:val="Heading1"/>
-        <w:spacing w:after="160" w:before="320"/>
-      </w:pPr>
-      <w:r>
-        <w:t xml:space="preserve">9. Complete Blockchain Audit Ledger and Independent Verification</w:t>
-      </w:r>
-    </w:p>
-    <w:p>
-      <w:pPr>
-        <w:spacing w:after="160" w:line="300"/>
-        <w:jc w:val="both"/>
-      </w:pPr>
-      <w:r>
-        <w:t xml:space="preserve">The Complete Blockchain Audit Ledger provides the most comprehensive representation of the recorded consent history. This component demonstrates that the audit mechanism is not limited to successful data-access events. Instead, the system records the broader lifecycle of the consent, including creation, signatures, state validation, smart-contract actions, refused requests and revocations. Consequently, the ledger provides the evidentiary foundation for evaluating several properties of the proposed framework:</w:t>
-      </w:r>
-    </w:p>
-    <w:p>
-      <w:pPr>
-        <w:spacing w:after="160" w:before="60"/>
-        <w:jc w:val="center"/>
-      </w:pPr>
-      <w:r>
-        <w:rPr>
-          <w:rFonts w:ascii="Cambria Math" w:cs="Cambria Math" w:eastAsia="Cambria Math" w:hAnsi="Cambria Math"/>
-          <w:i/>
-          <w:iCs/>
-          <w:sz w:val="22"/>
-          <w:szCs w:val="22"/>
-        </w:rPr>
-        <w:t xml:space="preserve">Accountability + Traceability + Integrity + Non-repudiation</w:t>
-      </w:r>
-    </w:p>
-    <w:p>
-      <w:pPr>
-        <w:spacing w:after="160" w:line="300"/>
-        <w:jc w:val="both"/>
-      </w:pPr>
-      <w:r>
-        <w:t xml:space="preserve">A ledger kept by the application could in principle contain fabricated entries. Consequently, the implementation provides an independent verification tool. The tool re-reads the ledger and, for every event that carries a transaction hash, fetches the corresponding receipt directly from Sepolia and checks that the transaction exists, succeeded, and was included in the recorded block; for every anchored consent it then reads the token back from the contract and compares the on-chain revocation state with the local state.</w:t>
+        <w:t xml:space="preserve">The patient subsystem during revocation: 'Revoking on Sepolia - waiting for block confirmation…'.</w:t>
+      </w:r>
+    </w:p>
+    <w:p>
+      <w:pPr>
+        <w:spacing w:after="160" w:line="300"/>
+        <w:jc w:val="both"/>
+      </w:pPr>
+      <w:r>
+        <w:t xml:space="preserve">As shown in the figure above, the withdrawal is submitted as a blockchain transaction and the subsystem waits for the block confirmation before reporting the final state.</w:t>
       </w:r>
     </w:p>
     <w:p>
@@ -1879,9 +1649,9 @@
       <w:r>
         <w:drawing>
           <wp:inline distT="0" distB="0" distL="0" distR="0">
-            <wp:extent cx="5334000" cy="2162175"/>
+            <wp:extent cx="5334000" cy="3533775"/>
             <wp:effectExtent t="0" r="0" b="0" l="0"/>
-            <wp:docPr id="1" name="M8" descr="The final verdict of the independent verification executed against Sepolia: the visible line confirms the unrevoked second token against the chain, and the tool reports RESULT: ALL CHECKS PASSED." title="Figure 14"/>
+            <wp:docPr id="1" name="g_revoked" descr="The patient subsystem after revocation: the evaluated consent f050c29a is REVOKED with token #1 (displayed as SBT-1). The other rows are earlier trial consents." title="Figure 14"/>
             <wp:cNvGraphicFramePr>
               <a:graphicFrameLocks xmlns:a="http://schemas.openxmlformats.org/drawingml/2006/main" noChangeAspect="1"/>
             </wp:cNvGraphicFramePr>
@@ -1904,6 +1674,555 @@
                   <pic:spPr bwMode="auto">
                     <a:xfrm>
                       <a:off x="0" y="0"/>
+                      <a:ext cx="5334000" cy="3533775"/>
+                    </a:xfrm>
+                    <a:prstGeom prst="rect">
+                      <a:avLst/>
+                    </a:prstGeom>
+                  </pic:spPr>
+                </pic:pic>
+              </a:graphicData>
+            </a:graphic>
+          </wp:inline>
+        </w:drawing>
+      </w:r>
+    </w:p>
+    <w:p>
+      <w:pPr>
+        <w:spacing w:after="180"/>
+        <w:jc w:val="center"/>
+      </w:pPr>
+      <w:r>
+        <w:rPr>
+          <w:b/>
+          <w:bCs/>
+          <w:i/>
+          <w:iCs/>
+          <w:sz w:val="19"/>
+          <w:szCs w:val="19"/>
+        </w:rPr>
+        <w:t xml:space="preserve">Figure 14. </w:t>
+      </w:r>
+      <w:r>
+        <w:rPr>
+          <w:i/>
+          <w:iCs/>
+          <w:sz w:val="19"/>
+          <w:szCs w:val="19"/>
+        </w:rPr>
+        <w:t xml:space="preserve">The patient subsystem after revocation: the evaluated consent f050c29a is REVOKED with token #1 (displayed as SBT-1). The other rows are earlier trial consents.</w:t>
+      </w:r>
+    </w:p>
+    <w:p>
+      <w:pPr>
+        <w:spacing w:after="160" w:line="300"/>
+        <w:jc w:val="both"/>
+      </w:pPr>
+      <w:r>
+        <w:t xml:space="preserve">As shown in the figure above, the revoked consent is displayed as REVOKED together with its on-chain token number. The revocation was confirmed on Sepolia in block 11,771,307, and from that point the contract itself reports the token as no longer valid, so any verifier that reads the chain observes the withdrawal.</w:t>
+      </w:r>
+    </w:p>
+    <w:p>
+      <w:pPr>
+        <w:keepNext/>
+        <w:spacing w:after="60" w:before="120"/>
+        <w:jc w:val="center"/>
+      </w:pPr>
+      <w:r>
+        <w:drawing>
+          <wp:inline distT="0" distB="0" distL="0" distR="0">
+            <wp:extent cx="5334000" cy="2952750"/>
+            <wp:effectExtent t="0" r="0" b="0" l="0"/>
+            <wp:docPr id="1" name="M5" descr="The doctor subsystem after revocation: VA reports FAIL and the consent is reported as 'not active. Current state: REVOKED'." title="Figure 15"/>
+            <wp:cNvGraphicFramePr>
+              <a:graphicFrameLocks xmlns:a="http://schemas.openxmlformats.org/drawingml/2006/main" noChangeAspect="1"/>
+            </wp:cNvGraphicFramePr>
+            <a:graphic xmlns:a="http://schemas.openxmlformats.org/drawingml/2006/main">
+              <a:graphicData uri="http://schemas.openxmlformats.org/drawingml/2006/picture">
+                <pic:pic xmlns:pic="http://schemas.openxmlformats.org/drawingml/2006/picture">
+                  <pic:nvPicPr>
+                    <pic:cNvPr id="0" name="" descr=""/>
+                    <pic:cNvPicPr>
+                      <a:picLocks noChangeAspect="1" noChangeArrowheads="1"/>
+                    </pic:cNvPicPr>
+                  </pic:nvPicPr>
+                  <pic:blipFill>
+                    <a:blip r:embed="rId22" cstate="none"/>
+                    <a:srcRect/>
+                    <a:stretch>
+                      <a:fillRect/>
+                    </a:stretch>
+                  </pic:blipFill>
+                  <pic:spPr bwMode="auto">
+                    <a:xfrm>
+                      <a:off x="0" y="0"/>
+                      <a:ext cx="5334000" cy="2952750"/>
+                    </a:xfrm>
+                    <a:prstGeom prst="rect">
+                      <a:avLst/>
+                    </a:prstGeom>
+                  </pic:spPr>
+                </pic:pic>
+              </a:graphicData>
+            </a:graphic>
+          </wp:inline>
+        </w:drawing>
+      </w:r>
+    </w:p>
+    <w:p>
+      <w:pPr>
+        <w:spacing w:after="180"/>
+        <w:jc w:val="center"/>
+      </w:pPr>
+      <w:r>
+        <w:rPr>
+          <w:b/>
+          <w:bCs/>
+          <w:i/>
+          <w:iCs/>
+          <w:sz w:val="19"/>
+          <w:szCs w:val="19"/>
+        </w:rPr>
+        <w:t xml:space="preserve">Figure 15. </w:t>
+      </w:r>
+      <w:r>
+        <w:rPr>
+          <w:i/>
+          <w:iCs/>
+          <w:sz w:val="19"/>
+          <w:szCs w:val="19"/>
+        </w:rPr>
+        <w:t xml:space="preserve">The doctor subsystem after revocation: VA reports FAIL and the consent is reported as 'not active. Current state: REVOKED'.</w:t>
+      </w:r>
+    </w:p>
+    <w:p>
+      <w:pPr>
+        <w:spacing w:after="160" w:line="300"/>
+        <w:jc w:val="both"/>
+      </w:pPr>
+      <w:r>
+        <w:t xml:space="preserve">As shown in the figure above, when the doctor subsequently enters the same Consent ID, the authorisation check VA fails and the subsystem reports that the consent is not active. Consequently, revocation is not merely a change of display: it removes the authorisation on which every later access decision depends.</w:t>
+      </w:r>
+    </w:p>
+    <w:p>
+      <w:pPr>
+        <w:keepNext/>
+        <w:spacing w:after="60" w:before="120"/>
+        <w:jc w:val="center"/>
+      </w:pPr>
+      <w:r>
+        <w:drawing>
+          <wp:inline distT="0" distB="0" distL="0" distR="0">
+            <wp:extent cx="5905500" cy="3886200"/>
+            <wp:effectExtent t="0" r="0" b="0" l="0"/>
+            <wp:docPr id="1" name="M6" descr="The revocation transaction on Sepolia Etherscan: status Success, block 11,771,307, decoded input 'Function: revoke(uint256 tokenId)' with tokenId = 1." title="Figure 16"/>
+            <wp:cNvGraphicFramePr>
+              <a:graphicFrameLocks xmlns:a="http://schemas.openxmlformats.org/drawingml/2006/main" noChangeAspect="1"/>
+            </wp:cNvGraphicFramePr>
+            <a:graphic xmlns:a="http://schemas.openxmlformats.org/drawingml/2006/main">
+              <a:graphicData uri="http://schemas.openxmlformats.org/drawingml/2006/picture">
+                <pic:pic xmlns:pic="http://schemas.openxmlformats.org/drawingml/2006/picture">
+                  <pic:nvPicPr>
+                    <pic:cNvPr id="0" name="" descr=""/>
+                    <pic:cNvPicPr>
+                      <a:picLocks noChangeAspect="1" noChangeArrowheads="1"/>
+                    </pic:cNvPicPr>
+                  </pic:nvPicPr>
+                  <pic:blipFill>
+                    <a:blip r:embed="rId23" cstate="none"/>
+                    <a:srcRect/>
+                    <a:stretch>
+                      <a:fillRect/>
+                    </a:stretch>
+                  </pic:blipFill>
+                  <pic:spPr bwMode="auto">
+                    <a:xfrm>
+                      <a:off x="0" y="0"/>
+                      <a:ext cx="5905500" cy="3886200"/>
+                    </a:xfrm>
+                    <a:prstGeom prst="rect">
+                      <a:avLst/>
+                    </a:prstGeom>
+                  </pic:spPr>
+                </pic:pic>
+              </a:graphicData>
+            </a:graphic>
+          </wp:inline>
+        </w:drawing>
+      </w:r>
+    </w:p>
+    <w:p>
+      <w:pPr>
+        <w:spacing w:after="180"/>
+        <w:jc w:val="center"/>
+      </w:pPr>
+      <w:r>
+        <w:rPr>
+          <w:b/>
+          <w:bCs/>
+          <w:i/>
+          <w:iCs/>
+          <w:sz w:val="19"/>
+          <w:szCs w:val="19"/>
+        </w:rPr>
+        <w:t xml:space="preserve">Figure 16. </w:t>
+      </w:r>
+      <w:r>
+        <w:rPr>
+          <w:i/>
+          <w:iCs/>
+          <w:sz w:val="19"/>
+          <w:szCs w:val="19"/>
+        </w:rPr>
+        <w:t xml:space="preserve">The revocation transaction on Sepolia Etherscan: status Success, block 11,771,307, decoded input 'Function: revoke(uint256 tokenId)' with tokenId = 1.</w:t>
+      </w:r>
+    </w:p>
+    <w:p>
+      <w:pPr>
+        <w:spacing w:after="160" w:line="300"/>
+        <w:jc w:val="left"/>
+      </w:pPr>
+      <w:r>
+        <w:t xml:space="preserve">As shown in the figure above, the revocation is again a publicly verifiable transaction, whose decoded input names the contract function revoke and the token identifier. The transaction can be inspected at </w:t>
+      </w:r>
+      <w:hyperlink w:history="1" r:id="rIdhuu6sl_edugn-imhlgvuo">
+        <w:r>
+          <w:rPr>
+            <w:rStyle w:val="Hyperlink"/>
+          </w:rPr>
+          <w:t xml:space="preserve">Etherscan: revoke transaction</w:t>
+        </w:r>
+      </w:hyperlink>
+      <w:r>
+        <w:t xml:space="preserve">. The revocation subsystem therefore corresponds to </w:t>
+      </w:r>
+      <w:r>
+        <w:rPr>
+          <w:b/>
+          <w:bCs/>
+        </w:rPr>
+        <w:t xml:space="preserve">Enforcement State Management and Consent Withdrawal</w:t>
+      </w:r>
+      <w:r>
+        <w:t xml:space="preserve">.</w:t>
+      </w:r>
+    </w:p>
+    <w:p>
+      <w:pPr>
+        <w:pStyle w:val="Heading1"/>
+        <w:spacing w:after="160" w:before="320"/>
+      </w:pPr>
+      <w:r>
+        <w:t xml:space="preserve">7. Blockchain Audit &amp; Consent Lifecycle for Auditor</w:t>
+      </w:r>
+    </w:p>
+    <w:p>
+      <w:pPr>
+        <w:spacing w:after="160" w:line="300"/>
+        <w:jc w:val="both"/>
+      </w:pPr>
+      <w:r>
+        <w:t xml:space="preserve">The fifth major module is the Blockchain Audit &amp; Consent Lifecycle module. This subsystem provides an independent view of the complete consent process and corresponds to the auditability and accountability component of the HALAH framework.</w:t>
+      </w:r>
+    </w:p>
+    <w:p>
+      <w:pPr>
+        <w:keepNext/>
+        <w:spacing w:after="60" w:before="120"/>
+        <w:jc w:val="center"/>
+      </w:pPr>
+      <w:r>
+        <w:drawing>
+          <wp:inline distT="0" distB="0" distL="0" distR="0">
+            <wp:extent cx="5905500" cy="3457575"/>
+            <wp:effectExtent t="0" r="0" b="0" l="0"/>
+            <wp:docPr id="1" name="M7" descr="The auditor subsystem with the evaluated consent selected: aggregate indicators and the Detailed Audit Records, in which the on-chain events carry their transaction hashes and block numbers." title="Figure 17"/>
+            <wp:cNvGraphicFramePr>
+              <a:graphicFrameLocks xmlns:a="http://schemas.openxmlformats.org/drawingml/2006/main" noChangeAspect="1"/>
+            </wp:cNvGraphicFramePr>
+            <a:graphic xmlns:a="http://schemas.openxmlformats.org/drawingml/2006/main">
+              <a:graphicData uri="http://schemas.openxmlformats.org/drawingml/2006/picture">
+                <pic:pic xmlns:pic="http://schemas.openxmlformats.org/drawingml/2006/picture">
+                  <pic:nvPicPr>
+                    <pic:cNvPr id="0" name="" descr=""/>
+                    <pic:cNvPicPr>
+                      <a:picLocks noChangeAspect="1" noChangeArrowheads="1"/>
+                    </pic:cNvPicPr>
+                  </pic:nvPicPr>
+                  <pic:blipFill>
+                    <a:blip r:embed="rId24" cstate="none"/>
+                    <a:srcRect/>
+                    <a:stretch>
+                      <a:fillRect/>
+                    </a:stretch>
+                  </pic:blipFill>
+                  <pic:spPr bwMode="auto">
+                    <a:xfrm>
+                      <a:off x="0" y="0"/>
+                      <a:ext cx="5905500" cy="3457575"/>
+                    </a:xfrm>
+                    <a:prstGeom prst="rect">
+                      <a:avLst/>
+                    </a:prstGeom>
+                  </pic:spPr>
+                </pic:pic>
+              </a:graphicData>
+            </a:graphic>
+          </wp:inline>
+        </w:drawing>
+      </w:r>
+    </w:p>
+    <w:p>
+      <w:pPr>
+        <w:spacing w:after="180"/>
+        <w:jc w:val="center"/>
+      </w:pPr>
+      <w:r>
+        <w:rPr>
+          <w:b/>
+          <w:bCs/>
+          <w:i/>
+          <w:iCs/>
+          <w:sz w:val="19"/>
+          <w:szCs w:val="19"/>
+        </w:rPr>
+        <w:t xml:space="preserve">Figure 17. </w:t>
+      </w:r>
+      <w:r>
+        <w:rPr>
+          <w:i/>
+          <w:iCs/>
+          <w:sz w:val="19"/>
+          <w:szCs w:val="19"/>
+        </w:rPr>
+        <w:t xml:space="preserve">The auditor subsystem with the evaluated consent selected: aggregate indicators and the Detailed Audit Records, in which the on-chain events carry their transaction hashes and block numbers.</w:t>
+      </w:r>
+    </w:p>
+    <w:p>
+      <w:pPr>
+        <w:spacing w:after="160" w:line="300"/>
+        <w:jc w:val="both"/>
+      </w:pPr>
+      <w:r>
+        <w:t xml:space="preserve">As shown in the figure above, the system first provides aggregate indicators including:</w:t>
+      </w:r>
+    </w:p>
+    <w:p>
+      <w:pPr>
+        <w:spacing w:after="160" w:before="60"/>
+        <w:jc w:val="center"/>
+      </w:pPr>
+      <w:r>
+        <w:rPr>
+          <w:rFonts w:ascii="Cambria Math" w:cs="Cambria Math" w:eastAsia="Cambria Math" w:hAnsi="Cambria Math"/>
+          <w:i/>
+          <w:iCs/>
+          <w:sz w:val="22"/>
+          <w:szCs w:val="22"/>
+        </w:rPr>
+        <w:t xml:space="preserve">Total Events = 60    Consent Events = 8    Access Requests = 9    On-chain Anchors = 5</w:t>
+      </w:r>
+    </w:p>
+    <w:p>
+      <w:pPr>
+        <w:spacing w:after="160" w:line="300"/>
+        <w:jc w:val="both"/>
+      </w:pPr>
+      <w:r>
+        <w:t xml:space="preserve">These indicators give the auditor an immediate overview of the recorded system activity and of how many events are anchored on the public chain. The five anchors comprise the mint and revocation of the evaluated consent (token #1), the mint of the photographed lifecycle (token #2), and the mint and revocation of an earlier trial consent on the previous contract; the nine access requests include the granted, refused and reproduced requests of both lifecycles. More importantly, the Consent Lifecycle section reconstructs the sequence of events associated with a particular consent. The reconstructed records include CREATE_CONSENT performed by the patient, followed by SIGN_CONSENT performed by each guardian, followed by MINT_SBT and ONCHAIN_MINT performed by the smart contract; in the figure the detailed table is scrolled to the on-chain events, whose rows carry the transaction hashes. The subsequent system events STATE_CHECK demonstrate that the Consent Engine continuously evaluates the state of the authorisation. The doctor then generates DATA_ACCESS with the result GRANTED, later DATA_ACCESS with the result DENIED when the jurisdiction check fails, and finally the patient generates REVOKE_CONSENT followed by ONCHAIN_REVOKE performed by the smart contract.</w:t>
+      </w:r>
+    </w:p>
+    <w:p>
+      <w:pPr>
+        <w:spacing w:after="160" w:line="300"/>
+        <w:jc w:val="both"/>
+      </w:pPr>
+      <w:r>
+        <w:t xml:space="preserve">This produces an explicit chain of evidence as</w:t>
+      </w:r>
+    </w:p>
+    <w:p>
+      <w:pPr>
+        <w:spacing w:after="160" w:before="60"/>
+        <w:jc w:val="center"/>
+      </w:pPr>
+      <w:r>
+        <w:rPr>
+          <w:rFonts w:ascii="Cambria Math" w:cs="Cambria Math" w:eastAsia="Cambria Math" w:hAnsi="Cambria Math"/>
+          <w:i/>
+          <w:iCs/>
+          <w:sz w:val="22"/>
+          <w:szCs w:val="22"/>
+        </w:rPr>
+        <w:t xml:space="preserve">Patient → Guardian_A → Guardian_B → SmartContract(mint) → ConsentEngine → Doctor(GRANTED)</w:t>
+      </w:r>
+    </w:p>
+    <w:p>
+      <w:pPr>
+        <w:spacing w:after="160" w:before="60"/>
+        <w:jc w:val="center"/>
+      </w:pPr>
+      <w:r>
+        <w:rPr>
+          <w:rFonts w:ascii="Cambria Math" w:cs="Cambria Math" w:eastAsia="Cambria Math" w:hAnsi="Cambria Math"/>
+          <w:i/>
+          <w:iCs/>
+          <w:sz w:val="22"/>
+          <w:szCs w:val="22"/>
+        </w:rPr>
+        <w:t xml:space="preserve">→ Doctor(DENIED) → Patient(revoke) → SmartContract(revoke)</w:t>
+      </w:r>
+    </w:p>
+    <w:p>
+      <w:pPr>
+        <w:spacing w:after="160" w:line="300"/>
+        <w:jc w:val="both"/>
+      </w:pPr>
+      <w:r>
+        <w:t xml:space="preserve">The audit subsystem therefore allows an auditor to reconstruct not only who accessed the data, but also why that access was permitted or refused, because each access event can be associated with the preceding consent creation, guardian approvals, on-chain activation, state checks and the decision matrix that was in force at that moment.</w:t>
+      </w:r>
+    </w:p>
+    <w:p>
+      <w:pPr>
+        <w:spacing w:after="160" w:line="300"/>
+        <w:jc w:val="both"/>
+      </w:pPr>
+      <w:r>
+        <w:t xml:space="preserve">This corresponds to the proposed requirement for </w:t>
+      </w:r>
+      <w:r>
+        <w:rPr>
+          <w:b/>
+          <w:bCs/>
+        </w:rPr>
+        <w:t xml:space="preserve">traceability, accountability and non-repudiable consent evidence</w:t>
+      </w:r>
+      <w:r>
+        <w:t xml:space="preserve">.</w:t>
+      </w:r>
+    </w:p>
+    <w:p>
+      <w:pPr>
+        <w:pStyle w:val="Heading1"/>
+        <w:spacing w:after="160" w:before="320"/>
+      </w:pPr>
+      <w:r>
+        <w:t xml:space="preserve">8. Detailed Audit Records</w:t>
+      </w:r>
+    </w:p>
+    <w:p>
+      <w:pPr>
+        <w:spacing w:after="160" w:line="300"/>
+        <w:jc w:val="both"/>
+      </w:pPr>
+      <w:r>
+        <w:t xml:space="preserve">The Detailed Audit Records component provides a lower-level view of the events represented in the lifecycle subsystem.</w:t>
+      </w:r>
+    </w:p>
+    <w:p>
+      <w:pPr>
+        <w:spacing w:after="160" w:line="300"/>
+        <w:jc w:val="both"/>
+      </w:pPr>
+      <w:r>
+        <w:t xml:space="preserve">Where the lifecycle view is primarily designed to communicate the chronological sequence of the authorisation process, the detailed audit view provides the underlying event-level evidence. Each event can be associated with attributes such as actor, role, action, result, timestamp, consent context and, for on-chain events, the transaction hash and block number. As shown in the auditor figure above, the ONCHAIN_MINT and ONCHAIN_REVOKE rows carry the hashes of the two Sepolia transactions presented in Sections 3 and 6, so the ledger and the public chain describe the same events.</w:t>
+      </w:r>
+    </w:p>
+    <w:p>
+      <w:pPr>
+        <w:spacing w:after="160" w:line="300"/>
+        <w:jc w:val="both"/>
+      </w:pPr>
+      <w:r>
+        <w:t xml:space="preserve">This separation is useful because different stakeholders require different levels of information. A clinician may only need to know that a consent is active and valid, whereas an auditor may need to establish precisely when an approval occurred, which identity performed it, and what authorisation decision followed.</w:t>
+      </w:r>
+    </w:p>
+    <w:p>
+      <w:pPr>
+        <w:spacing w:after="160" w:line="300"/>
+        <w:jc w:val="both"/>
+      </w:pPr>
+      <w:r>
+        <w:t xml:space="preserve">The subsystem therefore implements the distinction between operational access information and forensic/audit information.</w:t>
+      </w:r>
+    </w:p>
+    <w:p>
+      <w:pPr>
+        <w:pStyle w:val="Heading1"/>
+        <w:spacing w:after="160" w:before="320"/>
+      </w:pPr>
+      <w:r>
+        <w:t xml:space="preserve">9. Complete Blockchain Audit Ledger and Independent Verification</w:t>
+      </w:r>
+    </w:p>
+    <w:p>
+      <w:pPr>
+        <w:spacing w:after="160" w:line="300"/>
+        <w:jc w:val="both"/>
+      </w:pPr>
+      <w:r>
+        <w:t xml:space="preserve">The Complete Blockchain Audit Ledger provides the most comprehensive representation of the recorded consent history. This component demonstrates that the audit mechanism is not limited to successful data-access events. Instead, the system records the broader lifecycle of the consent, including creation, signatures, state validation, smart-contract actions, refused requests and revocations. Consequently, the ledger provides the evidentiary foundation for evaluating several properties of the proposed framework:</w:t>
+      </w:r>
+    </w:p>
+    <w:p>
+      <w:pPr>
+        <w:spacing w:after="160" w:before="60"/>
+        <w:jc w:val="center"/>
+      </w:pPr>
+      <w:r>
+        <w:rPr>
+          <w:rFonts w:ascii="Cambria Math" w:cs="Cambria Math" w:eastAsia="Cambria Math" w:hAnsi="Cambria Math"/>
+          <w:i/>
+          <w:iCs/>
+          <w:sz w:val="22"/>
+          <w:szCs w:val="22"/>
+        </w:rPr>
+        <w:t xml:space="preserve">Accountability + Traceability + Integrity + Non-repudiation</w:t>
+      </w:r>
+    </w:p>
+    <w:p>
+      <w:pPr>
+        <w:spacing w:after="160" w:line="300"/>
+        <w:jc w:val="both"/>
+      </w:pPr>
+      <w:r>
+        <w:t xml:space="preserve">A ledger kept by the application could in principle contain fabricated entries. Consequently, the implementation provides an independent verification tool. The tool re-reads the ledger and, for every event that carries a transaction hash, fetches the corresponding receipt directly from Sepolia and checks that the transaction exists, succeeded, and was included in the recorded block; for every anchored consent it then reads the token back from the contract and compares the on-chain revocation state with the local state.</w:t>
+      </w:r>
+    </w:p>
+    <w:p>
+      <w:pPr>
+        <w:keepNext/>
+        <w:spacing w:after="60" w:before="120"/>
+        <w:jc w:val="center"/>
+      </w:pPr>
+      <w:r>
+        <w:drawing>
+          <wp:inline distT="0" distB="0" distL="0" distR="0">
+            <wp:extent cx="5334000" cy="2162175"/>
+            <wp:effectExtent t="0" r="0" b="0" l="0"/>
+            <wp:docPr id="1" name="M8" descr="The final verdict of the independent verification executed against Sepolia: the visible line confirms the unrevoked second token against the chain, and the tool reports RESULT: ALL CHECKS PASSED." title="Figure 18"/>
+            <wp:cNvGraphicFramePr>
+              <a:graphicFrameLocks xmlns:a="http://schemas.openxmlformats.org/drawingml/2006/main" noChangeAspect="1"/>
+            </wp:cNvGraphicFramePr>
+            <a:graphic xmlns:a="http://schemas.openxmlformats.org/drawingml/2006/main">
+              <a:graphicData uri="http://schemas.openxmlformats.org/drawingml/2006/picture">
+                <pic:pic xmlns:pic="http://schemas.openxmlformats.org/drawingml/2006/picture">
+                  <pic:nvPicPr>
+                    <pic:cNvPr id="0" name="" descr=""/>
+                    <pic:cNvPicPr>
+                      <a:picLocks noChangeAspect="1" noChangeArrowheads="1"/>
+                    </pic:cNvPicPr>
+                  </pic:nvPicPr>
+                  <pic:blipFill>
+                    <a:blip r:embed="rId25" cstate="none"/>
+                    <a:srcRect/>
+                    <a:stretch>
+                      <a:fillRect/>
+                    </a:stretch>
+                  </pic:blipFill>
+                  <pic:spPr bwMode="auto">
+                    <a:xfrm>
+                      <a:off x="0" y="0"/>
                       <a:ext cx="5334000" cy="2162175"/>
                     </a:xfrm>
                     <a:prstGeom prst="rect">
@@ -1931,7 +2250,7 @@
           <w:sz w:val="19"/>
           <w:szCs w:val="19"/>
         </w:rPr>
-        <w:t xml:space="preserve">Figure 14. </w:t>
+        <w:t xml:space="preserve">Figure 18. </w:t>
       </w:r>
       <w:r>
         <w:rPr>
@@ -3251,7 +3570,7 @@
       <w:r>
         <w:t xml:space="preserve">Contract: </w:t>
       </w:r>
-      <w:hyperlink w:history="1" r:id="rId3-ticln0vezrrj3qzuvgn">
+      <w:hyperlink w:history="1" r:id="rId-uocax0c0cpm4xunjkc7w">
         <w:r>
           <w:rPr>
             <w:rStyle w:val="Hyperlink"/>
@@ -3268,7 +3587,7 @@
       <w:r>
         <w:t xml:space="preserve">Consent activation (mint of token #1): </w:t>
       </w:r>
-      <w:hyperlink w:history="1" r:id="rIdehk3hz1lyelp-vujnrwpd">
+      <w:hyperlink w:history="1" r:id="rIdmhbit4ht2fzcgeil72ty1">
         <w:r>
           <w:rPr>
             <w:rStyle w:val="Hyperlink"/>
@@ -3285,7 +3604,7 @@
       <w:r>
         <w:t xml:space="preserve">Consent revocation (token #1): </w:t>
       </w:r>
-      <w:hyperlink w:history="1" r:id="rIdfhloa_ntoq5jz80qnol25">
+      <w:hyperlink w:history="1" r:id="rIdgqscxeps4hzaxc5vm8rvo">
         <w:r>
           <w:rPr>
             <w:rStyle w:val="Hyperlink"/>

</xml_diff>

<commit_message>
docs: complete narrative chapter - 23 figures (all of today's screenshots), 33 workflow-verified review fixes applied
Co-Authored-By: Claude Fable 5 <noreply@anthropic.com>
Claude-Session: https://claude.ai/code/session_01QHSSv245Aernyaebt7V5kS
</commit_message>
<xml_diff>
--- a/docs/HALAH_Implementation_v1.2_Narrative.docx
+++ b/docs/HALAH_Implementation_v1.2_Narrative.docx
@@ -26,7 +26,7 @@
         <w:jc w:val="both"/>
       </w:pPr>
       <w:r>
-        <w:t xml:space="preserve">In version 1.2, the activation and revocation of a consent are not confined to the application. Instead, they are executed as real transactions on the </w:t>
+        <w:t xml:space="preserve">The activation and revocation of a consent are not confined to the application. Instead, they are executed as real transactions on the </w:t>
       </w:r>
       <w:r>
         <w:rPr>
@@ -118,25 +118,6 @@
     </w:p>
     <w:p>
       <w:pPr>
-        <w:spacing w:after="160" w:line="300"/>
-        <w:jc w:val="both"/>
-      </w:pPr>
-      <w:r>
-        <w:t xml:space="preserve">The consent token contract, </w:t>
-      </w:r>
-      <w:r>
-        <w:rPr>
-          <w:b/>
-          <w:bCs/>
-        </w:rPr>
-        <w:t xml:space="preserve">ConsentSBTv3</w:t>
-      </w:r>
-      <w:r>
-        <w:t xml:space="preserve">, was compiled in Remix and deployed to the Sepolia test network from the project test wallet through MetaMask. The contract implements a soulbound ERC-721 token. Transfers between accounts are blocked. Consequently, an activated consent can never be traded or moved, and burning follows the ERC-5484 consensual-burn interface. Each token stores the pseudonymous patient and requester addresses, a hash of the purpose, the validity window, a two-letter jurisdiction code and a revocation flag. The purpose is stored only as a keccak256 hash, and no medical content is written to the chain; the plaintext purpose and the EMR data remain in the application.</w:t>
-      </w:r>
-    </w:p>
-    <w:p>
-      <w:pPr>
         <w:keepNext/>
         <w:spacing w:after="60" w:before="120"/>
         <w:jc w:val="center"/>
@@ -144,9 +125,9 @@
       <w:r>
         <w:drawing>
           <wp:inline distT="0" distB="0" distL="0" distR="0">
-            <wp:extent cx="5334000" cy="5124450"/>
+            <wp:extent cx="5715000" cy="3257550"/>
             <wp:effectExtent t="0" r="0" b="0" l="0"/>
-            <wp:docPr id="1" name="g_deploy" descr="Deployment of ConsentSBTv3 from Remix through MetaMask on the Sepolia network." title="Figure 1"/>
+            <wp:docPr id="1" name="n_compile" descr="Compilation of ConsentSBTv3 in Remix: the compiler reports a successful compilation and the contract is selected for deployment." title="Figure 1"/>
             <wp:cNvGraphicFramePr>
               <a:graphicFrameLocks xmlns:a="http://schemas.openxmlformats.org/drawingml/2006/main" noChangeAspect="1"/>
             </wp:cNvGraphicFramePr>
@@ -169,7 +150,7 @@
                   <pic:spPr bwMode="auto">
                     <a:xfrm>
                       <a:off x="0" y="0"/>
-                      <a:ext cx="5334000" cy="5124450"/>
+                      <a:ext cx="5715000" cy="3257550"/>
                     </a:xfrm>
                     <a:prstGeom prst="rect">
                       <a:avLst/>
@@ -205,16 +186,26 @@
           <w:sz w:val="19"/>
           <w:szCs w:val="19"/>
         </w:rPr>
-        <w:t xml:space="preserve">Deployment of ConsentSBTv3 from Remix through MetaMask on the Sepolia network.</w:t>
-      </w:r>
-    </w:p>
-    <w:p>
-      <w:pPr>
-        <w:spacing w:after="160" w:line="300"/>
-        <w:jc w:val="both"/>
-      </w:pPr>
-      <w:r>
-        <w:t xml:space="preserve">As shown in the figure above, the deployment is an ordinary Ethereum transaction that the wallet owner must explicitly confirm: the project test wallet (displayed as BNHP Ministry Test Wallet) shows the target network (Sepolia), the estimated network fee and the account nonce before the contract is created. This is important because it demonstrates that consent activation in HALAH ultimately rests on the same transaction-signing discipline as any other blockchain operation.</w:t>
+        <w:t xml:space="preserve">Compilation of ConsentSBTv3 in Remix: the compiler reports a successful compilation and the contract is selected for deployment.</w:t>
+      </w:r>
+    </w:p>
+    <w:p>
+      <w:pPr>
+        <w:spacing w:after="160" w:line="300"/>
+        <w:jc w:val="both"/>
+      </w:pPr>
+      <w:r>
+        <w:t xml:space="preserve">As shown in the figure above, the consent token contract, </w:t>
+      </w:r>
+      <w:r>
+        <w:rPr>
+          <w:b/>
+          <w:bCs/>
+        </w:rPr>
+        <w:t xml:space="preserve">ConsentSBTv3</w:t>
+      </w:r>
+      <w:r>
+        <w:t xml:space="preserve">, was first compiled in Remix without errors; the deployment record lists solc 0.8.34 with the optimiser enabled. The contract was then deployed to the Sepolia test network from the project test wallet through MetaMask. The contract implements a soulbound ERC-721 token. Transfers between accounts are blocked. Consequently, an activated consent can never be traded or moved; burning is possible only through the ERC-5484 consensual-burn interface. Each token stores the pseudonymous patient and requester addresses, a hash of the purpose, the validity window, a two-letter jurisdiction code and a revocation flag. The purpose is stored only as a keccak256 hash, and no medical content is written to the chain; the plaintext purpose and the EMR data remain in the application.</w:t>
       </w:r>
     </w:p>
     <w:p>
@@ -226,9 +217,9 @@
       <w:r>
         <w:drawing>
           <wp:inline distT="0" distB="0" distL="0" distR="0">
-            <wp:extent cx="5905500" cy="2571750"/>
+            <wp:extent cx="5334000" cy="5124450"/>
             <wp:effectExtent t="0" r="0" b="0" l="0"/>
-            <wp:docPr id="1" name="g_etherscan" descr="The deployed contract on Sepolia Etherscan, with the creator wallet, the MedicalConsent (CONSENT) token tracker and the first mint transaction." title="Figure 2"/>
+            <wp:docPr id="1" name="g_deploy" descr="Deployment of ConsentSBTv3 from Remix through MetaMask on the Sepolia network." title="Figure 2"/>
             <wp:cNvGraphicFramePr>
               <a:graphicFrameLocks xmlns:a="http://schemas.openxmlformats.org/drawingml/2006/main" noChangeAspect="1"/>
             </wp:cNvGraphicFramePr>
@@ -251,7 +242,7 @@
                   <pic:spPr bwMode="auto">
                     <a:xfrm>
                       <a:off x="0" y="0"/>
-                      <a:ext cx="5905500" cy="2571750"/>
+                      <a:ext cx="5334000" cy="5124450"/>
                     </a:xfrm>
                     <a:prstGeom prst="rect">
                       <a:avLst/>
@@ -287,36 +278,16 @@
           <w:sz w:val="19"/>
           <w:szCs w:val="19"/>
         </w:rPr>
-        <w:t xml:space="preserve">The deployed contract on Sepolia Etherscan, with the creator wallet, the MedicalConsent (CONSENT) token tracker and the first mint transaction.</w:t>
-      </w:r>
-    </w:p>
-    <w:p>
-      <w:pPr>
-        <w:spacing w:after="160" w:line="300"/>
-        <w:jc w:val="left"/>
-      </w:pPr>
-      <w:r>
-        <w:t xml:space="preserve">As shown in the figure above, the deployed contract is publicly listed at </w:t>
-      </w:r>
-      <w:hyperlink w:history="1" r:id="rIdkumd2k9oniehtgokxgh1r">
-        <w:r>
-          <w:rPr>
-            <w:rStyle w:val="Hyperlink"/>
-          </w:rPr>
-          <w:t xml:space="preserve">0x0EC3617581DEC63A7f2bb162DC14d088916ADc73</w:t>
-        </w:r>
-      </w:hyperlink>
-      <w:r>
-        <w:t xml:space="preserve"> together with its creator wallet and the token tracker MedicalConsent (CONSENT). Consequently, the existence of the consent registry itself, and every activation or revocation recorded on it, can be inspected independently of the HALAH application.</w:t>
-      </w:r>
-    </w:p>
-    <w:p>
-      <w:pPr>
-        <w:spacing w:after="160" w:line="300"/>
-        <w:jc w:val="both"/>
-      </w:pPr>
-      <w:r>
-        <w:t xml:space="preserve">The application itself was run in GitHub Codespaces, a browser-based execution environment. Before the demonstration, a readiness check was executed which confirms the network (Sepolia, chainId 11155111), the signer balance, the presence of contract code at the configured address, and that the signer is the contract owner.</w:t>
+        <w:t xml:space="preserve">Deployment of ConsentSBTv3 from Remix through MetaMask on the Sepolia network.</w:t>
+      </w:r>
+    </w:p>
+    <w:p>
+      <w:pPr>
+        <w:spacing w:after="160" w:line="300"/>
+        <w:jc w:val="both"/>
+      </w:pPr>
+      <w:r>
+        <w:t xml:space="preserve">As shown in the figure above, the deployment is an ordinary Ethereum transaction that the wallet owner must explicitly confirm: the project test wallet (displayed as BNHP Ministry Test Wallet) shows the target network (Sepolia), the estimated network fee and the account nonce before the contract is created. This is important because it demonstrates that consent activation in HALAH ultimately rests on the same transaction-signing discipline as any other blockchain operation.</w:t>
       </w:r>
     </w:p>
     <w:p>
@@ -328,9 +299,9 @@
       <w:r>
         <w:drawing>
           <wp:inline distT="0" distB="0" distL="0" distR="0">
-            <wp:extent cx="4381500" cy="1057275"/>
+            <wp:extent cx="5524500" cy="4105275"/>
             <wp:effectExtent t="0" r="0" b="0" l="0"/>
-            <wp:docPr id="1" name="g_ready" descr="The Sepolia readiness check executed in GitHub Codespaces before the demonstration: the system reports READY." title="Figure 3"/>
+            <wp:docPr id="1" name="n_verified" descr="Remix after deployment: the contract appears under Deployed Contracts and the source verification service reports Verification Successful." title="Figure 3"/>
             <wp:cNvGraphicFramePr>
               <a:graphicFrameLocks xmlns:a="http://schemas.openxmlformats.org/drawingml/2006/main" noChangeAspect="1"/>
             </wp:cNvGraphicFramePr>
@@ -353,7 +324,7 @@
                   <pic:spPr bwMode="auto">
                     <a:xfrm>
                       <a:off x="0" y="0"/>
-                      <a:ext cx="4381500" cy="1057275"/>
+                      <a:ext cx="5524500" cy="4105275"/>
                     </a:xfrm>
                     <a:prstGeom prst="rect">
                       <a:avLst/>
@@ -389,68 +360,16 @@
           <w:sz w:val="19"/>
           <w:szCs w:val="19"/>
         </w:rPr>
-        <w:t xml:space="preserve">The Sepolia readiness check executed in GitHub Codespaces before the demonstration: the system reports READY.</w:t>
-      </w:r>
-    </w:p>
-    <w:p>
-      <w:pPr>
-        <w:spacing w:after="160" w:line="300"/>
-        <w:jc w:val="both"/>
-      </w:pPr>
-      <w:r>
-        <w:t xml:space="preserve">As shown in the figure above, the check reports READY, so every subsequent step of the demonstration operates against the live contract. The subsystem therefore serves as the entry point for demonstrating the complete authorisation process rather than functioning merely as a conventional patient-record application.</w:t>
-      </w:r>
-    </w:p>
-    <w:p>
-      <w:pPr>
-        <w:pStyle w:val="Heading1"/>
-        <w:spacing w:after="160" w:before="320"/>
-      </w:pPr>
-      <w:r>
-        <w:t xml:space="preserve">2. Create Smart Consent Contract: Patient Subsystem</w:t>
-      </w:r>
-    </w:p>
-    <w:p>
-      <w:pPr>
-        <w:spacing w:after="160" w:line="300"/>
-        <w:jc w:val="both"/>
-      </w:pPr>
-      <w:r>
-        <w:t xml:space="preserve">The first functional subsystem is the Create Smart Consent Contract module. This module represents the patient-side initiation of a consent transaction and corresponds directly to the construction of the proposed consent object.</w:t>
-      </w:r>
-    </w:p>
-    <w:p>
-      <w:pPr>
-        <w:spacing w:after="160" w:line="300"/>
-        <w:jc w:val="both"/>
-      </w:pPr>
-      <w:r>
-        <w:t xml:space="preserve">The subsystem requires the patient to specify the Patient DID, Authorised Doctor DID, Data Access Scope, Designated Guardian DIDs, the Jurisdiction, and the temporal validity of the consent. These fields collectively operationalise the proposed consent representation:</w:t>
-      </w:r>
-    </w:p>
-    <w:p>
-      <w:pPr>
-        <w:spacing w:after="160" w:before="60"/>
-        <w:jc w:val="center"/>
-      </w:pPr>
-      <w:r>
-        <w:rPr>
-          <w:rFonts w:ascii="Cambria Math" w:cs="Cambria Math" w:eastAsia="Cambria Math" w:hAnsi="Cambria Math"/>
-          <w:i/>
-          <w:iCs/>
-          <w:sz w:val="22"/>
-          <w:szCs w:val="22"/>
-        </w:rPr>
-        <w:t xml:space="preserve">C = (I, A, P, T, L, E)</w:t>
-      </w:r>
-    </w:p>
-    <w:p>
-      <w:pPr>
-        <w:spacing w:after="160" w:line="300"/>
-        <w:jc w:val="both"/>
-      </w:pPr>
-      <w:r>
-        <w:t xml:space="preserve">where the identity of the patient is represented through a DID, the authorised actor is explicitly specified, the permitted data scope is constrained to selected EMR modules, the temporal fields define when the authorisation becomes valid and when it expires, the jurisdiction field constrains where the consent may be exercised, and the enforcement state records whether the consent is active or revoked.</w:t>
+        <w:t xml:space="preserve">Remix after deployment: the contract appears under Deployed Contracts and the source verification service reports Verification Successful.</w:t>
+      </w:r>
+    </w:p>
+    <w:p>
+      <w:pPr>
+        <w:spacing w:after="160" w:line="300"/>
+        <w:jc w:val="both"/>
+      </w:pPr>
+      <w:r>
+        <w:t xml:space="preserve">As shown in the figure above, the deployed instance is listed in Remix under Deployed Contracts, and the source code was submitted for verification, which completed with Verification Successful. This is important because it ties the published bytecode on Sepolia to the audited Solidity source, so any party can confirm which rules the consent registry actually enforces.</w:t>
       </w:r>
     </w:p>
     <w:p>
@@ -462,9 +381,9 @@
       <w:r>
         <w:drawing>
           <wp:inline distT="0" distB="0" distL="0" distR="0">
-            <wp:extent cx="5334000" cy="3943350"/>
+            <wp:extent cx="5905500" cy="2571750"/>
             <wp:effectExtent t="0" r="0" b="0" l="0"/>
-            <wp:docPr id="1" name="M1" descr="The patient subsystem after consent creation: four EMR modules, two designated guardians, jurisdiction AU, and the state PENDING_SIGNATURE." title="Figure 4"/>
+            <wp:docPr id="1" name="g_etherscan" descr="The deployed contract on Sepolia Etherscan, with the creator wallet, the MedicalConsent (CONSENT) token tracker and the first mint transaction." title="Figure 4"/>
             <wp:cNvGraphicFramePr>
               <a:graphicFrameLocks xmlns:a="http://schemas.openxmlformats.org/drawingml/2006/main" noChangeAspect="1"/>
             </wp:cNvGraphicFramePr>
@@ -487,7 +406,7 @@
                   <pic:spPr bwMode="auto">
                     <a:xfrm>
                       <a:off x="0" y="0"/>
-                      <a:ext cx="5334000" cy="3943350"/>
+                      <a:ext cx="5905500" cy="2571750"/>
                     </a:xfrm>
                     <a:prstGeom prst="rect">
                       <a:avLst/>
@@ -523,109 +442,36 @@
           <w:sz w:val="19"/>
           <w:szCs w:val="19"/>
         </w:rPr>
-        <w:t xml:space="preserve">The patient subsystem after consent creation: four EMR modules, two designated guardians, jurisdiction AU, and the state PENDING_SIGNATURE.</w:t>
-      </w:r>
-    </w:p>
-    <w:p>
-      <w:pPr>
-        <w:spacing w:after="160" w:line="300"/>
-        <w:jc w:val="both"/>
-      </w:pPr>
-      <w:r>
-        <w:t xml:space="preserve">As shown in the figure above, the Patient DID provides the identity pointer for the data subject, while the Authorised Doctor DID limits the intended healthcare recipient. This is important because the implementation does not represent consent as a general permission to access a patient's medical information. Instead, the authorisation is bound to a specific identity and therefore supports subject-specific and actor-specific access control.</w:t>
-      </w:r>
-    </w:p>
-    <w:p>
-      <w:pPr>
-        <w:spacing w:after="160" w:line="300"/>
-        <w:jc w:val="both"/>
-      </w:pPr>
-      <w:r>
-        <w:t xml:space="preserve">The Data Access Scope is particularly important to the proposed framework. Instead of granting access to the complete EMR, the patient selects particular modules; in the demonstrated transaction all four modules (Observation, Medication, Condition and Procedure) were selected. This implements the principle of purpose- and scope-limited consent and corresponds to the P component of the consent object. Version 1.2 additionally validates the input before the consent is stored: a consent with an empty data scope is rejected, and every guardian entry must be a well-formed DID.</w:t>
-      </w:r>
-    </w:p>
-    <w:p>
-      <w:pPr>
-        <w:spacing w:after="160" w:line="300"/>
-        <w:jc w:val="both"/>
-      </w:pPr>
-      <w:r>
-        <w:t xml:space="preserve">The Designated Guardian DIDs establish the additional parties required to participate in the authorisation process. Their presence in the consent-creation subsystem demonstrates that multi-party consent is incorporated at the point at which the consent contract is constructed rather than being added after authorisation.</w:t>
-      </w:r>
-    </w:p>
-    <w:p>
-      <w:pPr>
-        <w:spacing w:after="160" w:line="300"/>
-        <w:jc w:val="both"/>
-      </w:pPr>
-      <w:r>
-        <w:t xml:space="preserve">Finally, the Start Time and Expiry Time implement temporal constraints on the consent, and the Jurisdiction field records the legal territory (AU in the demonstrated transaction). Consequently, authorisation is not represented as a permanent or universal permission. Instead, the consent has a defined lifecycle and territory and can subsequently be evaluated by the Consent Engine according to both. At this point the consent exists only in the application ledger, in the state PENDING_SIGNATURE; nothing is written to the blockchain until the guardians have approved.</w:t>
-      </w:r>
-    </w:p>
-    <w:p>
-      <w:pPr>
-        <w:spacing w:after="160" w:line="300"/>
-        <w:jc w:val="both"/>
-      </w:pPr>
-      <w:r>
-        <w:t xml:space="preserve">Two consent lifecycles appear in the demonstration and should be distinguished. The evaluated consent, f050c29a, was carried through the complete lifecycle — activation as </w:t>
-      </w:r>
-      <w:r>
-        <w:rPr>
-          <w:b/>
-          <w:bCs/>
-        </w:rPr>
-        <w:t xml:space="preserve">token #1</w:t>
-      </w:r>
-      <w:r>
-        <w:t xml:space="preserve">, granted access, refused access and final revocation — and all transaction evidence in this chapter follows it. Because a revoked consent cannot be photographed in its earlier states, the screenshots of consent creation, guardian approval and granted access were captured from a second, identical lifecycle (consent 04da25f5, anchored as </w:t>
-      </w:r>
-      <w:r>
-        <w:rPr>
-          <w:b/>
-          <w:bCs/>
-        </w:rPr>
-        <w:t xml:space="preserve">token #2</w:t>
-      </w:r>
-      <w:r>
-        <w:t xml:space="preserve"> in block 11,771,581). The two lifecycles were executed with the same code and the same contract.</w:t>
-      </w:r>
-    </w:p>
-    <w:p>
-      <w:pPr>
-        <w:spacing w:after="160" w:line="300"/>
-        <w:jc w:val="both"/>
-      </w:pPr>
-      <w:r>
-        <w:t xml:space="preserve">From a system perspective, this module therefore corresponds primarily to </w:t>
-      </w:r>
-      <w:r>
-        <w:rPr>
-          <w:b/>
-          <w:bCs/>
-        </w:rPr>
-        <w:t xml:space="preserve">Consent Object Construction and Patient Initiation</w:t>
-      </w:r>
-      <w:r>
-        <w:t xml:space="preserve">.</w:t>
-      </w:r>
-    </w:p>
-    <w:p>
-      <w:pPr>
-        <w:pStyle w:val="Heading1"/>
-        <w:spacing w:after="160" w:before="320"/>
-      </w:pPr>
-      <w:r>
-        <w:t xml:space="preserve">3. Guardian Cryptographic Approval</w:t>
-      </w:r>
-    </w:p>
-    <w:p>
-      <w:pPr>
-        <w:spacing w:after="160" w:line="300"/>
-        <w:jc w:val="both"/>
-      </w:pPr>
-      <w:r>
-        <w:t xml:space="preserve">The second part is the Guardian Cryptographic Approval. As shown in the figure below, it operationalises the multi-party authorisation component of the proposed framework.</w:t>
+        <w:t xml:space="preserve">The deployed contract on Sepolia Etherscan, with the creator wallet, the MedicalConsent (CONSENT) token tracker and the first mint transaction.</w:t>
+      </w:r>
+    </w:p>
+    <w:p>
+      <w:pPr>
+        <w:spacing w:after="160" w:line="300"/>
+        <w:jc w:val="left"/>
+      </w:pPr>
+      <w:r>
+        <w:t xml:space="preserve">As shown in the figure above, the deployed contract is publicly listed at </w:t>
+      </w:r>
+      <w:hyperlink w:history="1" r:id="rId8qpsog-hxfpu3rxv-tu5w">
+        <w:r>
+          <w:rPr>
+            <w:rStyle w:val="Hyperlink"/>
+          </w:rPr>
+          <w:t xml:space="preserve">0x0EC3617581DEC63A7f2bb162DC14d088916ADc73</w:t>
+        </w:r>
+      </w:hyperlink>
+      <w:r>
+        <w:t xml:space="preserve"> together with its creator wallet and the token tracker MedicalConsent (CONSENT). Consequently, the existence of the consent registry itself, and every activation or revocation recorded on it, can be inspected independently of the HALAH application.</w:t>
+      </w:r>
+    </w:p>
+    <w:p>
+      <w:pPr>
+        <w:spacing w:after="160" w:line="300"/>
+        <w:jc w:val="both"/>
+      </w:pPr>
+      <w:r>
+        <w:t xml:space="preserve">The application itself was run in GitHub Codespaces, a browser-based execution environment. Before the demonstration, a readiness check was executed, which confirmed the network (Sepolia, chainId 11155111), the signer balance, the presence of contract code at the configured address, and the signer's ownership of the contract; its full output is preserved in the deployment record in the project evidence.</w:t>
       </w:r>
     </w:p>
     <w:p>
@@ -637,9 +483,9 @@
       <w:r>
         <w:drawing>
           <wp:inline distT="0" distB="0" distL="0" distR="0">
-            <wp:extent cx="5334000" cy="3133725"/>
+            <wp:extent cx="4381500" cy="1057275"/>
             <wp:effectExtent t="0" r="0" b="0" l="0"/>
-            <wp:docPr id="1" name="M2" descr="The guardian subsystem at the moment of the second approval: the EIP-712 signature is verified, the 2/2 threshold is reached, the SBT is minted in the local ledger and the Sepolia anchoring starts in the background." title="Figure 5"/>
+            <wp:docPr id="1" name="g_ready" descr="The final verdict of the Sepolia readiness check executed in GitHub Codespaces before the demonstration: READY." title="Figure 5"/>
             <wp:cNvGraphicFramePr>
               <a:graphicFrameLocks xmlns:a="http://schemas.openxmlformats.org/drawingml/2006/main" noChangeAspect="1"/>
             </wp:cNvGraphicFramePr>
@@ -662,7 +508,7 @@
                   <pic:spPr bwMode="auto">
                     <a:xfrm>
                       <a:off x="0" y="0"/>
-                      <a:ext cx="5334000" cy="3133725"/>
+                      <a:ext cx="4381500" cy="1057275"/>
                     </a:xfrm>
                     <a:prstGeom prst="rect">
                       <a:avLst/>
@@ -698,43 +544,43 @@
           <w:sz w:val="19"/>
           <w:szCs w:val="19"/>
         </w:rPr>
-        <w:t xml:space="preserve">The guardian subsystem at the moment of the second approval: the EIP-712 signature is verified, the 2/2 threshold is reached, the SBT is minted in the local ledger and the Sepolia anchoring starts in the background.</w:t>
-      </w:r>
-    </w:p>
-    <w:p>
-      <w:pPr>
-        <w:spacing w:after="160" w:line="300"/>
-        <w:jc w:val="both"/>
-      </w:pPr>
-      <w:r>
-        <w:t xml:space="preserve">As shown in the figure above, the guardian first enters the target Consent ID, after which the system retrieves the corresponding active transaction and displays the associated patient DID. The guardian then selects their own guardian DID identity and approves the consent with an EIP-712 typed-data signature, which binds the approval to this specific consent, this guardian and this network (chainId 11155111). The system verifies each signature by recovering the signer address and comparing it with the address associated with that guardian DID. A signature produced for another consent, another guardian or another chain is rejected, and the interface refuses a second signature from the same guardian.</w:t>
-      </w:r>
-    </w:p>
-    <w:p>
-      <w:pPr>
-        <w:spacing w:after="160" w:line="300"/>
-        <w:jc w:val="both"/>
-      </w:pPr>
-      <w:r>
-        <w:t xml:space="preserve">The subsystem subsequently reports:</w:t>
-      </w:r>
-    </w:p>
-    <w:p>
-      <w:pPr>
-        <w:spacing w:after="160" w:line="300"/>
-        <w:jc w:val="center"/>
-      </w:pPr>
-      <w:r>
-        <w:t xml:space="preserve">EIP-712 signature verified (signer 0x39B12b87…). Multi-sig: 2/2</w:t>
-      </w:r>
-    </w:p>
-    <w:p>
-      <w:pPr>
-        <w:spacing w:after="160" w:line="300"/>
-        <w:jc w:val="both"/>
-      </w:pPr>
-      <w:r>
-        <w:t xml:space="preserve">This is an important implementation-level demonstration because the consent is not activated merely because the patient created it. Instead, the system requires the predefined guardian approval condition to be satisfied. The implementation therefore enforces the logical authorisation rule:</w:t>
+        <w:t xml:space="preserve">The final verdict of the Sepolia readiness check executed in GitHub Codespaces before the demonstration: READY.</w:t>
+      </w:r>
+    </w:p>
+    <w:p>
+      <w:pPr>
+        <w:spacing w:after="160" w:line="300"/>
+        <w:jc w:val="both"/>
+      </w:pPr>
+      <w:r>
+        <w:t xml:space="preserve">As shown in the figure above, the check reports READY, so every subsequent step of the demonstration operates against the live contract. The subsystem therefore serves as the entry point for demonstrating the complete authorisation process rather than functioning merely as a conventional patient-record application.</w:t>
+      </w:r>
+    </w:p>
+    <w:p>
+      <w:pPr>
+        <w:pStyle w:val="Heading1"/>
+        <w:spacing w:after="160" w:before="320"/>
+      </w:pPr>
+      <w:r>
+        <w:t xml:space="preserve">2. Create Smart Consent Contract: Patient Subsystem</w:t>
+      </w:r>
+    </w:p>
+    <w:p>
+      <w:pPr>
+        <w:spacing w:after="160" w:line="300"/>
+        <w:jc w:val="both"/>
+      </w:pPr>
+      <w:r>
+        <w:t xml:space="preserve">The first functional subsystem is the Create Smart Consent Contract module. This module represents the patient-side initiation of a consent transaction and corresponds directly to the construction of the proposed consent object.</w:t>
+      </w:r>
+    </w:p>
+    <w:p>
+      <w:pPr>
+        <w:spacing w:after="160" w:line="300"/>
+        <w:jc w:val="both"/>
+      </w:pPr>
+      <w:r>
+        <w:t xml:space="preserve">The subsystem requires the patient to specify the Patient DID, Authorised Doctor DID, Data Access Scope, Designated Guardian DIDs, the Jurisdiction, and the temporal validity of the consent. These fields collectively operationalise the proposed consent representation:</w:t>
       </w:r>
     </w:p>
     <w:p>
@@ -750,41 +596,16 @@
           <w:sz w:val="22"/>
           <w:szCs w:val="22"/>
         </w:rPr>
-        <w:t xml:space="preserve">ALLOW = VI ∧ VA ∧ VP ∧ VT ∧ VL</w:t>
-      </w:r>
-    </w:p>
-    <w:p>
-      <w:pPr>
-        <w:spacing w:after="160" w:line="300"/>
-        <w:jc w:val="both"/>
-      </w:pPr>
-      <w:r>
-        <w:t xml:space="preserve">where identity verification, authorisation verification, purpose verification, temporal verification and jurisdictional verification must all be satisfied before access can be granted. For the demonstrated two-guardian configuration, the approval process can also be represented as:</w:t>
-      </w:r>
-    </w:p>
-    <w:p>
-      <w:pPr>
-        <w:spacing w:after="160" w:before="60"/>
-        <w:jc w:val="center"/>
-      </w:pPr>
-      <w:r>
-        <w:rPr>
-          <w:rFonts w:ascii="Cambria Math" w:cs="Cambria Math" w:eastAsia="Cambria Math" w:hAnsi="Cambria Math"/>
-          <w:i/>
-          <w:iCs/>
-          <w:sz w:val="22"/>
-          <w:szCs w:val="22"/>
-        </w:rPr>
-        <w:t xml:space="preserve">Σ g∈G  Sign(g, C)  ≥  |G| = 2</w:t>
-      </w:r>
-    </w:p>
-    <w:p>
-      <w:pPr>
-        <w:spacing w:after="160" w:line="300"/>
-        <w:jc w:val="both"/>
-      </w:pPr>
-      <w:r>
-        <w:t xml:space="preserve">where G represents the designated guardians and every listed guardian must provide a valid signature for activation. Once the required signatures have been obtained, the subsystem displays SBT MINTED together with the Soulbound Token identifier, and a background job submits the mint transaction to Sepolia. When the guardian later re-enters the Consent ID, the subsystem reports Already anchored on Sepolia together with the on-chain token number (token #2 for the photographed lifecycle, token #1 for the evaluated consent).</w:t>
+        <w:t xml:space="preserve">C = (I, A, P, T, L, E)</w:t>
+      </w:r>
+    </w:p>
+    <w:p>
+      <w:pPr>
+        <w:spacing w:after="160" w:line="300"/>
+        <w:jc w:val="both"/>
+      </w:pPr>
+      <w:r>
+        <w:t xml:space="preserve">where the identity of the patient is represented through a DID, the authorised actor is explicitly specified, the permitted data scope is constrained to selected EMR modules, the temporal fields define when the authorisation becomes valid and when it expires, the jurisdiction field constrains where the consent may be exercised, and the enforcement state records whether the consent is active or revoked.</w:t>
       </w:r>
     </w:p>
     <w:p>
@@ -796,9 +617,9 @@
       <w:r>
         <w:drawing>
           <wp:inline distT="0" distB="0" distL="0" distR="0">
-            <wp:extent cx="5143500" cy="1828800"/>
+            <wp:extent cx="5334000" cy="3943350"/>
             <wp:effectExtent t="0" r="0" b="0" l="0"/>
-            <wp:docPr id="1" name="M2b" descr="The guardian subsystem revisited after the background job has completed: 'Already anchored on Sepolia - token #2'." title="Figure 6"/>
+            <wp:docPr id="1" name="M1" descr="The patient subsystem after consent creation: four EMR modules, two designated guardians, jurisdiction AU, and the state PENDING_SIGNATURE." title="Figure 6"/>
             <wp:cNvGraphicFramePr>
               <a:graphicFrameLocks xmlns:a="http://schemas.openxmlformats.org/drawingml/2006/main" noChangeAspect="1"/>
             </wp:cNvGraphicFramePr>
@@ -821,7 +642,7 @@
                   <pic:spPr bwMode="auto">
                     <a:xfrm>
                       <a:off x="0" y="0"/>
-                      <a:ext cx="5143500" cy="1828800"/>
+                      <a:ext cx="5334000" cy="3943350"/>
                     </a:xfrm>
                     <a:prstGeom prst="rect">
                       <a:avLst/>
@@ -857,16 +678,109 @@
           <w:sz w:val="19"/>
           <w:szCs w:val="19"/>
         </w:rPr>
-        <w:t xml:space="preserve">The guardian subsystem revisited after the background job has completed: 'Already anchored on Sepolia - token #2'.</w:t>
-      </w:r>
-    </w:p>
-    <w:p>
-      <w:pPr>
-        <w:spacing w:after="160" w:line="300"/>
-        <w:jc w:val="both"/>
-      </w:pPr>
-      <w:r>
-        <w:t xml:space="preserve">As shown in the figure above, the anchored state persists across sessions and navigation, because it is read back from the ledger rather than from the page. This provides a visible representation of the transition from a pending consent transaction to an activated, publicly recorded consent state. The SBT therefore functions in the implementation as a persistent cryptographic representation of the completed consent authorisation rather than as a transferable asset.</w:t>
+        <w:t xml:space="preserve">The patient subsystem after consent creation: four EMR modules, two designated guardians, jurisdiction AU, and the state PENDING_SIGNATURE.</w:t>
+      </w:r>
+    </w:p>
+    <w:p>
+      <w:pPr>
+        <w:spacing w:after="160" w:line="300"/>
+        <w:jc w:val="both"/>
+      </w:pPr>
+      <w:r>
+        <w:t xml:space="preserve">As shown in the figure above, the Patient DID provides the identity pointer for the data subject, while the Authorised Doctor DID limits the intended healthcare recipient. This is important because the implementation does not represent consent as a general permission to access a patient's medical information. Instead, the authorisation is bound to a specific identity and therefore supports subject-specific and actor-specific access control.</w:t>
+      </w:r>
+    </w:p>
+    <w:p>
+      <w:pPr>
+        <w:spacing w:after="160" w:line="300"/>
+        <w:jc w:val="both"/>
+      </w:pPr>
+      <w:r>
+        <w:t xml:space="preserve">The Data Access Scope is particularly important to the proposed framework. Instead of granting access to the complete EMR, the patient selects particular modules; in the demonstrated transaction all four modules (Observation, Medication, Condition and Procedure) were selected. This implements the principle of purpose- and scope-limited consent and corresponds to the P component of the consent object. The implementation additionally validates the input before the consent is stored: a consent with an empty data scope is rejected, and every guardian entry must be a well-formed DID.</w:t>
+      </w:r>
+    </w:p>
+    <w:p>
+      <w:pPr>
+        <w:spacing w:after="160" w:line="300"/>
+        <w:jc w:val="both"/>
+      </w:pPr>
+      <w:r>
+        <w:t xml:space="preserve">The Designated Guardian DIDs establish the additional parties required to participate in the authorisation process. Their presence in the consent-creation subsystem demonstrates that multi-party consent is incorporated at the point at which the consent contract is constructed rather than being added after authorisation.</w:t>
+      </w:r>
+    </w:p>
+    <w:p>
+      <w:pPr>
+        <w:spacing w:after="160" w:line="300"/>
+        <w:jc w:val="both"/>
+      </w:pPr>
+      <w:r>
+        <w:t xml:space="preserve">Finally, the Start Time and Expiry Time implement temporal constraints on the consent, and the Jurisdiction field records the legal territory (AU in the demonstrated transaction). Consequently, authorisation is not represented as a permanent or universal permission. Instead, the consent has a defined lifecycle and territory and can subsequently be evaluated by the Consent Engine according to both. At this point the consent exists only in the application ledger, in the state PENDING_SIGNATURE; nothing is written to the blockchain until the guardians have approved.</w:t>
+      </w:r>
+    </w:p>
+    <w:p>
+      <w:pPr>
+        <w:spacing w:after="160" w:line="300"/>
+        <w:jc w:val="both"/>
+      </w:pPr>
+      <w:r>
+        <w:t xml:space="preserve">Two consent lifecycles appear in the demonstration and should be distinguished. The evaluated consent, f050c29a, was carried through the complete lifecycle — activation as </w:t>
+      </w:r>
+      <w:r>
+        <w:rPr>
+          <w:b/>
+          <w:bCs/>
+        </w:rPr>
+        <w:t xml:space="preserve">token #1</w:t>
+      </w:r>
+      <w:r>
+        <w:t xml:space="preserve">, granted access, refused access and final revocation — and all transaction evidence in this chapter follows it. Because a revoked consent cannot be photographed in its earlier states, the screenshots of consent creation, guardian approval and granted access were captured from a second lifecycle with the same configuration — the same four-module scope, the same guardians, jurisdiction, purpose and doctor — executed for a different demonstration patient (consent 04da25f5, anchored as </w:t>
+      </w:r>
+      <w:r>
+        <w:rPr>
+          <w:b/>
+          <w:bCs/>
+        </w:rPr>
+        <w:t xml:space="preserve">token #2</w:t>
+      </w:r>
+      <w:r>
+        <w:t xml:space="preserve"> in block 11,771,581). The two lifecycles were executed with the same code and the same contract.</w:t>
+      </w:r>
+    </w:p>
+    <w:p>
+      <w:pPr>
+        <w:spacing w:after="160" w:line="300"/>
+        <w:jc w:val="both"/>
+      </w:pPr>
+      <w:r>
+        <w:t xml:space="preserve">From a system perspective, this module therefore corresponds primarily to </w:t>
+      </w:r>
+      <w:r>
+        <w:rPr>
+          <w:b/>
+          <w:bCs/>
+        </w:rPr>
+        <w:t xml:space="preserve">Consent Object Construction and Patient Initiation</w:t>
+      </w:r>
+      <w:r>
+        <w:t xml:space="preserve">.</w:t>
+      </w:r>
+    </w:p>
+    <w:p>
+      <w:pPr>
+        <w:pStyle w:val="Heading1"/>
+        <w:spacing w:after="160" w:before="320"/>
+      </w:pPr>
+      <w:r>
+        <w:t xml:space="preserve">3. Guardian Cryptographic Approval</w:t>
+      </w:r>
+    </w:p>
+    <w:p>
+      <w:pPr>
+        <w:spacing w:after="160" w:line="300"/>
+        <w:jc w:val="both"/>
+      </w:pPr>
+      <w:r>
+        <w:t xml:space="preserve">The second part is the Guardian Cryptographic Approval. As shown in the figure below, it operationalises the multi-party authorisation component of the proposed framework.</w:t>
       </w:r>
     </w:p>
     <w:p>
@@ -878,9 +792,9 @@
       <w:r>
         <w:drawing>
           <wp:inline distT="0" distB="0" distL="0" distR="0">
-            <wp:extent cx="5905500" cy="4314825"/>
+            <wp:extent cx="5334000" cy="1914525"/>
             <wp:effectExtent t="0" r="0" b="0" l="0"/>
-            <wp:docPr id="1" name="M3" descr="The anchoring transaction of the evaluated consent on Sepolia Etherscan: status Success, block 11,771,243, 'Mint 1 of MedicalConsent' to the pseudonymous patient address (function selector 0x1e1e7c76, mintConsentV3)." title="Figure 7"/>
+            <wp:docPr id="1" name="n_guardA" descr="The guardian subsystem at the first approval: the EIP-712 signature of did:parent:A is verified and the multi-signature count is 1/2." title="Figure 7"/>
             <wp:cNvGraphicFramePr>
               <a:graphicFrameLocks xmlns:a="http://schemas.openxmlformats.org/drawingml/2006/main" noChangeAspect="1"/>
             </wp:cNvGraphicFramePr>
@@ -903,7 +817,7 @@
                   <pic:spPr bwMode="auto">
                     <a:xfrm>
                       <a:off x="0" y="0"/>
-                      <a:ext cx="5905500" cy="4314825"/>
+                      <a:ext cx="5334000" cy="1914525"/>
                     </a:xfrm>
                     <a:prstGeom prst="rect">
                       <a:avLst/>
@@ -939,98 +853,16 @@
           <w:sz w:val="19"/>
           <w:szCs w:val="19"/>
         </w:rPr>
-        <w:t xml:space="preserve">The anchoring transaction of the evaluated consent on Sepolia Etherscan: status Success, block 11,771,243, 'Mint 1 of MedicalConsent' to the pseudonymous patient address (function selector 0x1e1e7c76, mintConsentV3).</w:t>
-      </w:r>
-    </w:p>
-    <w:p>
-      <w:pPr>
-        <w:spacing w:after="160" w:line="300"/>
-        <w:jc w:val="left"/>
-      </w:pPr>
-      <w:r>
-        <w:t xml:space="preserve">As shown in the figure above, the anchoring of the evaluated consent (token #1) is an ordinary, publicly verifiable transaction: Etherscan reports the status Success, the block number 11,771,243, the transaction fee, and the transfer of one MedicalConsent token to the pseudonymous patient address derived from the patient DID. The transaction can be inspected at </w:t>
-      </w:r>
-      <w:hyperlink w:history="1" r:id="rId45w1kvfjapxsmu-xfl9bc">
-        <w:r>
-          <w:rPr>
-            <w:rStyle w:val="Hyperlink"/>
-          </w:rPr>
-          <w:t xml:space="preserve">Etherscan: mint transaction</w:t>
-        </w:r>
-      </w:hyperlink>
-      <w:r>
-        <w:t xml:space="preserve">. This provides an implementation-level demonstration that consent activation can be verified independently of the application.</w:t>
-      </w:r>
-    </w:p>
-    <w:p>
-      <w:pPr>
-        <w:spacing w:after="160" w:line="300"/>
-        <w:jc w:val="both"/>
-      </w:pPr>
-      <w:r>
-        <w:t xml:space="preserve">The guardian subsystem consequently corresponds to </w:t>
-      </w:r>
-      <w:r>
-        <w:rPr>
-          <w:b/>
-          <w:bCs/>
-        </w:rPr>
-        <w:t xml:space="preserve">Multi-Party Approval, Cryptographic Verification and Consent Activation</w:t>
-      </w:r>
-      <w:r>
-        <w:t xml:space="preserve"> in the proposed architecture.</w:t>
-      </w:r>
-    </w:p>
-    <w:p>
-      <w:pPr>
-        <w:pStyle w:val="Heading1"/>
-        <w:spacing w:after="160" w:before="320"/>
-      </w:pPr>
-      <w:r>
-        <w:t xml:space="preserve">4. Secure Patient Data Access for Doctor</w:t>
-      </w:r>
-    </w:p>
-    <w:p>
-      <w:pPr>
-        <w:spacing w:after="160" w:line="300"/>
-        <w:jc w:val="both"/>
-      </w:pPr>
-      <w:r>
-        <w:t xml:space="preserve">The third module is the Secure Patient Data Access module and represents the healthcare-provider side of the authorisation process.</w:t>
-      </w:r>
-    </w:p>
-    <w:p>
-      <w:pPr>
-        <w:spacing w:after="160" w:line="300"/>
-        <w:jc w:val="both"/>
-      </w:pPr>
-      <w:r>
-        <w:t xml:space="preserve">The doctor enters an authorised Consent ID, after which the system retrieves and displays the associated consent information. The subsystem shows the patient DID, Consent ID, purpose, and current consent state:</w:t>
-      </w:r>
-    </w:p>
-    <w:p>
-      <w:pPr>
-        <w:spacing w:after="160" w:before="60"/>
-        <w:jc w:val="center"/>
-      </w:pPr>
-      <w:r>
-        <w:rPr>
-          <w:rFonts w:ascii="Cambria Math" w:cs="Cambria Math" w:eastAsia="Cambria Math" w:hAnsi="Cambria Math"/>
-          <w:i/>
-          <w:iCs/>
-          <w:sz w:val="22"/>
-          <w:szCs w:val="22"/>
-        </w:rPr>
-        <w:t xml:space="preserve">State = ACTIVE</w:t>
-      </w:r>
-    </w:p>
-    <w:p>
-      <w:pPr>
-        <w:spacing w:after="160" w:line="300"/>
-        <w:jc w:val="both"/>
-      </w:pPr>
-      <w:r>
-        <w:t xml:space="preserve">This is important because the doctor does not directly access patient data based solely on possession of a Consent ID. The system first evaluates whether the underlying authorisation remains valid, and it does so for every component of the consent object. The decision matrix displayed to the doctor reports the outcome of each check individually.</w:t>
+        <w:t xml:space="preserve">The guardian subsystem at the first approval: the EIP-712 signature of did:parent:A is verified and the multi-signature count is 1/2.</w:t>
+      </w:r>
+    </w:p>
+    <w:p>
+      <w:pPr>
+        <w:spacing w:after="160" w:line="300"/>
+        <w:jc w:val="both"/>
+      </w:pPr>
+      <w:r>
+        <w:t xml:space="preserve">As shown in the figure above, the first guardian (did:parent:A) approves the consent and the subsystem reports EIP-712 signature verified (signer 0x3Af549b0…) with the multi-signature count 1/2. The consent remains pending, because the approval condition has not yet been satisfied. The second guardian then repeats the same procedure.</w:t>
       </w:r>
     </w:p>
     <w:p>
@@ -1042,9 +874,9 @@
       <w:r>
         <w:drawing>
           <wp:inline distT="0" distB="0" distL="0" distR="0">
-            <wp:extent cx="5334000" cy="4200525"/>
+            <wp:extent cx="5334000" cy="3133725"/>
             <wp:effectExtent t="0" r="0" b="0" l="0"/>
-            <wp:docPr id="1" name="g_doc_au" descr="The doctor subsystem with requester jurisdiction AU: all five checks report PASS, ALLOW = PASS, and the consent state is ACTIVE." title="Figure 8"/>
+            <wp:docPr id="1" name="M2" descr="The guardian subsystem at the moment of the second approval: the EIP-712 signature is verified, the 2/2 threshold is reached, the SBT is minted in the local ledger and the Sepolia anchoring starts in the background." title="Figure 8"/>
             <wp:cNvGraphicFramePr>
               <a:graphicFrameLocks xmlns:a="http://schemas.openxmlformats.org/drawingml/2006/main" noChangeAspect="1"/>
             </wp:cNvGraphicFramePr>
@@ -1067,7 +899,7 @@
                   <pic:spPr bwMode="auto">
                     <a:xfrm>
                       <a:off x="0" y="0"/>
-                      <a:ext cx="5334000" cy="4200525"/>
+                      <a:ext cx="5334000" cy="3133725"/>
                     </a:xfrm>
                     <a:prstGeom prst="rect">
                       <a:avLst/>
@@ -1103,16 +935,43 @@
           <w:sz w:val="19"/>
           <w:szCs w:val="19"/>
         </w:rPr>
-        <w:t xml:space="preserve">The doctor subsystem with requester jurisdiction AU: all five checks report PASS, ALLOW = PASS, and the consent state is ACTIVE.</w:t>
-      </w:r>
-    </w:p>
-    <w:p>
-      <w:pPr>
-        <w:spacing w:after="160" w:line="300"/>
-        <w:jc w:val="both"/>
-      </w:pPr>
-      <w:r>
-        <w:t xml:space="preserve">As shown in the figure above, the five checks VI (identity), VA (authorisation), VP (purpose), VT (time) and VL (jurisdiction) all report PASS, and consequently ALLOW = PASS. The subsystem then presents the Authorised Data Scope, showing that only the EMR modules specified in the original consent are available. In the demonstrated transaction, the authorised modules are:</w:t>
+        <w:t xml:space="preserve">The guardian subsystem at the moment of the second approval: the EIP-712 signature is verified, the 2/2 threshold is reached, the SBT is minted in the local ledger and the Sepolia anchoring starts in the background.</w:t>
+      </w:r>
+    </w:p>
+    <w:p>
+      <w:pPr>
+        <w:spacing w:after="160" w:line="300"/>
+        <w:jc w:val="both"/>
+      </w:pPr>
+      <w:r>
+        <w:t xml:space="preserve">As shown in the figure above, the guardian first enters the target Consent ID, after which the system retrieves the corresponding active transaction and displays the associated patient DID. The guardian then selects their own Guardian DID identity and approves the consent with an EIP-712 typed-data signature, which binds the approval to this specific consent, this guardian and this network (chainId 11155111). The system verifies each signature by recovering the signer address and comparing it with the address associated with that guardian DID. A signature produced for another consent, another guardian or another chain is rejected, and the interface refuses a second signature from the same guardian.</w:t>
+      </w:r>
+    </w:p>
+    <w:p>
+      <w:pPr>
+        <w:spacing w:after="160" w:line="300"/>
+        <w:jc w:val="both"/>
+      </w:pPr>
+      <w:r>
+        <w:t xml:space="preserve">The subsystem subsequently reports:</w:t>
+      </w:r>
+    </w:p>
+    <w:p>
+      <w:pPr>
+        <w:spacing w:after="160" w:line="300"/>
+        <w:jc w:val="center"/>
+      </w:pPr>
+      <w:r>
+        <w:t xml:space="preserve">EIP-712 signature verified (signer 0x39B12b87…). Multi-sig: 2/2</w:t>
+      </w:r>
+    </w:p>
+    <w:p>
+      <w:pPr>
+        <w:spacing w:after="160" w:line="300"/>
+        <w:jc w:val="both"/>
+      </w:pPr>
+      <w:r>
+        <w:t xml:space="preserve">This is an important implementation-level demonstration because the consent is not activated merely because the patient created it. Instead, the system requires the predefined guardian approval condition to be satisfied. The implementation therefore enforces the logical authorisation rule:</w:t>
       </w:r>
     </w:p>
     <w:p>
@@ -1128,16 +987,41 @@
           <w:sz w:val="22"/>
           <w:szCs w:val="22"/>
         </w:rPr>
-        <w:t xml:space="preserve">Scope = { Observation, Medication, Condition, Procedure }</w:t>
-      </w:r>
-    </w:p>
-    <w:p>
-      <w:pPr>
-        <w:spacing w:after="160" w:line="300"/>
-        <w:jc w:val="both"/>
-      </w:pPr>
-      <w:r>
-        <w:t xml:space="preserve">The doctor must subsequently select the modules to request; the request must be a non-empty subset of the authorised scope. The system displays the requested modules and performs cryptographic verification before granting access. In this version, the verification also generates and verifies a Groth16 zero-knowledge proof, whose public inputs are a Poseidon commitment and the current time and whose private witnesses are a secret and the expiry time; the proof establishes that the commitment is satisfied and that the current time does not exceed the expiry. Because the prover and the verifier currently run on the same server, the proof demonstrates the integration of the zero-knowledge toolchain rather than an additional privacy guarantee (Section 11). The audit ledger records the proof mode (groth16) with every granted access, and the subsystem then shows the message Cryptographic Verification Successful — Access Granted.</w:t>
+        <w:t xml:space="preserve">ALLOW = VI ∧ VA ∧ VP ∧ VT ∧ VL</w:t>
+      </w:r>
+    </w:p>
+    <w:p>
+      <w:pPr>
+        <w:spacing w:after="160" w:line="300"/>
+        <w:jc w:val="both"/>
+      </w:pPr>
+      <w:r>
+        <w:t xml:space="preserve">where identity verification, authorisation verification, purpose verification, temporal verification and jurisdictional verification must all be satisfied before access can be granted. For the demonstrated two-guardian configuration, the approval process can also be represented as:</w:t>
+      </w:r>
+    </w:p>
+    <w:p>
+      <w:pPr>
+        <w:spacing w:after="160" w:before="60"/>
+        <w:jc w:val="center"/>
+      </w:pPr>
+      <w:r>
+        <w:rPr>
+          <w:rFonts w:ascii="Cambria Math" w:cs="Cambria Math" w:eastAsia="Cambria Math" w:hAnsi="Cambria Math"/>
+          <w:i/>
+          <w:iCs/>
+          <w:sz w:val="22"/>
+          <w:szCs w:val="22"/>
+        </w:rPr>
+        <w:t xml:space="preserve">Σ g∈G  Sign(g, C)  ≥  |G| = 2</w:t>
+      </w:r>
+    </w:p>
+    <w:p>
+      <w:pPr>
+        <w:spacing w:after="160" w:line="300"/>
+        <w:jc w:val="both"/>
+      </w:pPr>
+      <w:r>
+        <w:t xml:space="preserve">where G represents the designated guardians and every listed guardian must provide a valid signature for activation. Once the required signatures have been obtained, the subsystem displays SBT MINTED together with the Soulbound Token identifier, and a background job submits the mint transaction to Sepolia. While the background job is running, the subsystem reports the intermediate state explicitly.</w:t>
       </w:r>
     </w:p>
     <w:p>
@@ -1149,9 +1033,9 @@
       <w:r>
         <w:drawing>
           <wp:inline distT="0" distB="0" distL="0" distR="0">
-            <wp:extent cx="5334000" cy="6229350"/>
+            <wp:extent cx="5334000" cy="2657475"/>
             <wp:effectExtent t="0" r="0" b="0" l="0"/>
-            <wp:docPr id="1" name="M4" descr="The doctor subsystem after verification: access granted and the authorised medical records displayed per EMR module (the Observation and Medication modules are visible), each with a Download CSV control." title="Figure 9"/>
+            <wp:docPr id="1" name="n_anchoring" descr="The guardian subsystem while the mint transaction is pending: the 2/2 threshold is reached but not yet anchored, the anchoring runs in the background, and a repeated signature from the same guardian is refused." title="Figure 9"/>
             <wp:cNvGraphicFramePr>
               <a:graphicFrameLocks xmlns:a="http://schemas.openxmlformats.org/drawingml/2006/main" noChangeAspect="1"/>
             </wp:cNvGraphicFramePr>
@@ -1174,7 +1058,7 @@
                   <pic:spPr bwMode="auto">
                     <a:xfrm>
                       <a:off x="0" y="0"/>
-                      <a:ext cx="5334000" cy="6229350"/>
+                      <a:ext cx="5334000" cy="2657475"/>
                     </a:xfrm>
                     <a:prstGeom prst="rect">
                       <a:avLst/>
@@ -1210,7 +1094,16 @@
           <w:sz w:val="19"/>
           <w:szCs w:val="19"/>
         </w:rPr>
-        <w:t xml:space="preserve">The doctor subsystem after verification: access granted and the authorised medical records displayed per EMR module (the Observation and Medication modules are visible), each with a Download CSV control.</w:t>
+        <w:t xml:space="preserve">The guardian subsystem while the mint transaction is pending: the 2/2 threshold is reached but not yet anchored, the anchoring runs in the background, and a repeated signature from the same guardian is refused.</w:t>
+      </w:r>
+    </w:p>
+    <w:p>
+      <w:pPr>
+        <w:spacing w:after="160" w:line="300"/>
+        <w:jc w:val="both"/>
+      </w:pPr>
+      <w:r>
+        <w:t xml:space="preserve">As shown in the figure above, the subsystem reports that the threshold has been reached but the consent is not yet anchored, offers a manual synchronisation with the chain, and refuses a second signature from the same guardian. This is important because the one-signature-per-guardian rule prevents a single guardian from satisfying the multi-signature threshold alone. When the guardian later re-enters the Consent ID, the subsystem reports Already anchored on Sepolia together with the on-chain token number (token #2 for the photographed lifecycle, token #1 for the evaluated consent).</w:t>
       </w:r>
     </w:p>
     <w:p>
@@ -1222,9 +1115,9 @@
       <w:r>
         <w:drawing>
           <wp:inline distT="0" distB="0" distL="0" distR="0">
-            <wp:extent cx="5143500" cy="4314825"/>
+            <wp:extent cx="5143500" cy="1828800"/>
             <wp:effectExtent t="0" r="0" b="0" l="0"/>
-            <wp:docPr id="1" name="M4b" descr="The remaining authorised modules of the same request: the Condition and Procedure records, each with its own export control." title="Figure 10"/>
+            <wp:docPr id="1" name="M2b" descr="The guardian subsystem revisited after the background job has completed: 'Already anchored on Sepolia - token #2'." title="Figure 10"/>
             <wp:cNvGraphicFramePr>
               <a:graphicFrameLocks xmlns:a="http://schemas.openxmlformats.org/drawingml/2006/main" noChangeAspect="1"/>
             </wp:cNvGraphicFramePr>
@@ -1247,7 +1140,7 @@
                   <pic:spPr bwMode="auto">
                     <a:xfrm>
                       <a:off x="0" y="0"/>
-                      <a:ext cx="5143500" cy="4314825"/>
+                      <a:ext cx="5143500" cy="1828800"/>
                     </a:xfrm>
                     <a:prstGeom prst="rect">
                       <a:avLst/>
@@ -1283,78 +1176,16 @@
           <w:sz w:val="19"/>
           <w:szCs w:val="19"/>
         </w:rPr>
-        <w:t xml:space="preserve">The remaining authorised modules of the same request: the Condition and Procedure records, each with its own export control.</w:t>
-      </w:r>
-    </w:p>
-    <w:p>
-      <w:pPr>
-        <w:spacing w:after="160" w:line="300"/>
-        <w:jc w:val="both"/>
-      </w:pPr>
-      <w:r>
-        <w:t xml:space="preserve">As shown in the two figures above, this demonstrates the transition from consent verification to data-access authorisation; the checks are recorded in the audit ledger as STATE_CHECK events, one for every evaluated access request, so validity is re-established at each request rather than assumed. This distinction is central to the HALAH design. Consent and data access are not treated as identical events. Instead, the flow proceeds as follows:</w:t>
-      </w:r>
-    </w:p>
-    <w:p>
-      <w:pPr>
-        <w:spacing w:after="160" w:before="60"/>
-        <w:jc w:val="center"/>
-      </w:pPr>
-      <w:r>
-        <w:rPr>
-          <w:rFonts w:ascii="Cambria Math" w:cs="Cambria Math" w:eastAsia="Cambria Math" w:hAnsi="Cambria Math"/>
-          <w:i/>
-          <w:iCs/>
-          <w:sz w:val="22"/>
-          <w:szCs w:val="22"/>
-        </w:rPr>
-        <w:t xml:space="preserve">Consent → Verification → AccessDecision</w:t>
-      </w:r>
-    </w:p>
-    <w:p>
-      <w:pPr>
-        <w:spacing w:after="160" w:line="300"/>
-        <w:jc w:val="both"/>
-      </w:pPr>
-      <w:r>
-        <w:t xml:space="preserve">The doctor is therefore authorised only when the requested resources are consistent with the consent object and the consent remains active. The final Authorised Medical Records section presents the actual data modules available to the doctor. Because the subsystem separates the OBSERVATION, MEDICATION, CONDITION and PROCEDURE modules, it provides a direct visual demonstration of fine-grained EMR access control.</w:t>
-      </w:r>
-    </w:p>
-    <w:p>
-      <w:pPr>
-        <w:spacing w:after="160" w:line="300"/>
-        <w:jc w:val="both"/>
-      </w:pPr>
-      <w:r>
-        <w:t xml:space="preserve">Thus, the doctor subsystem corresponds to </w:t>
-      </w:r>
-      <w:r>
-        <w:rPr>
-          <w:b/>
-          <w:bCs/>
-        </w:rPr>
-        <w:t xml:space="preserve">Consent-State Validation, Scope Enforcement and Authorised Data Access</w:t>
-      </w:r>
-      <w:r>
-        <w:t xml:space="preserve">.</w:t>
-      </w:r>
-    </w:p>
-    <w:p>
-      <w:pPr>
-        <w:pStyle w:val="Heading1"/>
-        <w:spacing w:after="160" w:before="320"/>
-      </w:pPr>
-      <w:r>
-        <w:t xml:space="preserve">5. Negative Demonstration: Jurisdiction Violation</w:t>
-      </w:r>
-    </w:p>
-    <w:p>
-      <w:pPr>
-        <w:spacing w:after="160" w:line="300"/>
-        <w:jc w:val="both"/>
-      </w:pPr>
-      <w:r>
-        <w:t xml:space="preserve">The fourth part is the negative demonstration. This is important because a consent framework must be evaluated not only on whether it grants legitimate access, but also on whether it refuses illegitimate access. The same doctor therefore repeated the request for the evaluated consent while declaring the requester jurisdiction as SA, whereas the consent was issued for AU.</w:t>
+        <w:t xml:space="preserve">The guardian subsystem revisited after the background job has completed: 'Already anchored on Sepolia - token #2'.</w:t>
+      </w:r>
+    </w:p>
+    <w:p>
+      <w:pPr>
+        <w:spacing w:after="160" w:line="300"/>
+        <w:jc w:val="both"/>
+      </w:pPr>
+      <w:r>
+        <w:t xml:space="preserve">As shown in the figure above, the anchored state persists across sessions and navigation, because it is read back from the ledger rather than from the page. This provides a visible representation of the transition from a pending consent transaction to an activated, publicly recorded consent state. The SBT therefore functions in the implementation as a persistent cryptographic representation of the completed consent authorisation rather than as a transferable asset.</w:t>
       </w:r>
     </w:p>
     <w:p>
@@ -1366,9 +1197,9 @@
       <w:r>
         <w:drawing>
           <wp:inline distT="0" distB="0" distL="0" distR="0">
-            <wp:extent cx="5334000" cy="4200525"/>
+            <wp:extent cx="5905500" cy="4314825"/>
             <wp:effectExtent t="0" r="0" b="0" l="0"/>
-            <wp:docPr id="1" name="g_doc_sa" descr="The doctor subsystem with requester jurisdiction SA: VL reports FAIL and consequently ALLOW = FAIL, although the consent state remains ACTIVE." title="Figure 11"/>
+            <wp:docPr id="1" name="M3" descr="The anchoring transaction of the evaluated consent on Sepolia Etherscan: status Success, block 11,771,243, 'Mint 1 of MedicalConsent' to the pseudonymous patient address (function selector 0x1e1e7c76, mintConsentV3)." title="Figure 11"/>
             <wp:cNvGraphicFramePr>
               <a:graphicFrameLocks xmlns:a="http://schemas.openxmlformats.org/drawingml/2006/main" noChangeAspect="1"/>
             </wp:cNvGraphicFramePr>
@@ -1391,7 +1222,7 @@
                   <pic:spPr bwMode="auto">
                     <a:xfrm>
                       <a:off x="0" y="0"/>
-                      <a:ext cx="5334000" cy="4200525"/>
+                      <a:ext cx="5905500" cy="4314825"/>
                     </a:xfrm>
                     <a:prstGeom prst="rect">
                       <a:avLst/>
@@ -1427,16 +1258,98 @@
           <w:sz w:val="19"/>
           <w:szCs w:val="19"/>
         </w:rPr>
-        <w:t xml:space="preserve">The doctor subsystem with requester jurisdiction SA: VL reports FAIL and consequently ALLOW = FAIL, although the consent state remains ACTIVE.</w:t>
-      </w:r>
-    </w:p>
-    <w:p>
-      <w:pPr>
-        <w:spacing w:after="160" w:line="300"/>
-        <w:jc w:val="both"/>
-      </w:pPr>
-      <w:r>
-        <w:t xml:space="preserve">As shown in the figure above, the decision matrix immediately reports VL = FAIL and consequently ALLOW = FAIL, even though the consent itself is still ACTIVE, the guardian signatures remain valid and all other checks pass. This is important because it demonstrates that the access decision is taken over the complete consent tuple rather than over the consent state alone.</w:t>
+        <w:t xml:space="preserve">The anchoring transaction of the evaluated consent on Sepolia Etherscan: status Success, block 11,771,243, 'Mint 1 of MedicalConsent' to the pseudonymous patient address (function selector 0x1e1e7c76, mintConsentV3).</w:t>
+      </w:r>
+    </w:p>
+    <w:p>
+      <w:pPr>
+        <w:spacing w:after="160" w:line="300"/>
+        <w:jc w:val="left"/>
+      </w:pPr>
+      <w:r>
+        <w:t xml:space="preserve">As shown in the figure above, the anchoring of the evaluated consent (token #1) is an ordinary, publicly verifiable transaction: Etherscan reports the status Success, the block number 11,771,243, the transaction fee, and the transfer of one MedicalConsent token to the pseudonymous patient address derived from the patient DID. The transaction can be inspected at </w:t>
+      </w:r>
+      <w:hyperlink w:history="1" r:id="rIdjgr4bgi4oaqpm-1yn3ufx">
+        <w:r>
+          <w:rPr>
+            <w:rStyle w:val="Hyperlink"/>
+          </w:rPr>
+          <w:t xml:space="preserve">Etherscan: mint transaction</w:t>
+        </w:r>
+      </w:hyperlink>
+      <w:r>
+        <w:t xml:space="preserve">. This provides an implementation-level demonstration that consent activation can be verified independently of the application.</w:t>
+      </w:r>
+    </w:p>
+    <w:p>
+      <w:pPr>
+        <w:spacing w:after="160" w:line="300"/>
+        <w:jc w:val="both"/>
+      </w:pPr>
+      <w:r>
+        <w:t xml:space="preserve">The guardian subsystem consequently corresponds to </w:t>
+      </w:r>
+      <w:r>
+        <w:rPr>
+          <w:b/>
+          <w:bCs/>
+        </w:rPr>
+        <w:t xml:space="preserve">Multi-Party Approval, Cryptographic Verification and Consent Activation</w:t>
+      </w:r>
+      <w:r>
+        <w:t xml:space="preserve"> in the proposed architecture.</w:t>
+      </w:r>
+    </w:p>
+    <w:p>
+      <w:pPr>
+        <w:pStyle w:val="Heading1"/>
+        <w:spacing w:after="160" w:before="320"/>
+      </w:pPr>
+      <w:r>
+        <w:t xml:space="preserve">4. Secure Patient Data Access for Doctor</w:t>
+      </w:r>
+    </w:p>
+    <w:p>
+      <w:pPr>
+        <w:spacing w:after="160" w:line="300"/>
+        <w:jc w:val="both"/>
+      </w:pPr>
+      <w:r>
+        <w:t xml:space="preserve">The third module is the Secure Patient Data Access module and represents the healthcare-provider side of the authorisation process.</w:t>
+      </w:r>
+    </w:p>
+    <w:p>
+      <w:pPr>
+        <w:spacing w:after="160" w:line="300"/>
+        <w:jc w:val="both"/>
+      </w:pPr>
+      <w:r>
+        <w:t xml:space="preserve">The doctor enters an authorised Consent ID, after which the system retrieves and displays the associated consent information. The subsystem shows the patient DID, Consent ID, purpose, and current consent state:</w:t>
+      </w:r>
+    </w:p>
+    <w:p>
+      <w:pPr>
+        <w:spacing w:after="160" w:before="60"/>
+        <w:jc w:val="center"/>
+      </w:pPr>
+      <w:r>
+        <w:rPr>
+          <w:rFonts w:ascii="Cambria Math" w:cs="Cambria Math" w:eastAsia="Cambria Math" w:hAnsi="Cambria Math"/>
+          <w:i/>
+          <w:iCs/>
+          <w:sz w:val="22"/>
+          <w:szCs w:val="22"/>
+        </w:rPr>
+        <w:t xml:space="preserve">State = ACTIVE</w:t>
+      </w:r>
+    </w:p>
+    <w:p>
+      <w:pPr>
+        <w:spacing w:after="160" w:line="300"/>
+        <w:jc w:val="both"/>
+      </w:pPr>
+      <w:r>
+        <w:t xml:space="preserve">This is important because the doctor does not directly access patient data based solely on possession of a Consent ID. The system first evaluates whether the underlying authorisation remains valid, and it does so for every component of the consent object. The decision matrix displayed to the doctor reports the outcome of each check individually.</w:t>
       </w:r>
     </w:p>
     <w:p>
@@ -1448,9 +1361,9 @@
       <w:r>
         <w:drawing>
           <wp:inline distT="0" distB="0" distL="0" distR="0">
-            <wp:extent cx="5334000" cy="2638425"/>
+            <wp:extent cx="5334000" cy="4200525"/>
             <wp:effectExtent t="0" r="0" b="0" l="0"/>
-            <wp:docPr id="1" name="g_denied" descr="The refused request: 'Security Exception: Access Denied by ZK-Policy. Failed checks: VL'." title="Figure 12"/>
+            <wp:docPr id="1" name="g_doc_au" descr="The doctor subsystem with requester jurisdiction AU (the evaluated consent f050c29a, captured before its revocation): all five checks report PASS, ALLOW = PASS, and the consent state is ACTIVE." title="Figure 12"/>
             <wp:cNvGraphicFramePr>
               <a:graphicFrameLocks xmlns:a="http://schemas.openxmlformats.org/drawingml/2006/main" noChangeAspect="1"/>
             </wp:cNvGraphicFramePr>
@@ -1473,7 +1386,7 @@
                   <pic:spPr bwMode="auto">
                     <a:xfrm>
                       <a:off x="0" y="0"/>
-                      <a:ext cx="5334000" cy="2638425"/>
+                      <a:ext cx="5334000" cy="4200525"/>
                     </a:xfrm>
                     <a:prstGeom prst="rect">
                       <a:avLst/>
@@ -1509,53 +1422,41 @@
           <w:sz w:val="19"/>
           <w:szCs w:val="19"/>
         </w:rPr>
-        <w:t xml:space="preserve">The refused request: 'Security Exception: Access Denied by ZK-Policy. Failed checks: VL'.</w:t>
-      </w:r>
-    </w:p>
-    <w:p>
-      <w:pPr>
-        <w:spacing w:after="160" w:line="300"/>
-        <w:jc w:val="both"/>
-      </w:pPr>
-      <w:r>
-        <w:t xml:space="preserve">As shown in the figure above, when the doctor submits the request, access is refused and the failed check is named explicitly. The corresponding audit-ledger entry records the result DENIED together with the complete decision matrix, so that the refusal is itself auditable. This is important because the jurisdiction check is included in the access decision rather than merely displayed.</w:t>
-      </w:r>
-    </w:p>
-    <w:p>
-      <w:pPr>
-        <w:spacing w:after="160" w:line="300"/>
-        <w:jc w:val="both"/>
-      </w:pPr>
-      <w:r>
-        <w:t xml:space="preserve">This demonstration corresponds to </w:t>
-      </w:r>
-      <w:r>
-        <w:rPr>
-          <w:b/>
-          <w:bCs/>
-        </w:rPr>
-        <w:t xml:space="preserve">Jurisdictional Constraint Enforcement and Fail-Closed Access Control</w:t>
-      </w:r>
-      <w:r>
-        <w:t xml:space="preserve">.</w:t>
-      </w:r>
-    </w:p>
-    <w:p>
-      <w:pPr>
-        <w:pStyle w:val="Heading1"/>
-        <w:spacing w:after="160" w:before="320"/>
-      </w:pPr>
-      <w:r>
-        <w:t xml:space="preserve">6. Consent Revocation</w:t>
-      </w:r>
-    </w:p>
-    <w:p>
-      <w:pPr>
-        <w:spacing w:after="160" w:line="300"/>
-        <w:jc w:val="both"/>
-      </w:pPr>
-      <w:r>
-        <w:t xml:space="preserve">The next module is the Consent Revocation module. This module operationalises the enforcement component of the consent object, which requires that a patient can withdraw consent and that the withdrawal takes effect for every subsequent request. In the patient's My Consents view, each consent is listed with its state, signature count and token. The patient then selects Revoke, after which the system updates the application state and submits a revoke transaction to the contract on Sepolia.</w:t>
+        <w:t xml:space="preserve">The doctor subsystem with requester jurisdiction AU (the evaluated consent f050c29a, captured before its revocation): all five checks report PASS, ALLOW = PASS, and the consent state is ACTIVE.</w:t>
+      </w:r>
+    </w:p>
+    <w:p>
+      <w:pPr>
+        <w:spacing w:after="160" w:line="300"/>
+        <w:jc w:val="both"/>
+      </w:pPr>
+      <w:r>
+        <w:t xml:space="preserve">As shown in the figure above, the five checks VI (identity), VA (authorisation), VP (purpose), VT (time) and VL (jurisdiction) all report PASS, and consequently ALLOW = PASS. The subsystem then presents the Authorised Data Scope, showing that only the EMR modules specified in the original consent are available. In the demonstrated transaction, the authorised modules are:</w:t>
+      </w:r>
+    </w:p>
+    <w:p>
+      <w:pPr>
+        <w:spacing w:after="160" w:before="60"/>
+        <w:jc w:val="center"/>
+      </w:pPr>
+      <w:r>
+        <w:rPr>
+          <w:rFonts w:ascii="Cambria Math" w:cs="Cambria Math" w:eastAsia="Cambria Math" w:hAnsi="Cambria Math"/>
+          <w:i/>
+          <w:iCs/>
+          <w:sz w:val="22"/>
+          <w:szCs w:val="22"/>
+        </w:rPr>
+        <w:t xml:space="preserve">Scope = { Observation, Medication, Condition, Procedure }</w:t>
+      </w:r>
+    </w:p>
+    <w:p>
+      <w:pPr>
+        <w:spacing w:after="160" w:line="300"/>
+        <w:jc w:val="both"/>
+      </w:pPr>
+      <w:r>
+        <w:t xml:space="preserve">The doctor must subsequently select the modules to request; the request must be a non-empty subset of the authorised scope. The system displays the requested modules and performs cryptographic verification before granting access. In this version, the verification also generates and verifies a Groth16 zero-knowledge proof, whose public inputs are a Poseidon commitment and the current time, and whose private witnesses are a secret and the expiry time; the proof establishes that the commitment is satisfied and that the current time does not exceed the expiry. Because the prover and the verifier currently run on the same server, the proof demonstrates the integration of the zero-knowledge toolchain rather than an additional privacy guarantee (Section 11). The audit ledger records the proof mode (groth16) with every access granted in the demonstrated lifecycles, and the subsystem then shows the message Cryptographic Verification Successful — Access Granted.</w:t>
       </w:r>
     </w:p>
     <w:p>
@@ -1567,9 +1468,9 @@
       <w:r>
         <w:drawing>
           <wp:inline distT="0" distB="0" distL="0" distR="0">
-            <wp:extent cx="5143500" cy="3714750"/>
+            <wp:extent cx="5334000" cy="6229350"/>
             <wp:effectExtent t="0" r="0" b="0" l="0"/>
-            <wp:docPr id="1" name="g_revoking" descr="The patient subsystem during revocation: 'Revoking on Sepolia - waiting for block confirmation…'." title="Figure 13"/>
+            <wp:docPr id="1" name="M4" descr="The doctor subsystem after verification (the photographed lifecycle 04da25f5, per Section 2): access granted and the authorised medical records displayed per EMR module; the Observation module's Download CSV control is visible." title="Figure 13"/>
             <wp:cNvGraphicFramePr>
               <a:graphicFrameLocks xmlns:a="http://schemas.openxmlformats.org/drawingml/2006/main" noChangeAspect="1"/>
             </wp:cNvGraphicFramePr>
@@ -1592,7 +1493,7 @@
                   <pic:spPr bwMode="auto">
                     <a:xfrm>
                       <a:off x="0" y="0"/>
-                      <a:ext cx="5143500" cy="3714750"/>
+                      <a:ext cx="5334000" cy="6229350"/>
                     </a:xfrm>
                     <a:prstGeom prst="rect">
                       <a:avLst/>
@@ -1628,16 +1529,7 @@
           <w:sz w:val="19"/>
           <w:szCs w:val="19"/>
         </w:rPr>
-        <w:t xml:space="preserve">The patient subsystem during revocation: 'Revoking on Sepolia - waiting for block confirmation…'.</w:t>
-      </w:r>
-    </w:p>
-    <w:p>
-      <w:pPr>
-        <w:spacing w:after="160" w:line="300"/>
-        <w:jc w:val="both"/>
-      </w:pPr>
-      <w:r>
-        <w:t xml:space="preserve">As shown in the figure above, the withdrawal is submitted as a blockchain transaction and the subsystem waits for the block confirmation before reporting the final state.</w:t>
+        <w:t xml:space="preserve">The doctor subsystem after verification (the photographed lifecycle 04da25f5, per Section 2): access granted and the authorised medical records displayed per EMR module; the Observation module's Download CSV control is visible.</w:t>
       </w:r>
     </w:p>
     <w:p>
@@ -1649,9 +1541,9 @@
       <w:r>
         <w:drawing>
           <wp:inline distT="0" distB="0" distL="0" distR="0">
-            <wp:extent cx="5334000" cy="3533775"/>
+            <wp:extent cx="5143500" cy="4314825"/>
             <wp:effectExtent t="0" r="0" b="0" l="0"/>
-            <wp:docPr id="1" name="g_revoked" descr="The patient subsystem after revocation: the evaluated consent f050c29a is REVOKED with token #1 (displayed as SBT-1). The other rows are earlier trial consents." title="Figure 14"/>
+            <wp:docPr id="1" name="M4b" descr="The remaining authorised modules of the same request: the Condition and Procedure records, with the Condition module's export control visible." title="Figure 14"/>
             <wp:cNvGraphicFramePr>
               <a:graphicFrameLocks xmlns:a="http://schemas.openxmlformats.org/drawingml/2006/main" noChangeAspect="1"/>
             </wp:cNvGraphicFramePr>
@@ -1674,7 +1566,7 @@
                   <pic:spPr bwMode="auto">
                     <a:xfrm>
                       <a:off x="0" y="0"/>
-                      <a:ext cx="5334000" cy="3533775"/>
+                      <a:ext cx="5143500" cy="4314825"/>
                     </a:xfrm>
                     <a:prstGeom prst="rect">
                       <a:avLst/>
@@ -1710,16 +1602,78 @@
           <w:sz w:val="19"/>
           <w:szCs w:val="19"/>
         </w:rPr>
-        <w:t xml:space="preserve">The patient subsystem after revocation: the evaluated consent f050c29a is REVOKED with token #1 (displayed as SBT-1). The other rows are earlier trial consents.</w:t>
-      </w:r>
-    </w:p>
-    <w:p>
-      <w:pPr>
-        <w:spacing w:after="160" w:line="300"/>
-        <w:jc w:val="both"/>
-      </w:pPr>
-      <w:r>
-        <w:t xml:space="preserve">As shown in the figure above, the revoked consent is displayed as REVOKED together with its on-chain token number. The revocation was confirmed on Sepolia in block 11,771,307, and from that point the contract itself reports the token as no longer valid, so any verifier that reads the chain observes the withdrawal.</w:t>
+        <w:t xml:space="preserve">The remaining authorised modules of the same request: the Condition and Procedure records, with the Condition module's export control visible.</w:t>
+      </w:r>
+    </w:p>
+    <w:p>
+      <w:pPr>
+        <w:spacing w:after="160" w:line="300"/>
+        <w:jc w:val="both"/>
+      </w:pPr>
+      <w:r>
+        <w:t xml:space="preserve">The two figures above demonstrate the transition from consent verification to data-access authorisation; the checks are recorded in the audit ledger as STATE_CHECK events, one for every evaluated access request, so validity is re-established at each request rather than assumed. This distinction is central to the HALAH design. Consent and data access are not treated as identical events. Instead, the flow proceeds as follows:</w:t>
+      </w:r>
+    </w:p>
+    <w:p>
+      <w:pPr>
+        <w:spacing w:after="160" w:before="60"/>
+        <w:jc w:val="center"/>
+      </w:pPr>
+      <w:r>
+        <w:rPr>
+          <w:rFonts w:ascii="Cambria Math" w:cs="Cambria Math" w:eastAsia="Cambria Math" w:hAnsi="Cambria Math"/>
+          <w:i/>
+          <w:iCs/>
+          <w:sz w:val="22"/>
+          <w:szCs w:val="22"/>
+        </w:rPr>
+        <w:t xml:space="preserve">Consent → Verification → AccessDecision</w:t>
+      </w:r>
+    </w:p>
+    <w:p>
+      <w:pPr>
+        <w:spacing w:after="160" w:line="300"/>
+        <w:jc w:val="both"/>
+      </w:pPr>
+      <w:r>
+        <w:t xml:space="preserve">The doctor is therefore authorised only when the requested resources are consistent with the consent object and the consent remains active. The final Authorised Medical Records section presents the actual data modules available to the doctor. Because the subsystem separates the OBSERVATION, MEDICATION, CONDITION and PROCEDURE modules, it provides a direct visual demonstration of fine-grained EMR access control.</w:t>
+      </w:r>
+    </w:p>
+    <w:p>
+      <w:pPr>
+        <w:spacing w:after="160" w:line="300"/>
+        <w:jc w:val="both"/>
+      </w:pPr>
+      <w:r>
+        <w:t xml:space="preserve">Thus, the doctor subsystem corresponds to </w:t>
+      </w:r>
+      <w:r>
+        <w:rPr>
+          <w:b/>
+          <w:bCs/>
+        </w:rPr>
+        <w:t xml:space="preserve">Consent-State Validation, Scope Enforcement and Authorised Data Access</w:t>
+      </w:r>
+      <w:r>
+        <w:t xml:space="preserve">.</w:t>
+      </w:r>
+    </w:p>
+    <w:p>
+      <w:pPr>
+        <w:pStyle w:val="Heading1"/>
+        <w:spacing w:after="160" w:before="320"/>
+      </w:pPr>
+      <w:r>
+        <w:t xml:space="preserve">5. Negative Demonstration: Jurisdiction Violation</w:t>
+      </w:r>
+    </w:p>
+    <w:p>
+      <w:pPr>
+        <w:spacing w:after="160" w:line="300"/>
+        <w:jc w:val="both"/>
+      </w:pPr>
+      <w:r>
+        <w:t xml:space="preserve">The fourth part is the negative demonstration. This is important because a consent framework must be evaluated not only on whether it grants legitimate access, but also on whether it refuses illegitimate access. The same doctor therefore repeated the request for the evaluated consent while declaring the requester jurisdiction as SA, whereas the consent was issued for AU.</w:t>
       </w:r>
     </w:p>
     <w:p>
@@ -1731,9 +1685,9 @@
       <w:r>
         <w:drawing>
           <wp:inline distT="0" distB="0" distL="0" distR="0">
-            <wp:extent cx="5334000" cy="2952750"/>
+            <wp:extent cx="5334000" cy="4200525"/>
             <wp:effectExtent t="0" r="0" b="0" l="0"/>
-            <wp:docPr id="1" name="M5" descr="The doctor subsystem after revocation: VA reports FAIL and the consent is reported as 'not active. Current state: REVOKED'." title="Figure 15"/>
+            <wp:docPr id="1" name="g_doc_sa" descr="The doctor subsystem with requester jurisdiction SA: VL reports FAIL and consequently ALLOW = FAIL, although the consent state remains ACTIVE." title="Figure 15"/>
             <wp:cNvGraphicFramePr>
               <a:graphicFrameLocks xmlns:a="http://schemas.openxmlformats.org/drawingml/2006/main" noChangeAspect="1"/>
             </wp:cNvGraphicFramePr>
@@ -1756,7 +1710,7 @@
                   <pic:spPr bwMode="auto">
                     <a:xfrm>
                       <a:off x="0" y="0"/>
-                      <a:ext cx="5334000" cy="2952750"/>
+                      <a:ext cx="5334000" cy="4200525"/>
                     </a:xfrm>
                     <a:prstGeom prst="rect">
                       <a:avLst/>
@@ -1792,16 +1746,16 @@
           <w:sz w:val="19"/>
           <w:szCs w:val="19"/>
         </w:rPr>
-        <w:t xml:space="preserve">The doctor subsystem after revocation: VA reports FAIL and the consent is reported as 'not active. Current state: REVOKED'.</w:t>
-      </w:r>
-    </w:p>
-    <w:p>
-      <w:pPr>
-        <w:spacing w:after="160" w:line="300"/>
-        <w:jc w:val="both"/>
-      </w:pPr>
-      <w:r>
-        <w:t xml:space="preserve">As shown in the figure above, when the doctor subsequently enters the same Consent ID, the authorisation check VA fails and the subsystem reports that the consent is not active. Consequently, revocation is not merely a change of display: it removes the authorisation on which every later access decision depends.</w:t>
+        <w:t xml:space="preserve">The doctor subsystem with requester jurisdiction SA: VL reports FAIL and consequently ALLOW = FAIL, although the consent state remains ACTIVE.</w:t>
+      </w:r>
+    </w:p>
+    <w:p>
+      <w:pPr>
+        <w:spacing w:after="160" w:line="300"/>
+        <w:jc w:val="both"/>
+      </w:pPr>
+      <w:r>
+        <w:t xml:space="preserve">As shown in the figure above, the decision matrix immediately reports VL = FAIL and consequently ALLOW = FAIL, even though the consent itself is still ACTIVE, the guardian signatures remain valid and all other checks pass. This is important because it demonstrates that the access decision is taken over the complete consent tuple rather than over the consent state alone.</w:t>
       </w:r>
     </w:p>
     <w:p>
@@ -1813,9 +1767,9 @@
       <w:r>
         <w:drawing>
           <wp:inline distT="0" distB="0" distL="0" distR="0">
-            <wp:extent cx="5905500" cy="3886200"/>
+            <wp:extent cx="5334000" cy="2638425"/>
             <wp:effectExtent t="0" r="0" b="0" l="0"/>
-            <wp:docPr id="1" name="M6" descr="The revocation transaction on Sepolia Etherscan: status Success, block 11,771,307, decoded input 'Function: revoke(uint256 tokenId)' with tokenId = 1." title="Figure 16"/>
+            <wp:docPr id="1" name="g_denied" descr="The refused request: 'Security Exception: Access Denied by ZK-Policy. Failed checks: VL'." title="Figure 16"/>
             <wp:cNvGraphicFramePr>
               <a:graphicFrameLocks xmlns:a="http://schemas.openxmlformats.org/drawingml/2006/main" noChangeAspect="1"/>
             </wp:cNvGraphicFramePr>
@@ -1838,7 +1792,7 @@
                   <pic:spPr bwMode="auto">
                     <a:xfrm>
                       <a:off x="0" y="0"/>
-                      <a:ext cx="5905500" cy="3886200"/>
+                      <a:ext cx="5334000" cy="2638425"/>
                     </a:xfrm>
                     <a:prstGeom prst="rect">
                       <a:avLst/>
@@ -1874,34 +1828,32 @@
           <w:sz w:val="19"/>
           <w:szCs w:val="19"/>
         </w:rPr>
-        <w:t xml:space="preserve">The revocation transaction on Sepolia Etherscan: status Success, block 11,771,307, decoded input 'Function: revoke(uint256 tokenId)' with tokenId = 1.</w:t>
-      </w:r>
-    </w:p>
-    <w:p>
-      <w:pPr>
-        <w:spacing w:after="160" w:line="300"/>
-        <w:jc w:val="left"/>
-      </w:pPr>
-      <w:r>
-        <w:t xml:space="preserve">As shown in the figure above, the revocation is again a publicly verifiable transaction, whose decoded input names the contract function revoke and the token identifier. The transaction can be inspected at </w:t>
-      </w:r>
-      <w:hyperlink w:history="1" r:id="rIdhuu6sl_edugn-imhlgvuo">
-        <w:r>
-          <w:rPr>
-            <w:rStyle w:val="Hyperlink"/>
-          </w:rPr>
-          <w:t xml:space="preserve">Etherscan: revoke transaction</w:t>
-        </w:r>
-      </w:hyperlink>
-      <w:r>
-        <w:t xml:space="preserve">. The revocation subsystem therefore corresponds to </w:t>
+        <w:t xml:space="preserve">The refused request: 'Security Exception: Access Denied by ZK-Policy. Failed checks: VL'.</w:t>
+      </w:r>
+    </w:p>
+    <w:p>
+      <w:pPr>
+        <w:spacing w:after="160" w:line="300"/>
+        <w:jc w:val="both"/>
+      </w:pPr>
+      <w:r>
+        <w:t xml:space="preserve">As shown in the figure above, when the doctor submits the request, access is refused and the failed check is named explicitly. The corresponding audit-ledger entry records the result DENIED together with the complete decision matrix, so that the refusal is itself auditable. This is important because the jurisdiction check is included in the access decision rather than merely displayed.</w:t>
+      </w:r>
+    </w:p>
+    <w:p>
+      <w:pPr>
+        <w:spacing w:after="160" w:line="300"/>
+        <w:jc w:val="both"/>
+      </w:pPr>
+      <w:r>
+        <w:t xml:space="preserve">This demonstration corresponds to </w:t>
       </w:r>
       <w:r>
         <w:rPr>
           <w:b/>
           <w:bCs/>
         </w:rPr>
-        <w:t xml:space="preserve">Enforcement State Management and Consent Withdrawal</w:t>
+        <w:t xml:space="preserve">Jurisdictional Constraint Enforcement and Fail-Closed Access Control</w:t>
       </w:r>
       <w:r>
         <w:t xml:space="preserve">.</w:t>
@@ -1913,16 +1865,16 @@
         <w:spacing w:after="160" w:before="320"/>
       </w:pPr>
       <w:r>
-        <w:t xml:space="preserve">7. Blockchain Audit &amp; Consent Lifecycle for Auditor</w:t>
-      </w:r>
-    </w:p>
-    <w:p>
-      <w:pPr>
-        <w:spacing w:after="160" w:line="300"/>
-        <w:jc w:val="both"/>
-      </w:pPr>
-      <w:r>
-        <w:t xml:space="preserve">The fifth major module is the Blockchain Audit &amp; Consent Lifecycle module. This subsystem provides an independent view of the complete consent process and corresponds to the auditability and accountability component of the HALAH framework.</w:t>
+        <w:t xml:space="preserve">6. Consent Revocation</w:t>
+      </w:r>
+    </w:p>
+    <w:p>
+      <w:pPr>
+        <w:spacing w:after="160" w:line="300"/>
+        <w:jc w:val="both"/>
+      </w:pPr>
+      <w:r>
+        <w:t xml:space="preserve">The fifth module is the Consent Revocation module. This module operationalises the enforcement component of the consent object, which requires that a patient can withdraw consent and that the withdrawal takes effect for every subsequent request. In the patient's My Consents view, each consent is listed with its state, signature count and token. The patient then selects Revoke, after which the system updates the application state and submits a revoke transaction to the contract on Sepolia.</w:t>
       </w:r>
     </w:p>
     <w:p>
@@ -1934,9 +1886,9 @@
       <w:r>
         <w:drawing>
           <wp:inline distT="0" distB="0" distL="0" distR="0">
-            <wp:extent cx="5905500" cy="3457575"/>
+            <wp:extent cx="5143500" cy="3714750"/>
             <wp:effectExtent t="0" r="0" b="0" l="0"/>
-            <wp:docPr id="1" name="M7" descr="The auditor subsystem with the evaluated consent selected: aggregate indicators and the Detailed Audit Records, in which the on-chain events carry their transaction hashes and block numbers." title="Figure 17"/>
+            <wp:docPr id="1" name="g_revoking" descr="The patient subsystem during revocation: 'Revoking on Sepolia - waiting for block confirmation…'." title="Figure 17"/>
             <wp:cNvGraphicFramePr>
               <a:graphicFrameLocks xmlns:a="http://schemas.openxmlformats.org/drawingml/2006/main" noChangeAspect="1"/>
             </wp:cNvGraphicFramePr>
@@ -1959,7 +1911,7 @@
                   <pic:spPr bwMode="auto">
                     <a:xfrm>
                       <a:off x="0" y="0"/>
-                      <a:ext cx="5905500" cy="3457575"/>
+                      <a:ext cx="5143500" cy="3714750"/>
                     </a:xfrm>
                     <a:prstGeom prst="rect">
                       <a:avLst/>
@@ -1995,198 +1947,16 @@
           <w:sz w:val="19"/>
           <w:szCs w:val="19"/>
         </w:rPr>
-        <w:t xml:space="preserve">The auditor subsystem with the evaluated consent selected: aggregate indicators and the Detailed Audit Records, in which the on-chain events carry their transaction hashes and block numbers.</w:t>
-      </w:r>
-    </w:p>
-    <w:p>
-      <w:pPr>
-        <w:spacing w:after="160" w:line="300"/>
-        <w:jc w:val="both"/>
-      </w:pPr>
-      <w:r>
-        <w:t xml:space="preserve">As shown in the figure above, the system first provides aggregate indicators including:</w:t>
-      </w:r>
-    </w:p>
-    <w:p>
-      <w:pPr>
-        <w:spacing w:after="160" w:before="60"/>
-        <w:jc w:val="center"/>
-      </w:pPr>
-      <w:r>
-        <w:rPr>
-          <w:rFonts w:ascii="Cambria Math" w:cs="Cambria Math" w:eastAsia="Cambria Math" w:hAnsi="Cambria Math"/>
-          <w:i/>
-          <w:iCs/>
-          <w:sz w:val="22"/>
-          <w:szCs w:val="22"/>
-        </w:rPr>
-        <w:t xml:space="preserve">Total Events = 60    Consent Events = 8    Access Requests = 9    On-chain Anchors = 5</w:t>
-      </w:r>
-    </w:p>
-    <w:p>
-      <w:pPr>
-        <w:spacing w:after="160" w:line="300"/>
-        <w:jc w:val="both"/>
-      </w:pPr>
-      <w:r>
-        <w:t xml:space="preserve">These indicators give the auditor an immediate overview of the recorded system activity and of how many events are anchored on the public chain. The five anchors comprise the mint and revocation of the evaluated consent (token #1), the mint of the photographed lifecycle (token #2), and the mint and revocation of an earlier trial consent on the previous contract; the nine access requests include the granted, refused and reproduced requests of both lifecycles. More importantly, the Consent Lifecycle section reconstructs the sequence of events associated with a particular consent. The reconstructed records include CREATE_CONSENT performed by the patient, followed by SIGN_CONSENT performed by each guardian, followed by MINT_SBT and ONCHAIN_MINT performed by the smart contract; in the figure the detailed table is scrolled to the on-chain events, whose rows carry the transaction hashes. The subsequent system events STATE_CHECK demonstrate that the Consent Engine continuously evaluates the state of the authorisation. The doctor then generates DATA_ACCESS with the result GRANTED, later DATA_ACCESS with the result DENIED when the jurisdiction check fails, and finally the patient generates REVOKE_CONSENT followed by ONCHAIN_REVOKE performed by the smart contract.</w:t>
-      </w:r>
-    </w:p>
-    <w:p>
-      <w:pPr>
-        <w:spacing w:after="160" w:line="300"/>
-        <w:jc w:val="both"/>
-      </w:pPr>
-      <w:r>
-        <w:t xml:space="preserve">This produces an explicit chain of evidence as</w:t>
-      </w:r>
-    </w:p>
-    <w:p>
-      <w:pPr>
-        <w:spacing w:after="160" w:before="60"/>
-        <w:jc w:val="center"/>
-      </w:pPr>
-      <w:r>
-        <w:rPr>
-          <w:rFonts w:ascii="Cambria Math" w:cs="Cambria Math" w:eastAsia="Cambria Math" w:hAnsi="Cambria Math"/>
-          <w:i/>
-          <w:iCs/>
-          <w:sz w:val="22"/>
-          <w:szCs w:val="22"/>
-        </w:rPr>
-        <w:t xml:space="preserve">Patient → Guardian_A → Guardian_B → SmartContract(mint) → ConsentEngine → Doctor(GRANTED)</w:t>
-      </w:r>
-    </w:p>
-    <w:p>
-      <w:pPr>
-        <w:spacing w:after="160" w:before="60"/>
-        <w:jc w:val="center"/>
-      </w:pPr>
-      <w:r>
-        <w:rPr>
-          <w:rFonts w:ascii="Cambria Math" w:cs="Cambria Math" w:eastAsia="Cambria Math" w:hAnsi="Cambria Math"/>
-          <w:i/>
-          <w:iCs/>
-          <w:sz w:val="22"/>
-          <w:szCs w:val="22"/>
-        </w:rPr>
-        <w:t xml:space="preserve">→ Doctor(DENIED) → Patient(revoke) → SmartContract(revoke)</w:t>
-      </w:r>
-    </w:p>
-    <w:p>
-      <w:pPr>
-        <w:spacing w:after="160" w:line="300"/>
-        <w:jc w:val="both"/>
-      </w:pPr>
-      <w:r>
-        <w:t xml:space="preserve">The audit subsystem therefore allows an auditor to reconstruct not only who accessed the data, but also why that access was permitted or refused, because each access event can be associated with the preceding consent creation, guardian approvals, on-chain activation, state checks and the decision matrix that was in force at that moment.</w:t>
-      </w:r>
-    </w:p>
-    <w:p>
-      <w:pPr>
-        <w:spacing w:after="160" w:line="300"/>
-        <w:jc w:val="both"/>
-      </w:pPr>
-      <w:r>
-        <w:t xml:space="preserve">This corresponds to the proposed requirement for </w:t>
-      </w:r>
-      <w:r>
-        <w:rPr>
-          <w:b/>
-          <w:bCs/>
-        </w:rPr>
-        <w:t xml:space="preserve">traceability, accountability and non-repudiable consent evidence</w:t>
-      </w:r>
-      <w:r>
-        <w:t xml:space="preserve">.</w:t>
-      </w:r>
-    </w:p>
-    <w:p>
-      <w:pPr>
-        <w:pStyle w:val="Heading1"/>
-        <w:spacing w:after="160" w:before="320"/>
-      </w:pPr>
-      <w:r>
-        <w:t xml:space="preserve">8. Detailed Audit Records</w:t>
-      </w:r>
-    </w:p>
-    <w:p>
-      <w:pPr>
-        <w:spacing w:after="160" w:line="300"/>
-        <w:jc w:val="both"/>
-      </w:pPr>
-      <w:r>
-        <w:t xml:space="preserve">The Detailed Audit Records component provides a lower-level view of the events represented in the lifecycle subsystem.</w:t>
-      </w:r>
-    </w:p>
-    <w:p>
-      <w:pPr>
-        <w:spacing w:after="160" w:line="300"/>
-        <w:jc w:val="both"/>
-      </w:pPr>
-      <w:r>
-        <w:t xml:space="preserve">Where the lifecycle view is primarily designed to communicate the chronological sequence of the authorisation process, the detailed audit view provides the underlying event-level evidence. Each event can be associated with attributes such as actor, role, action, result, timestamp, consent context and, for on-chain events, the transaction hash and block number. As shown in the auditor figure above, the ONCHAIN_MINT and ONCHAIN_REVOKE rows carry the hashes of the two Sepolia transactions presented in Sections 3 and 6, so the ledger and the public chain describe the same events.</w:t>
-      </w:r>
-    </w:p>
-    <w:p>
-      <w:pPr>
-        <w:spacing w:after="160" w:line="300"/>
-        <w:jc w:val="both"/>
-      </w:pPr>
-      <w:r>
-        <w:t xml:space="preserve">This separation is useful because different stakeholders require different levels of information. A clinician may only need to know that a consent is active and valid, whereas an auditor may need to establish precisely when an approval occurred, which identity performed it, and what authorisation decision followed.</w:t>
-      </w:r>
-    </w:p>
-    <w:p>
-      <w:pPr>
-        <w:spacing w:after="160" w:line="300"/>
-        <w:jc w:val="both"/>
-      </w:pPr>
-      <w:r>
-        <w:t xml:space="preserve">The subsystem therefore implements the distinction between operational access information and forensic/audit information.</w:t>
-      </w:r>
-    </w:p>
-    <w:p>
-      <w:pPr>
-        <w:pStyle w:val="Heading1"/>
-        <w:spacing w:after="160" w:before="320"/>
-      </w:pPr>
-      <w:r>
-        <w:t xml:space="preserve">9. Complete Blockchain Audit Ledger and Independent Verification</w:t>
-      </w:r>
-    </w:p>
-    <w:p>
-      <w:pPr>
-        <w:spacing w:after="160" w:line="300"/>
-        <w:jc w:val="both"/>
-      </w:pPr>
-      <w:r>
-        <w:t xml:space="preserve">The Complete Blockchain Audit Ledger provides the most comprehensive representation of the recorded consent history. This component demonstrates that the audit mechanism is not limited to successful data-access events. Instead, the system records the broader lifecycle of the consent, including creation, signatures, state validation, smart-contract actions, refused requests and revocations. Consequently, the ledger provides the evidentiary foundation for evaluating several properties of the proposed framework:</w:t>
-      </w:r>
-    </w:p>
-    <w:p>
-      <w:pPr>
-        <w:spacing w:after="160" w:before="60"/>
-        <w:jc w:val="center"/>
-      </w:pPr>
-      <w:r>
-        <w:rPr>
-          <w:rFonts w:ascii="Cambria Math" w:cs="Cambria Math" w:eastAsia="Cambria Math" w:hAnsi="Cambria Math"/>
-          <w:i/>
-          <w:iCs/>
-          <w:sz w:val="22"/>
-          <w:szCs w:val="22"/>
-        </w:rPr>
-        <w:t xml:space="preserve">Accountability + Traceability + Integrity + Non-repudiation</w:t>
-      </w:r>
-    </w:p>
-    <w:p>
-      <w:pPr>
-        <w:spacing w:after="160" w:line="300"/>
-        <w:jc w:val="both"/>
-      </w:pPr>
-      <w:r>
-        <w:t xml:space="preserve">A ledger kept by the application could in principle contain fabricated entries. Consequently, the implementation provides an independent verification tool. The tool re-reads the ledger and, for every event that carries a transaction hash, fetches the corresponding receipt directly from Sepolia and checks that the transaction exists, succeeded, and was included in the recorded block; for every anchored consent it then reads the token back from the contract and compares the on-chain revocation state with the local state.</w:t>
+        <w:t xml:space="preserve">The patient subsystem during revocation: 'Revoking on Sepolia - waiting for block confirmation…'.</w:t>
+      </w:r>
+    </w:p>
+    <w:p>
+      <w:pPr>
+        <w:spacing w:after="160" w:line="300"/>
+        <w:jc w:val="both"/>
+      </w:pPr>
+      <w:r>
+        <w:t xml:space="preserve">As shown in the figure above, the withdrawal is submitted as a blockchain transaction and the subsystem waits for the block confirmation before reporting the final state.</w:t>
       </w:r>
     </w:p>
     <w:p>
@@ -2198,9 +1968,9 @@
       <w:r>
         <w:drawing>
           <wp:inline distT="0" distB="0" distL="0" distR="0">
-            <wp:extent cx="5334000" cy="2162175"/>
+            <wp:extent cx="5334000" cy="3533775"/>
             <wp:effectExtent t="0" r="0" b="0" l="0"/>
-            <wp:docPr id="1" name="M8" descr="The final verdict of the independent verification executed against Sepolia: the visible line confirms the unrevoked second token against the chain, and the tool reports RESULT: ALL CHECKS PASSED." title="Figure 18"/>
+            <wp:docPr id="1" name="g_revoked" descr="The patient subsystem after revocation: the evaluated consent f050c29a is REVOKED with token #1 (displayed as SBT-1). The other rows are earlier trial consents." title="Figure 18"/>
             <wp:cNvGraphicFramePr>
               <a:graphicFrameLocks xmlns:a="http://schemas.openxmlformats.org/drawingml/2006/main" noChangeAspect="1"/>
             </wp:cNvGraphicFramePr>
@@ -2223,7 +1993,7 @@
                   <pic:spPr bwMode="auto">
                     <a:xfrm>
                       <a:off x="0" y="0"/>
-                      <a:ext cx="5334000" cy="2162175"/>
+                      <a:ext cx="5334000" cy="3533775"/>
                     </a:xfrm>
                     <a:prstGeom prst="rect">
                       <a:avLst/>
@@ -2259,16 +2029,647 @@
           <w:sz w:val="19"/>
           <w:szCs w:val="19"/>
         </w:rPr>
-        <w:t xml:space="preserve">The final verdict of the independent verification executed against Sepolia: the visible line confirms the unrevoked second token against the chain, and the tool reports RESULT: ALL CHECKS PASSED.</w:t>
-      </w:r>
-    </w:p>
-    <w:p>
-      <w:pPr>
-        <w:spacing w:after="160" w:line="300"/>
-        <w:jc w:val="both"/>
-      </w:pPr>
-      <w:r>
-        <w:t xml:space="preserve">As shown in the figure above, the verification reports ALL CHECKS PASSED: every recorded transaction was found on Sepolia in its recorded block, and for both tokens the revocation state stored by the application matches the state stored by the contract (token #1 revoked, token #2 not revoked). For example, the demonstrated sequence shows that the doctor receives a GRANTED result only while the consent is in the ACTIVE state, and a DENIED or 'not active' result otherwise. This provides an implementation-level demonstration that access decisions are linked to the consent lifecycle rather than being independent application events, and that the recorded lifecycle is consistent with the public chain.</w:t>
+        <w:t xml:space="preserve">The patient subsystem after revocation: the evaluated consent f050c29a is REVOKED with token #1 (displayed as SBT-1). The other rows are earlier trial consents.</w:t>
+      </w:r>
+    </w:p>
+    <w:p>
+      <w:pPr>
+        <w:spacing w:after="160" w:line="300"/>
+        <w:jc w:val="both"/>
+      </w:pPr>
+      <w:r>
+        <w:t xml:space="preserve">As shown in the figure above, the revoked consent is displayed as REVOKED together with its on-chain token number. The revocation was confirmed on Sepolia in block 11,771,307, and from that point the contract itself reports the token as no longer valid, so any verifier that reads the chain observes the withdrawal.</w:t>
+      </w:r>
+    </w:p>
+    <w:p>
+      <w:pPr>
+        <w:keepNext/>
+        <w:spacing w:after="60" w:before="120"/>
+        <w:jc w:val="center"/>
+      </w:pPr>
+      <w:r>
+        <w:drawing>
+          <wp:inline distT="0" distB="0" distL="0" distR="0">
+            <wp:extent cx="5334000" cy="2952750"/>
+            <wp:effectExtent t="0" r="0" b="0" l="0"/>
+            <wp:docPr id="1" name="M5" descr="The doctor subsystem after revocation: VA reports FAIL and the consent is reported as 'not active. Current state: REVOKED'." title="Figure 19"/>
+            <wp:cNvGraphicFramePr>
+              <a:graphicFrameLocks xmlns:a="http://schemas.openxmlformats.org/drawingml/2006/main" noChangeAspect="1"/>
+            </wp:cNvGraphicFramePr>
+            <a:graphic xmlns:a="http://schemas.openxmlformats.org/drawingml/2006/main">
+              <a:graphicData uri="http://schemas.openxmlformats.org/drawingml/2006/picture">
+                <pic:pic xmlns:pic="http://schemas.openxmlformats.org/drawingml/2006/picture">
+                  <pic:nvPicPr>
+                    <pic:cNvPr id="0" name="" descr=""/>
+                    <pic:cNvPicPr>
+                      <a:picLocks noChangeAspect="1" noChangeArrowheads="1"/>
+                    </pic:cNvPicPr>
+                  </pic:nvPicPr>
+                  <pic:blipFill>
+                    <a:blip r:embed="rId26" cstate="none"/>
+                    <a:srcRect/>
+                    <a:stretch>
+                      <a:fillRect/>
+                    </a:stretch>
+                  </pic:blipFill>
+                  <pic:spPr bwMode="auto">
+                    <a:xfrm>
+                      <a:off x="0" y="0"/>
+                      <a:ext cx="5334000" cy="2952750"/>
+                    </a:xfrm>
+                    <a:prstGeom prst="rect">
+                      <a:avLst/>
+                    </a:prstGeom>
+                  </pic:spPr>
+                </pic:pic>
+              </a:graphicData>
+            </a:graphic>
+          </wp:inline>
+        </w:drawing>
+      </w:r>
+    </w:p>
+    <w:p>
+      <w:pPr>
+        <w:spacing w:after="180"/>
+        <w:jc w:val="center"/>
+      </w:pPr>
+      <w:r>
+        <w:rPr>
+          <w:b/>
+          <w:bCs/>
+          <w:i/>
+          <w:iCs/>
+          <w:sz w:val="19"/>
+          <w:szCs w:val="19"/>
+        </w:rPr>
+        <w:t xml:space="preserve">Figure 19. </w:t>
+      </w:r>
+      <w:r>
+        <w:rPr>
+          <w:i/>
+          <w:iCs/>
+          <w:sz w:val="19"/>
+          <w:szCs w:val="19"/>
+        </w:rPr>
+        <w:t xml:space="preserve">The doctor subsystem after revocation: VA reports FAIL and the consent is reported as 'not active. Current state: REVOKED'.</w:t>
+      </w:r>
+    </w:p>
+    <w:p>
+      <w:pPr>
+        <w:spacing w:after="160" w:line="300"/>
+        <w:jc w:val="both"/>
+      </w:pPr>
+      <w:r>
+        <w:t xml:space="preserve">As shown in the figure above, when the doctor subsequently enters the same Consent ID, the authorisation check VA fails and the subsystem reports that the consent is not active. Consequently, revocation is not merely a change of display: it removes the authorisation on which every later access decision depends.</w:t>
+      </w:r>
+    </w:p>
+    <w:p>
+      <w:pPr>
+        <w:keepNext/>
+        <w:spacing w:after="60" w:before="120"/>
+        <w:jc w:val="center"/>
+      </w:pPr>
+      <w:r>
+        <w:drawing>
+          <wp:inline distT="0" distB="0" distL="0" distR="0">
+            <wp:extent cx="5905500" cy="3886200"/>
+            <wp:effectExtent t="0" r="0" b="0" l="0"/>
+            <wp:docPr id="1" name="M6" descr="The revocation transaction on Sepolia Etherscan: status Success, block 11,771,307, decoded input 'Function: revoke(uint256 tokenId)' with tokenId = 1." title="Figure 20"/>
+            <wp:cNvGraphicFramePr>
+              <a:graphicFrameLocks xmlns:a="http://schemas.openxmlformats.org/drawingml/2006/main" noChangeAspect="1"/>
+            </wp:cNvGraphicFramePr>
+            <a:graphic xmlns:a="http://schemas.openxmlformats.org/drawingml/2006/main">
+              <a:graphicData uri="http://schemas.openxmlformats.org/drawingml/2006/picture">
+                <pic:pic xmlns:pic="http://schemas.openxmlformats.org/drawingml/2006/picture">
+                  <pic:nvPicPr>
+                    <pic:cNvPr id="0" name="" descr=""/>
+                    <pic:cNvPicPr>
+                      <a:picLocks noChangeAspect="1" noChangeArrowheads="1"/>
+                    </pic:cNvPicPr>
+                  </pic:nvPicPr>
+                  <pic:blipFill>
+                    <a:blip r:embed="rId27" cstate="none"/>
+                    <a:srcRect/>
+                    <a:stretch>
+                      <a:fillRect/>
+                    </a:stretch>
+                  </pic:blipFill>
+                  <pic:spPr bwMode="auto">
+                    <a:xfrm>
+                      <a:off x="0" y="0"/>
+                      <a:ext cx="5905500" cy="3886200"/>
+                    </a:xfrm>
+                    <a:prstGeom prst="rect">
+                      <a:avLst/>
+                    </a:prstGeom>
+                  </pic:spPr>
+                </pic:pic>
+              </a:graphicData>
+            </a:graphic>
+          </wp:inline>
+        </w:drawing>
+      </w:r>
+    </w:p>
+    <w:p>
+      <w:pPr>
+        <w:spacing w:after="180"/>
+        <w:jc w:val="center"/>
+      </w:pPr>
+      <w:r>
+        <w:rPr>
+          <w:b/>
+          <w:bCs/>
+          <w:i/>
+          <w:iCs/>
+          <w:sz w:val="19"/>
+          <w:szCs w:val="19"/>
+        </w:rPr>
+        <w:t xml:space="preserve">Figure 20. </w:t>
+      </w:r>
+      <w:r>
+        <w:rPr>
+          <w:i/>
+          <w:iCs/>
+          <w:sz w:val="19"/>
+          <w:szCs w:val="19"/>
+        </w:rPr>
+        <w:t xml:space="preserve">The revocation transaction on Sepolia Etherscan: status Success, block 11,771,307, decoded input 'Function: revoke(uint256 tokenId)' with tokenId = 1.</w:t>
+      </w:r>
+    </w:p>
+    <w:p>
+      <w:pPr>
+        <w:spacing w:after="160" w:line="300"/>
+        <w:jc w:val="left"/>
+      </w:pPr>
+      <w:r>
+        <w:t xml:space="preserve">As shown in the figure above, the revocation is again a publicly verifiable transaction, whose decoded input names the contract function revoke and the token identifier. The transaction can be inspected at </w:t>
+      </w:r>
+      <w:hyperlink w:history="1" r:id="rId7ibt9rrb4k0mgsykn7wje">
+        <w:r>
+          <w:rPr>
+            <w:rStyle w:val="Hyperlink"/>
+          </w:rPr>
+          <w:t xml:space="preserve">Etherscan: revoke transaction</w:t>
+        </w:r>
+      </w:hyperlink>
+      <w:r>
+        <w:t xml:space="preserve">. The revocation subsystem therefore corresponds to </w:t>
+      </w:r>
+      <w:r>
+        <w:rPr>
+          <w:b/>
+          <w:bCs/>
+        </w:rPr>
+        <w:t xml:space="preserve">Enforcement State Management and Consent Withdrawal</w:t>
+      </w:r>
+      <w:r>
+        <w:t xml:space="preserve">.</w:t>
+      </w:r>
+    </w:p>
+    <w:p>
+      <w:pPr>
+        <w:pStyle w:val="Heading1"/>
+        <w:spacing w:after="160" w:before="320"/>
+      </w:pPr>
+      <w:r>
+        <w:t xml:space="preserve">7. Blockchain Audit &amp; Consent Lifecycle for Auditor</w:t>
+      </w:r>
+    </w:p>
+    <w:p>
+      <w:pPr>
+        <w:spacing w:after="160" w:line="300"/>
+        <w:jc w:val="both"/>
+      </w:pPr>
+      <w:r>
+        <w:t xml:space="preserve">The sixth major module is the Blockchain Audit &amp; Consent Lifecycle module. This subsystem provides an independent view of the complete consent process and corresponds to the auditability and accountability component of the HALAH framework.</w:t>
+      </w:r>
+    </w:p>
+    <w:p>
+      <w:pPr>
+        <w:keepNext/>
+        <w:spacing w:after="60" w:before="120"/>
+        <w:jc w:val="center"/>
+      </w:pPr>
+      <w:r>
+        <w:drawing>
+          <wp:inline distT="0" distB="0" distL="0" distR="0">
+            <wp:extent cx="5524500" cy="4019550"/>
+            <wp:effectExtent t="0" r="0" b="0" l="0"/>
+            <wp:docPr id="1" name="n_lifecycle" descr="The Consent Lifecycle reconstruction for the evaluated consent: the guardian signatures, MINT_SBT and ONCHAIN_MINT on the left, and the STATE_CHECK, DENIED, REVOKE_CONSENT and ONCHAIN_REVOKE events on the right." title="Figure 21"/>
+            <wp:cNvGraphicFramePr>
+              <a:graphicFrameLocks xmlns:a="http://schemas.openxmlformats.org/drawingml/2006/main" noChangeAspect="1"/>
+            </wp:cNvGraphicFramePr>
+            <a:graphic xmlns:a="http://schemas.openxmlformats.org/drawingml/2006/main">
+              <a:graphicData uri="http://schemas.openxmlformats.org/drawingml/2006/picture">
+                <pic:pic xmlns:pic="http://schemas.openxmlformats.org/drawingml/2006/picture">
+                  <pic:nvPicPr>
+                    <pic:cNvPr id="0" name="" descr=""/>
+                    <pic:cNvPicPr>
+                      <a:picLocks noChangeAspect="1" noChangeArrowheads="1"/>
+                    </pic:cNvPicPr>
+                  </pic:nvPicPr>
+                  <pic:blipFill>
+                    <a:blip r:embed="rId28" cstate="none"/>
+                    <a:srcRect/>
+                    <a:stretch>
+                      <a:fillRect/>
+                    </a:stretch>
+                  </pic:blipFill>
+                  <pic:spPr bwMode="auto">
+                    <a:xfrm>
+                      <a:off x="0" y="0"/>
+                      <a:ext cx="5524500" cy="4019550"/>
+                    </a:xfrm>
+                    <a:prstGeom prst="rect">
+                      <a:avLst/>
+                    </a:prstGeom>
+                  </pic:spPr>
+                </pic:pic>
+              </a:graphicData>
+            </a:graphic>
+          </wp:inline>
+        </w:drawing>
+      </w:r>
+    </w:p>
+    <w:p>
+      <w:pPr>
+        <w:spacing w:after="180"/>
+        <w:jc w:val="center"/>
+      </w:pPr>
+      <w:r>
+        <w:rPr>
+          <w:b/>
+          <w:bCs/>
+          <w:i/>
+          <w:iCs/>
+          <w:sz w:val="19"/>
+          <w:szCs w:val="19"/>
+        </w:rPr>
+        <w:t xml:space="preserve">Figure 21. </w:t>
+      </w:r>
+      <w:r>
+        <w:rPr>
+          <w:i/>
+          <w:iCs/>
+          <w:sz w:val="19"/>
+          <w:szCs w:val="19"/>
+        </w:rPr>
+        <w:t xml:space="preserve">The Consent Lifecycle reconstruction for the evaluated consent: the guardian signatures, MINT_SBT and ONCHAIN_MINT on the left, and the STATE_CHECK, DENIED, REVOKE_CONSENT and ONCHAIN_REVOKE events on the right.</w:t>
+      </w:r>
+    </w:p>
+    <w:p>
+      <w:pPr>
+        <w:spacing w:after="160" w:line="300"/>
+        <w:jc w:val="both"/>
+      </w:pPr>
+      <w:r>
+        <w:t xml:space="preserve">As shown in the figure above, the lifecycle view presents each event as a card with its timestamp, actor, role, action and result, so the chronological sequence of the authorisation process can be read directly.</w:t>
+      </w:r>
+    </w:p>
+    <w:p>
+      <w:pPr>
+        <w:keepNext/>
+        <w:spacing w:after="60" w:before="120"/>
+        <w:jc w:val="center"/>
+      </w:pPr>
+      <w:r>
+        <w:drawing>
+          <wp:inline distT="0" distB="0" distL="0" distR="0">
+            <wp:extent cx="5905500" cy="3457575"/>
+            <wp:effectExtent t="0" r="0" b="0" l="0"/>
+            <wp:docPr id="1" name="M7" descr="The auditor subsystem with the evaluated consent selected: aggregate indicators and the Detailed Audit Records, in which the on-chain events carry their transaction hashes and block numbers." title="Figure 22"/>
+            <wp:cNvGraphicFramePr>
+              <a:graphicFrameLocks xmlns:a="http://schemas.openxmlformats.org/drawingml/2006/main" noChangeAspect="1"/>
+            </wp:cNvGraphicFramePr>
+            <a:graphic xmlns:a="http://schemas.openxmlformats.org/drawingml/2006/main">
+              <a:graphicData uri="http://schemas.openxmlformats.org/drawingml/2006/picture">
+                <pic:pic xmlns:pic="http://schemas.openxmlformats.org/drawingml/2006/picture">
+                  <pic:nvPicPr>
+                    <pic:cNvPr id="0" name="" descr=""/>
+                    <pic:cNvPicPr>
+                      <a:picLocks noChangeAspect="1" noChangeArrowheads="1"/>
+                    </pic:cNvPicPr>
+                  </pic:nvPicPr>
+                  <pic:blipFill>
+                    <a:blip r:embed="rId29" cstate="none"/>
+                    <a:srcRect/>
+                    <a:stretch>
+                      <a:fillRect/>
+                    </a:stretch>
+                  </pic:blipFill>
+                  <pic:spPr bwMode="auto">
+                    <a:xfrm>
+                      <a:off x="0" y="0"/>
+                      <a:ext cx="5905500" cy="3457575"/>
+                    </a:xfrm>
+                    <a:prstGeom prst="rect">
+                      <a:avLst/>
+                    </a:prstGeom>
+                  </pic:spPr>
+                </pic:pic>
+              </a:graphicData>
+            </a:graphic>
+          </wp:inline>
+        </w:drawing>
+      </w:r>
+    </w:p>
+    <w:p>
+      <w:pPr>
+        <w:spacing w:after="180"/>
+        <w:jc w:val="center"/>
+      </w:pPr>
+      <w:r>
+        <w:rPr>
+          <w:b/>
+          <w:bCs/>
+          <w:i/>
+          <w:iCs/>
+          <w:sz w:val="19"/>
+          <w:szCs w:val="19"/>
+        </w:rPr>
+        <w:t xml:space="preserve">Figure 22. </w:t>
+      </w:r>
+      <w:r>
+        <w:rPr>
+          <w:i/>
+          <w:iCs/>
+          <w:sz w:val="19"/>
+          <w:szCs w:val="19"/>
+        </w:rPr>
+        <w:t xml:space="preserve">The auditor subsystem with the evaluated consent selected: aggregate indicators and the Detailed Audit Records, in which the on-chain events carry their transaction hashes and block numbers.</w:t>
+      </w:r>
+    </w:p>
+    <w:p>
+      <w:pPr>
+        <w:spacing w:after="160" w:line="300"/>
+        <w:jc w:val="both"/>
+      </w:pPr>
+      <w:r>
+        <w:t xml:space="preserve">As shown in the figure above, the system first provides aggregate indicators including:</w:t>
+      </w:r>
+    </w:p>
+    <w:p>
+      <w:pPr>
+        <w:spacing w:after="160" w:before="60"/>
+        <w:jc w:val="center"/>
+      </w:pPr>
+      <w:r>
+        <w:rPr>
+          <w:rFonts w:ascii="Cambria Math" w:cs="Cambria Math" w:eastAsia="Cambria Math" w:hAnsi="Cambria Math"/>
+          <w:i/>
+          <w:iCs/>
+          <w:sz w:val="22"/>
+          <w:szCs w:val="22"/>
+        </w:rPr>
+        <w:t xml:space="preserve">Total Events = 60    Consent Events = 8    Access Requests = 9    On-chain Anchors = 5</w:t>
+      </w:r>
+    </w:p>
+    <w:p>
+      <w:pPr>
+        <w:spacing w:after="160" w:line="300"/>
+        <w:jc w:val="both"/>
+      </w:pPr>
+      <w:r>
+        <w:t xml:space="preserve">These indicators give the auditor an immediate overview of the recorded system activity and of how many events are anchored on the public chain. The five anchors comprise the mint and revocation of the evaluated consent (token #1), the mint of the photographed lifecycle (token #2), and the mint and revocation of an earlier trial consent on the previous contract; the nine access requests comprise the granted, refused and reproduced requests of the two lifecycles together with three granted requests recorded for the earlier trial consents. More importantly, the Consent Lifecycle section reconstructs the sequence of events associated with a particular consent. The reconstructed records include CREATE_CONSENT performed by the patient, followed by SIGN_CONSENT performed by each guardian, followed by MINT_SBT and ONCHAIN_MINT performed by the smart contract; in the figure the detailed table is scrolled to the on-chain events, whose rows carry the transaction hashes. The subsequent STATE_CHECK system events demonstrate that the Consent Engine continuously evaluates the state of the authorisation. The doctor then generates DATA_ACCESS with the result GRANTED, later DATA_ACCESS with the result DENIED when the jurisdiction check fails, and finally the patient generates REVOKE_CONSENT followed by ONCHAIN_REVOKE performed by the smart contract.</w:t>
+      </w:r>
+    </w:p>
+    <w:p>
+      <w:pPr>
+        <w:spacing w:after="160" w:line="300"/>
+        <w:jc w:val="both"/>
+      </w:pPr>
+      <w:r>
+        <w:t xml:space="preserve">This produces an explicit chain of evidence as</w:t>
+      </w:r>
+    </w:p>
+    <w:p>
+      <w:pPr>
+        <w:spacing w:after="160" w:before="60"/>
+        <w:jc w:val="center"/>
+      </w:pPr>
+      <w:r>
+        <w:rPr>
+          <w:rFonts w:ascii="Cambria Math" w:cs="Cambria Math" w:eastAsia="Cambria Math" w:hAnsi="Cambria Math"/>
+          <w:i/>
+          <w:iCs/>
+          <w:sz w:val="22"/>
+          <w:szCs w:val="22"/>
+        </w:rPr>
+        <w:t xml:space="preserve">Patient → Guardian_A → Guardian_B → SmartContract(mint) → ConsentEngine → Doctor(GRANTED)</w:t>
+      </w:r>
+    </w:p>
+    <w:p>
+      <w:pPr>
+        <w:spacing w:after="160" w:before="60"/>
+        <w:jc w:val="center"/>
+      </w:pPr>
+      <w:r>
+        <w:rPr>
+          <w:rFonts w:ascii="Cambria Math" w:cs="Cambria Math" w:eastAsia="Cambria Math" w:hAnsi="Cambria Math"/>
+          <w:i/>
+          <w:iCs/>
+          <w:sz w:val="22"/>
+          <w:szCs w:val="22"/>
+        </w:rPr>
+        <w:t xml:space="preserve">→ Doctor(DENIED) → Patient(revoke) → SmartContract(revoke)</w:t>
+      </w:r>
+    </w:p>
+    <w:p>
+      <w:pPr>
+        <w:spacing w:after="160" w:line="300"/>
+        <w:jc w:val="both"/>
+      </w:pPr>
+      <w:r>
+        <w:t xml:space="preserve">The audit subsystem therefore allows an auditor to reconstruct not only who accessed the data, but also why that access was permitted or refused, because each access event can be associated with the preceding consent creation, guardian approvals, on-chain activation, state checks and the decision matrix that was in force at that moment.</w:t>
+      </w:r>
+    </w:p>
+    <w:p>
+      <w:pPr>
+        <w:spacing w:after="160" w:line="300"/>
+        <w:jc w:val="both"/>
+      </w:pPr>
+      <w:r>
+        <w:t xml:space="preserve">This corresponds to the proposed requirement for </w:t>
+      </w:r>
+      <w:r>
+        <w:rPr>
+          <w:b/>
+          <w:bCs/>
+        </w:rPr>
+        <w:t xml:space="preserve">traceability, accountability and non-repudiable consent evidence</w:t>
+      </w:r>
+      <w:r>
+        <w:t xml:space="preserve">.</w:t>
+      </w:r>
+    </w:p>
+    <w:p>
+      <w:pPr>
+        <w:pStyle w:val="Heading1"/>
+        <w:spacing w:after="160" w:before="320"/>
+      </w:pPr>
+      <w:r>
+        <w:t xml:space="preserve">8. Detailed Audit Records</w:t>
+      </w:r>
+    </w:p>
+    <w:p>
+      <w:pPr>
+        <w:spacing w:after="160" w:line="300"/>
+        <w:jc w:val="both"/>
+      </w:pPr>
+      <w:r>
+        <w:t xml:space="preserve">The Detailed Audit Records component provides a lower-level view of the events represented in the lifecycle subsystem.</w:t>
+      </w:r>
+    </w:p>
+    <w:p>
+      <w:pPr>
+        <w:spacing w:after="160" w:line="300"/>
+        <w:jc w:val="both"/>
+      </w:pPr>
+      <w:r>
+        <w:t xml:space="preserve">Where the lifecycle view is primarily designed to communicate the chronological sequence of the authorisation process, the detailed audit view provides the underlying event-level evidence. Each event can be associated with attributes such as actor, role, action, result, timestamp, consent context and, for on-chain events, the transaction hash and block number. As shown in the auditor figure above, the ONCHAIN_MINT and ONCHAIN_REVOKE rows carry the hashes of the two Sepolia transactions presented in Sections 3 and 6, so the ledger and the public chain describe the same events.</w:t>
+      </w:r>
+    </w:p>
+    <w:p>
+      <w:pPr>
+        <w:spacing w:after="160" w:line="300"/>
+        <w:jc w:val="both"/>
+      </w:pPr>
+      <w:r>
+        <w:t xml:space="preserve">This separation is useful because different stakeholders require different levels of information. A clinician may only need to know that a consent is active and valid, whereas an auditor may need to establish precisely when an approval occurred, which identity performed it, and what authorisation decision followed.</w:t>
+      </w:r>
+    </w:p>
+    <w:p>
+      <w:pPr>
+        <w:spacing w:after="160" w:line="300"/>
+        <w:jc w:val="both"/>
+      </w:pPr>
+      <w:r>
+        <w:t xml:space="preserve">The subsystem therefore implements the distinction between operational access information and forensic/audit information.</w:t>
+      </w:r>
+    </w:p>
+    <w:p>
+      <w:pPr>
+        <w:pStyle w:val="Heading1"/>
+        <w:spacing w:after="160" w:before="320"/>
+      </w:pPr>
+      <w:r>
+        <w:t xml:space="preserve">9. Complete Blockchain Audit Ledger and Independent Verification</w:t>
+      </w:r>
+    </w:p>
+    <w:p>
+      <w:pPr>
+        <w:spacing w:after="160" w:line="300"/>
+        <w:jc w:val="both"/>
+      </w:pPr>
+      <w:r>
+        <w:t xml:space="preserve">The Complete Blockchain Audit Ledger provides the most comprehensive representation of the recorded consent history. This component demonstrates that the audit mechanism is not limited to successful data-access events. Instead, the system records the broader lifecycle of the consent, including creation, signatures, state validation, smart-contract actions, refused requests and revocations. Consequently, the ledger provides the evidentiary foundation for evaluating several properties of the proposed framework:</w:t>
+      </w:r>
+    </w:p>
+    <w:p>
+      <w:pPr>
+        <w:spacing w:after="160" w:before="60"/>
+        <w:jc w:val="center"/>
+      </w:pPr>
+      <w:r>
+        <w:rPr>
+          <w:rFonts w:ascii="Cambria Math" w:cs="Cambria Math" w:eastAsia="Cambria Math" w:hAnsi="Cambria Math"/>
+          <w:i/>
+          <w:iCs/>
+          <w:sz w:val="22"/>
+          <w:szCs w:val="22"/>
+        </w:rPr>
+        <w:t xml:space="preserve">Accountability + Traceability + Integrity + Non-repudiation</w:t>
+      </w:r>
+    </w:p>
+    <w:p>
+      <w:pPr>
+        <w:spacing w:after="160" w:line="300"/>
+        <w:jc w:val="both"/>
+      </w:pPr>
+      <w:r>
+        <w:t xml:space="preserve">A ledger kept by the application could in principle contain fabricated entries. Consequently, the implementation provides an independent verification tool. The tool re-reads the ledger and, for every event that carries a transaction hash, fetches the corresponding receipt directly from Sepolia and checks that the transaction exists, succeeded, and was included in the recorded block; for every consent anchored on the current contract it then reads the token back and compares the on-chain revocation state with the local state; the earlier trial token resides on the superseded contract and is reported and skipped.</w:t>
+      </w:r>
+    </w:p>
+    <w:p>
+      <w:pPr>
+        <w:keepNext/>
+        <w:spacing w:after="60" w:before="120"/>
+        <w:jc w:val="center"/>
+      </w:pPr>
+      <w:r>
+        <w:drawing>
+          <wp:inline distT="0" distB="0" distL="0" distR="0">
+            <wp:extent cx="5334000" cy="1057275"/>
+            <wp:effectExtent t="0" r="0" b="0" l="0"/>
+            <wp:docPr id="1" name="M8" descr="The final verdict of the independent verification, re-executed after the second lifecycle: RESULT: ALL CHECKS PASSED." title="Figure 23"/>
+            <wp:cNvGraphicFramePr>
+              <a:graphicFrameLocks xmlns:a="http://schemas.openxmlformats.org/drawingml/2006/main" noChangeAspect="1"/>
+            </wp:cNvGraphicFramePr>
+            <a:graphic xmlns:a="http://schemas.openxmlformats.org/drawingml/2006/main">
+              <a:graphicData uri="http://schemas.openxmlformats.org/drawingml/2006/picture">
+                <pic:pic xmlns:pic="http://schemas.openxmlformats.org/drawingml/2006/picture">
+                  <pic:nvPicPr>
+                    <pic:cNvPr id="0" name="" descr=""/>
+                    <pic:cNvPicPr>
+                      <a:picLocks noChangeAspect="1" noChangeArrowheads="1"/>
+                    </pic:cNvPicPr>
+                  </pic:nvPicPr>
+                  <pic:blipFill>
+                    <a:blip r:embed="rId30" cstate="none"/>
+                    <a:srcRect/>
+                    <a:stretch>
+                      <a:fillRect/>
+                    </a:stretch>
+                  </pic:blipFill>
+                  <pic:spPr bwMode="auto">
+                    <a:xfrm>
+                      <a:off x="0" y="0"/>
+                      <a:ext cx="5334000" cy="1057275"/>
+                    </a:xfrm>
+                    <a:prstGeom prst="rect">
+                      <a:avLst/>
+                    </a:prstGeom>
+                  </pic:spPr>
+                </pic:pic>
+              </a:graphicData>
+            </a:graphic>
+          </wp:inline>
+        </w:drawing>
+      </w:r>
+    </w:p>
+    <w:p>
+      <w:pPr>
+        <w:spacing w:after="180"/>
+        <w:jc w:val="center"/>
+      </w:pPr>
+      <w:r>
+        <w:rPr>
+          <w:b/>
+          <w:bCs/>
+          <w:i/>
+          <w:iCs/>
+          <w:sz w:val="19"/>
+          <w:szCs w:val="19"/>
+        </w:rPr>
+        <w:t xml:space="preserve">Figure 23. </w:t>
+      </w:r>
+      <w:r>
+        <w:rPr>
+          <w:i/>
+          <w:iCs/>
+          <w:sz w:val="19"/>
+          <w:szCs w:val="19"/>
+        </w:rPr>
+        <w:t xml:space="preserve">The final verdict of the independent verification, re-executed after the second lifecycle: RESULT: ALL CHECKS PASSED.</w:t>
+      </w:r>
+    </w:p>
+    <w:p>
+      <w:pPr>
+        <w:spacing w:after="160" w:line="300"/>
+        <w:jc w:val="both"/>
+      </w:pPr>
+      <w:r>
+        <w:t xml:space="preserve">As shown in the figure above, the verification was re-executed after the second lifecycle and reports ALL CHECKS PASSED: every recorded transaction was found on Sepolia in its recorded block, and for both tokens on the current contract the revocation state stored by the application matches the state stored by the contract (token #1 revoked, token #2 not revoked). Accordingly, the demonstrated sequence shows that the doctor receives a GRANTED result only while the consent is in the ACTIVE state, and a DENIED or 'not active' result otherwise. This provides an implementation-level demonstration that access decisions are linked to the consent lifecycle rather than being independent application events, and that the recorded lifecycle is consistent with the public chain.</w:t>
       </w:r>
     </w:p>
     <w:p>
@@ -3570,7 +3971,7 @@
       <w:r>
         <w:t xml:space="preserve">Contract: </w:t>
       </w:r>
-      <w:hyperlink w:history="1" r:id="rId-uocax0c0cpm4xunjkc7w">
+      <w:hyperlink w:history="1" r:id="rIdozbjzqpto1xoui6ogrkna">
         <w:r>
           <w:rPr>
             <w:rStyle w:val="Hyperlink"/>
@@ -3587,7 +3988,7 @@
       <w:r>
         <w:t xml:space="preserve">Consent activation (mint of token #1): </w:t>
       </w:r>
-      <w:hyperlink w:history="1" r:id="rIdmhbit4ht2fzcgeil72ty1">
+      <w:hyperlink w:history="1" r:id="rIdiq6lh2lxbxik3meylssi3">
         <w:r>
           <w:rPr>
             <w:rStyle w:val="Hyperlink"/>
@@ -3602,9 +4003,26 @@
         <w:jc w:val="left"/>
       </w:pPr>
       <w:r>
+        <w:t xml:space="preserve">Consent activation (mint of token #2, photographed lifecycle): </w:t>
+      </w:r>
+      <w:hyperlink w:history="1" r:id="rIdgxxejjvhb9ju59bu7h6v6">
+        <w:r>
+          <w:rPr>
+            <w:rStyle w:val="Hyperlink"/>
+          </w:rPr>
+          <w:t xml:space="preserve">https://sepolia.etherscan.io/tx/0x25ef5e2f0046735dcb01ff7b68875b760bdf88ad0fa3fedc9bfb910769d4c210</w:t>
+        </w:r>
+      </w:hyperlink>
+    </w:p>
+    <w:p>
+      <w:pPr>
+        <w:spacing w:after="160" w:line="300"/>
+        <w:jc w:val="left"/>
+      </w:pPr>
+      <w:r>
         <w:t xml:space="preserve">Consent revocation (token #1): </w:t>
       </w:r>
-      <w:hyperlink w:history="1" r:id="rIdgqscxeps4hzaxc5vm8rvo">
+      <w:hyperlink w:history="1" r:id="rIdxxhmbszcoycgaoadhzsgs">
         <w:r>
           <w:rPr>
             <w:rStyle w:val="Hyperlink"/>
@@ -3641,18 +4059,7 @@
         <w:t xml:space="preserve">evidence/sepolia_deploy_v3_2026-09-24.txt</w:t>
       </w:r>
       <w:r>
-        <w:t xml:space="preserve"> (repository branch </w:t>
-      </w:r>
-      <w:r>
-        <w:rPr>
-          <w:rFonts w:ascii="Consolas" w:cs="Consolas" w:eastAsia="Consolas" w:hAnsi="Consolas"/>
-          <w:sz w:val="20"/>
-          <w:szCs w:val="20"/>
-        </w:rPr>
-        <w:t xml:space="preserve">claude/pensive-tesla-u9uk4j</w:t>
-      </w:r>
-      <w:r>
-        <w:t xml:space="preserve">).</w:t>
+        <w:t xml:space="preserve"> available in the project repository.</w:t>
       </w:r>
     </w:p>
     <w:sectPr>

</xml_diff>